<commit_message>
docs: reescribe el informe en una redaccion mas natural
Se rehace la prosa de las seis secciones sin tocar cifras, tablas ni
figuras: se abandona el patron de entradilla en negrita en cada parrafo
(30 -> 6, y las seis que quedan son los rotulos del informe integrado),
se baja el uso de negrita de 125 a 15 tramos, se eliminan los 18 guiones
largos del cuerpo y se acorta la frase media de 43 a 33 palabras.

El documento se mantiene en diez paginas.

Co-authored-by: María Fassler Neumann <m.fasslerneumann@uandresbello.edu>
</commit_message>
<xml_diff>
--- a/S3/informe/Sumativa3_Informe_Maria_Fassler_Sebastian_Antunez.docx
+++ b/S3/informe/Sumativa3_Informe_Maria_Fassler_Sebastian_Antunez.docx
@@ -12,7 +12,7 @@
           <w:noProof/>
         </w:rPr>
         <w:drawing>
-          <wp:inline distT="0" distB="0" distL="0" distR="0" wp14:anchorId="35F01F32" wp14:editId="57E98EDD">
+          <wp:inline distT="0" distB="0" distL="0" distR="0" wp14:anchorId="3B26D578" wp14:editId="5BD82978">
             <wp:extent cx="1238250" cy="1028700"/>
             <wp:effectExtent l="0" t="0" r="0" b="0"/>
             <wp:docPr id="1" name="Logo UNAB" descr="Logo institucional" title="Universidad Andrés Bello"/>
@@ -142,7 +142,7 @@
           <w:left w:w="10" w:type="dxa"/>
           <w:right w:w="10" w:type="dxa"/>
         </w:tblCellMar>
-        <w:tblLook w:val="04A0" w:firstRow="1" w:lastRow="0" w:firstColumn="1" w:lastColumn="0" w:noHBand="0" w:noVBand="1"/>
+        <w:tblLook w:val="0000" w:firstRow="0" w:lastRow="0" w:firstColumn="0" w:lastColumn="0" w:noHBand="0" w:noVBand="0"/>
       </w:tblPr>
       <w:tblGrid>
         <w:gridCol w:w="2600"/>
@@ -559,7 +559,7 @@
           <w:left w:w="10" w:type="dxa"/>
           <w:right w:w="10" w:type="dxa"/>
         </w:tblCellMar>
-        <w:tblLook w:val="04A0" w:firstRow="1" w:lastRow="0" w:firstColumn="1" w:lastColumn="0" w:noHBand="0" w:noVBand="1"/>
+        <w:tblLook w:val="0000" w:firstRow="0" w:lastRow="0" w:firstColumn="0" w:lastColumn="0" w:noHBand="0" w:noVBand="0"/>
       </w:tblPr>
       <w:tblGrid>
         <w:gridCol w:w="2400"/>
@@ -998,7 +998,7 @@
           <w:left w:w="10" w:type="dxa"/>
           <w:right w:w="10" w:type="dxa"/>
         </w:tblCellMar>
-        <w:tblLook w:val="04A0" w:firstRow="1" w:lastRow="0" w:firstColumn="1" w:lastColumn="0" w:noHBand="0" w:noVBand="1"/>
+        <w:tblLook w:val="0000" w:firstRow="0" w:lastRow="0" w:firstColumn="0" w:lastColumn="0" w:noHBand="0" w:noVBand="0"/>
       </w:tblPr>
       <w:tblGrid>
         <w:gridCol w:w="9072"/>
@@ -1117,7 +1117,7 @@
       <w:pPr>
         <w:pStyle w:val="Heading1"/>
       </w:pPr>
-      <w:bookmarkStart w:id="0" w:name="_Toc243729313"/>
+      <w:bookmarkStart w:id="0" w:name="_Toc243734144"/>
       <w:r>
         <w:t>Índice</w:t>
       </w:r>
@@ -1126,7 +1126,7 @@
     <w:sdt>
       <w:sdtPr>
         <w:alias w:val="Índice"/>
-        <w:id w:val="1905105745"/>
+        <w:id w:val="-199319925"/>
       </w:sdtPr>
       <w:sdtEndPr/>
       <w:sdtContent>
@@ -1155,7 +1155,7 @@
           <w:r>
             <w:fldChar w:fldCharType="separate"/>
           </w:r>
-          <w:hyperlink w:anchor="_Toc243729313" w:history="1">
+          <w:hyperlink w:anchor="_Toc243734144" w:history="1">
             <w:r>
               <w:rPr>
                 <w:rStyle w:val="Hyperlink"/>
@@ -1179,7 +1179,7 @@
               <w:rPr>
                 <w:noProof/>
               </w:rPr>
-              <w:instrText xml:space="preserve"> PAGEREF _Toc243729313 \h </w:instrText>
+              <w:instrText xml:space="preserve"> PAGEREF _Toc243734144 \h </w:instrText>
             </w:r>
             <w:r>
               <w:rPr>
@@ -1222,7 +1222,7 @@
               <w14:ligatures w14:val="standardContextual"/>
             </w:rPr>
           </w:pPr>
-          <w:hyperlink w:anchor="_Toc243729314" w:history="1">
+          <w:hyperlink w:anchor="_Toc243734145" w:history="1">
             <w:r>
               <w:rPr>
                 <w:rStyle w:val="Hyperlink"/>
@@ -1246,7 +1246,7 @@
               <w:rPr>
                 <w:noProof/>
               </w:rPr>
-              <w:instrText xml:space="preserve"> PAGEREF _Toc243729314 \h </w:instrText>
+              <w:instrText xml:space="preserve"> PAGEREF _Toc243734145 \h </w:instrText>
             </w:r>
             <w:r>
               <w:rPr>
@@ -1289,7 +1289,7 @@
               <w14:ligatures w14:val="standardContextual"/>
             </w:rPr>
           </w:pPr>
-          <w:hyperlink w:anchor="_Toc243729315" w:history="1">
+          <w:hyperlink w:anchor="_Toc243734146" w:history="1">
             <w:r>
               <w:rPr>
                 <w:rStyle w:val="Hyperlink"/>
@@ -1313,7 +1313,7 @@
               <w:rPr>
                 <w:noProof/>
               </w:rPr>
-              <w:instrText xml:space="preserve"> PAGEREF _Toc243729315 \h </w:instrText>
+              <w:instrText xml:space="preserve"> PAGEREF _Toc243734146 \h </w:instrText>
             </w:r>
             <w:r>
               <w:rPr>
@@ -1356,7 +1356,7 @@
               <w14:ligatures w14:val="standardContextual"/>
             </w:rPr>
           </w:pPr>
-          <w:hyperlink w:anchor="_Toc243729316" w:history="1">
+          <w:hyperlink w:anchor="_Toc243734147" w:history="1">
             <w:r>
               <w:rPr>
                 <w:rStyle w:val="Hyperlink"/>
@@ -1380,7 +1380,7 @@
               <w:rPr>
                 <w:noProof/>
               </w:rPr>
-              <w:instrText xml:space="preserve"> PAGEREF _Toc243729316 \h </w:instrText>
+              <w:instrText xml:space="preserve"> PAGEREF _Toc243734147 \h </w:instrText>
             </w:r>
             <w:r>
               <w:rPr>
@@ -1423,7 +1423,7 @@
               <w14:ligatures w14:val="standardContextual"/>
             </w:rPr>
           </w:pPr>
-          <w:hyperlink w:anchor="_Toc243729317" w:history="1">
+          <w:hyperlink w:anchor="_Toc243734148" w:history="1">
             <w:r>
               <w:rPr>
                 <w:rStyle w:val="Hyperlink"/>
@@ -1447,7 +1447,7 @@
               <w:rPr>
                 <w:noProof/>
               </w:rPr>
-              <w:instrText xml:space="preserve"> PAGEREF _Toc243729317 \h </w:instrText>
+              <w:instrText xml:space="preserve"> PAGEREF _Toc243734148 \h </w:instrText>
             </w:r>
             <w:r>
               <w:rPr>
@@ -1490,7 +1490,7 @@
               <w14:ligatures w14:val="standardContextual"/>
             </w:rPr>
           </w:pPr>
-          <w:hyperlink w:anchor="_Toc243729318" w:history="1">
+          <w:hyperlink w:anchor="_Toc243734149" w:history="1">
             <w:r>
               <w:rPr>
                 <w:rStyle w:val="Hyperlink"/>
@@ -1514,7 +1514,7 @@
               <w:rPr>
                 <w:noProof/>
               </w:rPr>
-              <w:instrText xml:space="preserve"> PAGEREF _Toc243729318 \h </w:instrText>
+              <w:instrText xml:space="preserve"> PAGEREF _Toc243734149 \h </w:instrText>
             </w:r>
             <w:r>
               <w:rPr>
@@ -1557,7 +1557,7 @@
               <w14:ligatures w14:val="standardContextual"/>
             </w:rPr>
           </w:pPr>
-          <w:hyperlink w:anchor="_Toc243729319" w:history="1">
+          <w:hyperlink w:anchor="_Toc243734150" w:history="1">
             <w:r>
               <w:rPr>
                 <w:rStyle w:val="Hyperlink"/>
@@ -1581,7 +1581,7 @@
               <w:rPr>
                 <w:noProof/>
               </w:rPr>
-              <w:instrText xml:space="preserve"> PAGEREF _Toc243729319 \h </w:instrText>
+              <w:instrText xml:space="preserve"> PAGEREF _Toc243734150 \h </w:instrText>
             </w:r>
             <w:r>
               <w:rPr>
@@ -1624,7 +1624,7 @@
               <w14:ligatures w14:val="standardContextual"/>
             </w:rPr>
           </w:pPr>
-          <w:hyperlink w:anchor="_Toc243729320" w:history="1">
+          <w:hyperlink w:anchor="_Toc243734151" w:history="1">
             <w:r>
               <w:rPr>
                 <w:rStyle w:val="Hyperlink"/>
@@ -1648,7 +1648,7 @@
               <w:rPr>
                 <w:noProof/>
               </w:rPr>
-              <w:instrText xml:space="preserve"> PAGEREF _Toc243729320 \h </w:instrText>
+              <w:instrText xml:space="preserve"> PAGEREF _Toc243734151 \h </w:instrText>
             </w:r>
             <w:r>
               <w:rPr>
@@ -1691,7 +1691,7 @@
               <w14:ligatures w14:val="standardContextual"/>
             </w:rPr>
           </w:pPr>
-          <w:hyperlink w:anchor="_Toc243729321" w:history="1">
+          <w:hyperlink w:anchor="_Toc243734152" w:history="1">
             <w:r>
               <w:rPr>
                 <w:rStyle w:val="Hyperlink"/>
@@ -1715,7 +1715,7 @@
               <w:rPr>
                 <w:noProof/>
               </w:rPr>
-              <w:instrText xml:space="preserve"> PAGEREF _Toc243729321 \h </w:instrText>
+              <w:instrText xml:space="preserve"> PAGEREF _Toc243734152 \h </w:instrText>
             </w:r>
             <w:r>
               <w:rPr>
@@ -1758,7 +1758,7 @@
               <w14:ligatures w14:val="standardContextual"/>
             </w:rPr>
           </w:pPr>
-          <w:hyperlink w:anchor="_Toc243729322" w:history="1">
+          <w:hyperlink w:anchor="_Toc243734153" w:history="1">
             <w:r>
               <w:rPr>
                 <w:rStyle w:val="Hyperlink"/>
@@ -1782,7 +1782,7 @@
               <w:rPr>
                 <w:noProof/>
               </w:rPr>
-              <w:instrText xml:space="preserve"> PAGEREF _Toc243729322 \h </w:instrText>
+              <w:instrText xml:space="preserve"> PAGEREF _Toc243734153 \h </w:instrText>
             </w:r>
             <w:r>
               <w:rPr>
@@ -1825,7 +1825,7 @@
               <w14:ligatures w14:val="standardContextual"/>
             </w:rPr>
           </w:pPr>
-          <w:hyperlink w:anchor="_Toc243729323" w:history="1">
+          <w:hyperlink w:anchor="_Toc243734154" w:history="1">
             <w:r>
               <w:rPr>
                 <w:rStyle w:val="Hyperlink"/>
@@ -1849,7 +1849,7 @@
               <w:rPr>
                 <w:noProof/>
               </w:rPr>
-              <w:instrText xml:space="preserve"> PAGEREF _Toc243729323 \h </w:instrText>
+              <w:instrText xml:space="preserve"> PAGEREF _Toc243734154 \h </w:instrText>
             </w:r>
             <w:r>
               <w:rPr>
@@ -1892,7 +1892,7 @@
               <w14:ligatures w14:val="standardContextual"/>
             </w:rPr>
           </w:pPr>
-          <w:hyperlink w:anchor="_Toc243729324" w:history="1">
+          <w:hyperlink w:anchor="_Toc243734155" w:history="1">
             <w:r>
               <w:rPr>
                 <w:rStyle w:val="Hyperlink"/>
@@ -1916,7 +1916,7 @@
               <w:rPr>
                 <w:noProof/>
               </w:rPr>
-              <w:instrText xml:space="preserve"> PAGEREF _Toc243729324 \h </w:instrText>
+              <w:instrText xml:space="preserve"> PAGEREF _Toc243734155 \h </w:instrText>
             </w:r>
             <w:r>
               <w:rPr>
@@ -1959,7 +1959,7 @@
               <w14:ligatures w14:val="standardContextual"/>
             </w:rPr>
           </w:pPr>
-          <w:hyperlink w:anchor="_Toc243729325" w:history="1">
+          <w:hyperlink w:anchor="_Toc243734156" w:history="1">
             <w:r>
               <w:rPr>
                 <w:rStyle w:val="Hyperlink"/>
@@ -1983,7 +1983,7 @@
               <w:rPr>
                 <w:noProof/>
               </w:rPr>
-              <w:instrText xml:space="preserve"> PAGEREF _Toc243729325 \h </w:instrText>
+              <w:instrText xml:space="preserve"> PAGEREF _Toc243734156 \h </w:instrText>
             </w:r>
             <w:r>
               <w:rPr>
@@ -2026,7 +2026,7 @@
               <w14:ligatures w14:val="standardContextual"/>
             </w:rPr>
           </w:pPr>
-          <w:hyperlink w:anchor="_Toc243729326" w:history="1">
+          <w:hyperlink w:anchor="_Toc243734157" w:history="1">
             <w:r>
               <w:rPr>
                 <w:rStyle w:val="Hyperlink"/>
@@ -2050,7 +2050,7 @@
               <w:rPr>
                 <w:noProof/>
               </w:rPr>
-              <w:instrText xml:space="preserve"> PAGEREF _Toc243729326 \h </w:instrText>
+              <w:instrText xml:space="preserve"> PAGEREF _Toc243734157 \h </w:instrText>
             </w:r>
             <w:r>
               <w:rPr>
@@ -2093,7 +2093,7 @@
               <w14:ligatures w14:val="standardContextual"/>
             </w:rPr>
           </w:pPr>
-          <w:hyperlink w:anchor="_Toc243729327" w:history="1">
+          <w:hyperlink w:anchor="_Toc243734158" w:history="1">
             <w:r>
               <w:rPr>
                 <w:rStyle w:val="Hyperlink"/>
@@ -2117,7 +2117,7 @@
               <w:rPr>
                 <w:noProof/>
               </w:rPr>
-              <w:instrText xml:space="preserve"> PAGEREF _Toc243729327 \h </w:instrText>
+              <w:instrText xml:space="preserve"> PAGEREF _Toc243734158 \h </w:instrText>
             </w:r>
             <w:r>
               <w:rPr>
@@ -2160,7 +2160,7 @@
       <w:pPr>
         <w:pStyle w:val="Heading1"/>
       </w:pPr>
-      <w:bookmarkStart w:id="1" w:name="_Toc243729314"/>
+      <w:bookmarkStart w:id="1" w:name="_Toc243734145"/>
       <w:r>
         <w:lastRenderedPageBreak/>
         <w:t>Manejo inteligente de datos faltantes</w:t>
@@ -2186,7 +2186,7 @@
       <w:pPr>
         <w:pStyle w:val="Heading2"/>
       </w:pPr>
-      <w:bookmarkStart w:id="2" w:name="_Toc243729315"/>
+      <w:bookmarkStart w:id="2" w:name="_Toc243734146"/>
       <w:r>
         <w:t>Referencia al análisis de faltantes de S1</w:t>
       </w:r>
@@ -2201,39 +2201,26 @@
         <w:rPr>
           <w:sz w:val="20"/>
         </w:rPr>
-        <w:t xml:space="preserve">El reporte de calidad de la Sumativa 1 arrojó un resultado inequívoco: </w:t>
+        <w:t xml:space="preserve">El reporte de calidad de la Sumativa 1 no dejó lugar a dudas: </w:t>
       </w:r>
       <w:r>
         <w:rPr>
           <w:b/>
           <w:sz w:val="20"/>
         </w:rPr>
-        <w:t>ninguna de las 25 variables del conjunto presenta valores faltantes</w:t>
+        <w:t>ninguna de las 25 variables del conjunto tiene valores faltantes</w:t>
       </w:r>
       <w:r>
         <w:rPr>
           <w:sz w:val="20"/>
         </w:rPr>
-        <w:t xml:space="preserve">. Las nueve comprobaciones aplicadas —duplicados de fila, códigos de programa repetidos, valores nulos, valores fuera de dominio y cuatro consistencias aritméticas— devolvieron cero incidencias, salvo dos casos marcados para revisión manual que resultaron ser datos legítimos. El porcentaje de faltantes por variable es, por tanto, </w:t>
-      </w:r>
-      <w:r>
-        <w:rPr>
-          <w:b/>
+        <w:t>. Las nueve comprobaciones que aplicamos entonces (duplicados de fila, códigos de programa repetidos, valores nulos, valores fuera de dominio y cuatro consistencias aritméticas) devolvieron cero incidencias, salvo dos casos marcados para revisión manual que resultaron ser datos legítimos. El porcentaje de faltantes por variable es 0,0 % en los 25 casos, así que no hay patrón MCAR, MAR ni MNAR que identificar en el sentido de Rubin (1976): no ha</w:t>
+      </w:r>
+      <w:r>
+        <w:rPr>
           <w:sz w:val="20"/>
         </w:rPr>
-        <w:t>0,0 % en los 25 casos</w:t>
-      </w:r>
-      <w:r>
-        <w:rPr>
-          <w:sz w:val="20"/>
-        </w:rPr>
-        <w:t>, y no hay patrón MCAR, MAR ni MNAR que identificar en el sentido de Rubin (1976), porque no</w:t>
-      </w:r>
-      <w:r>
-        <w:rPr>
-          <w:sz w:val="20"/>
-        </w:rPr>
-        <w:t xml:space="preserve"> hay ausencia que clasificar.</w:t>
+        <w:t>y ausencia que clasificar.</w:t>
       </w:r>
     </w:p>
     <w:p>
@@ -2245,20 +2232,13 @@
         <w:rPr>
           <w:sz w:val="20"/>
         </w:rPr>
-        <w:t xml:space="preserve">La razón está en cómo se construyó el conjunto analítico, documentado en `datos/origen/`. Cada fila no es un registro original del SIES sino un </w:t>
-      </w:r>
-      <w:r>
-        <w:rPr>
-          <w:b/>
+        <w:t>La razón está en cómo se armó el conjunto analítico, documentado en `datos/origen/`. Cada fila no es un registro original del SIES, sino un agregado por programa: los scripts cruzan las bases de matrícula 2007–2026 y titulados 2007–2025 (SIES, 2026) y calculan la tasa de abandono aparente como cociente de dos conteos. Si a un programa le faltan los campos necesarios para ese cociente, no produce una fila con huecos. No produce fila. La ausencia se resuelve aguas arriba, en la agregación, y el archivo que ll</w:t>
+      </w:r>
+      <w:r>
+        <w:rPr>
           <w:sz w:val="20"/>
         </w:rPr>
-        <w:t>agregado por programa</w:t>
-      </w:r>
-      <w:r>
-        <w:rPr>
-          <w:sz w:val="20"/>
-        </w:rPr>
-        <w:t>: los scripts cruzan las bases de matrícula 2007–2026 y titulados 2007–2025 (SIES, 2026) y calculan la tasa de abandono aparente como cociente de dos conteos. Un programa que no reúne los campos necesarios para ese cociente no produce una fila con huecos: no produce fila. La ausencia se resuelve aguas arriba, en la agregación, y el archivo que llega al análisis está completo por construcción.</w:t>
+        <w:t>ega al análisis viene completo por construcción.</w:t>
       </w:r>
     </w:p>
     <w:p>
@@ -2270,27 +2250,14 @@
         <w:rPr>
           <w:sz w:val="20"/>
         </w:rPr>
-        <w:t xml:space="preserve">Se descartó además que algún paso previo hubiera rellenado los huecos sin declararlo: se contaron las coincidencias exactas con la mediana en las cinco variables candidatas y el resultado fue </w:t>
-      </w:r>
-      <w:r>
-        <w:rPr>
-          <w:b/>
-          <w:sz w:val="20"/>
-        </w:rPr>
-        <w:t>cero en todas</w:t>
-      </w:r>
-      <w:r>
-        <w:rPr>
-          <w:sz w:val="20"/>
-        </w:rPr>
-        <w:t>. No hubo imputación encubierta. Queda entonces un problema para el objetivo de este apartado —no hay nada que imputar sobre el dato real— que el apartado 1.2 resuelve sin falsear el diagnóstico.</w:t>
+        <w:t>Quisimos descartar además que algún paso previo hubiera rellenado los huecos sin declararlo: contamos las coincidencias exactas con la mediana en las cinco variables candidatas y salió cero en todas. No hubo imputación encubierta. Eso nos deja sin nada que imputar sobre el dato real, y el apartado 1.2 lo resuelve sin falsear el diagnóstico.</w:t>
       </w:r>
     </w:p>
     <w:p>
       <w:pPr>
         <w:pStyle w:val="Heading2"/>
       </w:pPr>
-      <w:bookmarkStart w:id="3" w:name="_Toc243729316"/>
+      <w:bookmarkStart w:id="3" w:name="_Toc243734147"/>
       <w:r>
         <w:t>Imputación mediante regresión lineal múltiple</w:t>
       </w:r>
@@ -2305,33 +2272,7 @@
         <w:rPr>
           <w:sz w:val="20"/>
         </w:rPr>
-        <w:t xml:space="preserve">Se adopta un </w:t>
-      </w:r>
-      <w:r>
-        <w:rPr>
-          <w:b/>
-          <w:sz w:val="20"/>
-        </w:rPr>
-        <w:t>experimento controlado de ausencia</w:t>
-      </w:r>
-      <w:r>
-        <w:rPr>
-          <w:sz w:val="20"/>
-        </w:rPr>
-        <w:t xml:space="preserve">: se eliminan valores de forma deliberada bajo los tres mecanismos que la literatura distingue (Little y Rubin, 2019) y se compara el desempeño de las estrategias de tratamiento. El diseño tiene una ventaja decisiva sobre el trabajo con faltantes reales: </w:t>
-      </w:r>
-      <w:r>
-        <w:rPr>
-          <w:b/>
-          <w:sz w:val="20"/>
-        </w:rPr>
-        <w:t>se conocen los valores verdaderos</w:t>
-      </w:r>
-      <w:r>
-        <w:rPr>
-          <w:sz w:val="20"/>
-        </w:rPr>
-        <w:t>, lo que permite medir el error de cada estrategia, algo imposible cuando la ausencia es genuina y solo cabe comparar distribuciones y confiar.</w:t>
+        <w:t>Optamos por un experimento controlado de ausencia. Eliminamos valores de forma deliberada bajo los tres mecanismos que distingue la literatura (Little y Rubin, 2019) y comparamos cómo se comporta cada estrategia de tratamiento. El diseño tiene una ventaja que el trabajo con faltantes reales no ofrece: conocemos los valores verdaderos, y eso permite medir el error de cada estrategia. Cuando la ausencia es genuina, lo único que cabe hacer es comparar distribuciones y confiar.</w:t>
       </w:r>
     </w:p>
     <w:p>
@@ -2343,7 +2284,7 @@
         <w:rPr>
           <w:sz w:val="20"/>
         </w:rPr>
-        <w:t xml:space="preserve">La asignación de mecanismos no es arbitraria. La </w:t>
+        <w:t xml:space="preserve">La asignación de mecanismos no fue arbitraria. La </w:t>
       </w:r>
       <w:r>
         <w:rPr>
@@ -2356,7 +2297,7 @@
         <w:rPr>
           <w:sz w:val="20"/>
         </w:rPr>
-        <w:t xml:space="preserve"> pierde valores al azar con probabilidad constante (MCAR) y hace de control: su ausencia no debería sesgar nada. La </w:t>
+        <w:t xml:space="preserve"> pierde valores al azar, con probabilidad constante (MCAR), y hace de control, porque su ausencia no debería sesgar nada; es el caso que la pauta prescribe, con un 14,9 % de la columna y semilla fija. Los otros dos los declaramos como extensión voluntaria. La </w:t>
       </w:r>
       <w:r>
         <w:rPr>
@@ -2369,7 +2310,7 @@
         <w:rPr>
           <w:sz w:val="20"/>
         </w:rPr>
-        <w:t xml:space="preserve"> los pierde con probabilidad creciente en la duración del programa, que sí se observa (MAR); S2 la declaró estable y en la Formativa 2 resultó influyente. El </w:t>
+        <w:t xml:space="preserve"> pierde valores con probabilidad creciente en la duración del programa, que sí se observa (MAR); S2 la había declarado estable y en la Formativa 2 resultó influyente. El </w:t>
       </w:r>
       <w:r>
         <w:rPr>
@@ -2382,13 +2323,13 @@
         <w:rPr>
           <w:sz w:val="20"/>
         </w:rPr>
-        <w:t xml:space="preserve"> los pierde con probabilidad creciente cuanto menor es su propio valor (MNAR), imitando que los programas pequeños reportan peor. El caso MNAR se incluye precisamente porque ningu</w:t>
+        <w:t xml:space="preserve"> los pierde con más pro</w:t>
       </w:r>
       <w:r>
         <w:rPr>
           <w:sz w:val="20"/>
         </w:rPr>
-        <w:t>na estrategia puede corregirlo por completo.</w:t>
+        <w:t>babilidad cuanto menor es su propio valor (MNAR), imitando la idea de que los programas pequeños reportan peor. Incluimos el caso MNAR justamente porque ninguna estrategia puede corregirlo del todo.</w:t>
       </w:r>
     </w:p>
     <w:p>
@@ -2980,26 +2921,13 @@
         <w:rPr>
           <w:sz w:val="20"/>
         </w:rPr>
-        <w:t xml:space="preserve">Los mecanismos logísticos producen más ausencia que el MCAR, de modo que </w:t>
-      </w:r>
-      <w:r>
-        <w:rPr>
-          <w:b/>
+        <w:t xml:space="preserve">Los mecanismos logísticos producen más ausencia que el MCAR, así que 5.077 de 9.678 filas, el 52,5 %, pierden al </w:t>
+      </w:r>
+      <w:r>
+        <w:rPr>
           <w:sz w:val="20"/>
         </w:rPr>
-        <w:t>5.077 de 9.678 filas (52,5 %) pierden al menos un valor</w:t>
-      </w:r>
-      <w:r>
-        <w:rPr>
-          <w:sz w:val="20"/>
-        </w:rPr>
-        <w:t xml:space="preserve">. La asimetría es deliberada, porque la ausencia no aleatoria suele ser </w:t>
-      </w:r>
-      <w:r>
-        <w:rPr>
-          <w:sz w:val="20"/>
-        </w:rPr>
-        <w:t>también la más frecuente.</w:t>
+        <w:t>menos un valor. La asimetría es deliberada: la ausencia no aleatoria suele ser también la más frecuente.</w:t>
       </w:r>
     </w:p>
     <w:p>
@@ -3011,33 +2939,13 @@
         <w:rPr>
           <w:sz w:val="20"/>
         </w:rPr>
-        <w:t xml:space="preserve">La última columna contiene la lección principal, y no es la que cabría esperar. Bajo MCAR el sesgo es nulo, como corresponde, y bajo MNAR es grande, porque faltan sistemáticamente los programas pequeños y la media observada sobreestima el tamaño típico. Pero </w:t>
-      </w:r>
-      <w:r>
-        <w:rPr>
-          <w:b/>
+        <w:t>La última columna trae la lección principal, y no es la que uno esperaría. Bajo MCAR el sesgo es nulo, como corresponde. Bajo MNAR es grande, porque faltan sistemáticamente los programas pequeños y la media observada termina sobreestimando el tamaño típico. Lo llamativo está en el medio: bajo MAR el sesgo de la media es despreciable, de apenas −0,002. La explicación es que la duración, que gobierna la ausencia, casi no correlaciona con la proporción de mujeres; MAR no sesga necesariamente las medias margina</w:t>
+      </w:r>
+      <w:r>
+        <w:rPr>
           <w:sz w:val="20"/>
         </w:rPr>
-        <w:t>bajo MAR el sesgo de la media es despreciable</w:t>
-      </w:r>
-      <w:r>
-        <w:rPr>
-          <w:sz w:val="20"/>
-        </w:rPr>
-        <w:t xml:space="preserve"> (−0,002), y conviene entender por qué antes de concluir de más: la duración, que gobierna la ausencia, apenas correlaciona con la proporción de mujeres. </w:t>
-      </w:r>
-      <w:r>
-        <w:rPr>
-          <w:b/>
-          <w:sz w:val="20"/>
-        </w:rPr>
-        <w:t>MAR no sesga necesariamente las medias marginales; lo que distorsiona son las relaciones condicionales.</w:t>
-      </w:r>
-      <w:r>
-        <w:rPr>
-          <w:sz w:val="20"/>
-        </w:rPr>
-        <w:t xml:space="preserve"> Confundir ambas cosas lleva a declarar inocua una ausencia que no lo es, y es la razón por la que el apartado 1.3 no se limita a comparar medias.</w:t>
+        <w:t>les, y lo que distorsiona son las relaciones condicionales. Confundir las dos cosas llevaría a declarar inocua una ausencia que no lo es, y por eso el apartado 1.3 no se queda en comparar medias.</w:t>
       </w:r>
     </w:p>
     <w:p>
@@ -3047,29 +2955,9 @@
       </w:pPr>
       <w:r>
         <w:rPr>
-          <w:b/>
           <w:sz w:val="20"/>
         </w:rPr>
-        <w:t>Los imputadores.</w:t>
-      </w:r>
-      <w:r>
-        <w:rPr>
-          <w:sz w:val="20"/>
-        </w:rPr>
-        <w:t xml:space="preserve"> Para cada variable se ajusta una regresión lineal múltiple con entre cuatro y cinco predictoras elegidas por su |r| en la matriz de correlaciones de S1, dando prioridad a las que S2 validó como estables. El ajuste emplea </w:t>
-      </w:r>
-      <w:r>
-        <w:rPr>
-          <w:b/>
-          <w:sz w:val="20"/>
-        </w:rPr>
-        <w:t>únicamente observaciones completas</w:t>
-      </w:r>
-      <w:r>
-        <w:rPr>
-          <w:sz w:val="20"/>
-        </w:rPr>
-        <w:t>, de modo que el modelo nunca aprende de un valor imputado.</w:t>
+        <w:t>Para cada variable ajustamos una regresión lineal múltiple con entre cuatro y cinco predictoras, elegidas por su |r| en la matriz de correlaciones de S1 y dando prioridad a las que S2 validó como estables. El ajuste emplea únicamente observaciones completas, de modo que el modelo nunca aprende de un valor imputado. El abandono, que es la variable respuesta, no se imputa ni entra como predictora en ninguno de los tres imputadores.</w:t>
       </w:r>
     </w:p>
     <w:p>
@@ -3384,13 +3272,7 @@
               <w:rPr>
                 <w:sz w:val="15"/>
               </w:rPr>
-              <w:t xml:space="preserve">&lt; </w:t>
-            </w:r>
-            <w:r>
-              <w:rPr>
-                <w:sz w:val="15"/>
-              </w:rPr>
-              <w:t>0,001</w:t>
+              <w:t>&lt; 0,001</w:t>
             </w:r>
           </w:p>
         </w:tc>
@@ -3451,6 +3333,7 @@
               <w:rPr>
                 <w:sz w:val="15"/>
               </w:rPr>
+              <w:lastRenderedPageBreak/>
               <w:t>pct_mujeres</w:t>
             </w:r>
           </w:p>
@@ -3730,49 +3613,21 @@
       </w:pPr>
       <w:r>
         <w:rPr>
-          <w:b/>
           <w:sz w:val="20"/>
         </w:rPr>
-        <w:lastRenderedPageBreak/>
-        <w:t>Los tres imputadores incumplen los supuestos clásicos</w:t>
+        <w:t xml:space="preserve">Los tres imputadores incumplen los supuestos clásicos. Jarque-Bera y Breusch-Pagan rechazan la normalidad y la homocedasticidad de los residuos con p &lt; 0,001 en los tres casos, y el </w:t>
       </w:r>
       <w:r>
         <w:rPr>
           <w:sz w:val="20"/>
         </w:rPr>
-        <w:t xml:space="preserve">: Jarque-Bera y Breusch-Pagan rechazan la normalidad y la homocedasticidad de los residuos con p &lt; 0,001 en los tres casos, y el estadístico de Durbin-Watson, entre 1,32 y 1,44, advierte además de dependencia residual, coherente con que los programas se agrupen por institución. Conviene precisar qué implica eso y qué no: para </w:t>
-      </w:r>
-      <w:r>
-        <w:rPr>
-          <w:b/>
+        <w:t>Durbin-Watson, entre 1,32 y 1,44, advierte de dependencia residual, algo coherente con que los programas se agrupen por institución. Hay que precisar qué implica eso. Si quisiéramos estimar los coeficientes del imputador e inferir sobre ellos, las violaciones importarían bastante; para predecir un valor puntual, que es el único uso que les damos aquí, importan mucho menos, porque la predicción por mínimos cuadrados sigue siendo el mejor predictor lineal insesgado en media aunque los residuos no sean normale</w:t>
+      </w:r>
+      <w:r>
+        <w:rPr>
           <w:sz w:val="20"/>
         </w:rPr>
-        <w:t>estimar los coeficientes</w:t>
-      </w:r>
-      <w:r>
-        <w:rPr>
-          <w:sz w:val="20"/>
-        </w:rPr>
-        <w:t xml:space="preserve"> del imputador e inferir sobre ellos, las violaciones importarían; para </w:t>
-      </w:r>
-      <w:r>
-        <w:rPr>
-          <w:b/>
-          <w:sz w:val="20"/>
-        </w:rPr>
-        <w:t>predecir un valor puntual</w:t>
-      </w:r>
-      <w:r>
-        <w:rPr>
-          <w:sz w:val="20"/>
-        </w:rPr>
-        <w:t>, que es el único uso que se les da aquí, importan mucho menos,</w:t>
-      </w:r>
-      <w:r>
-        <w:rPr>
-          <w:sz w:val="20"/>
-        </w:rPr>
-        <w:t xml:space="preserve"> porque la predicción por mínimos cuadrados sigue siendo el mejor predictor lineal insesgado en media aunque los residuos no sean normales.</w:t>
+        <w:t>s.</w:t>
       </w:r>
     </w:p>
     <w:p>
@@ -3784,20 +3639,7 @@
         <w:rPr>
           <w:sz w:val="20"/>
         </w:rPr>
-        <w:t xml:space="preserve">Más relevante para el resultado es la capacidad predictiva, que difiere mucho entre variables: R² de 0,268 y 0,273 para la edad y el tamaño, pero apenas </w:t>
-      </w:r>
-      <w:r>
-        <w:rPr>
-          <w:b/>
-          <w:sz w:val="20"/>
-        </w:rPr>
-        <w:t>0,084 para la proporción de mujeres</w:t>
-      </w:r>
-      <w:r>
-        <w:rPr>
-          <w:sz w:val="20"/>
-        </w:rPr>
-        <w:t>. La matriz de S1 ya lo anticipaba, porque ninguna variable se asocia con ella por encima de |r| = 0,16. Donde no hay predictores informativos la imputación por regresión no puede hacer magia, y el apartado siguiente lo confirma con el error medido.</w:t>
+        <w:t>Para el resultado pesa más la capacidad predictiva, y ahí las tres variables se comportan muy distinto. El R² llega a 0,268 y 0,273 en la edad y el tamaño, pero se queda en 0,084 en la proporción de mujeres. La matriz de S1 ya lo anticipaba, porque ninguna variable se asocia con ella por encima de |r| = 0,16. Donde no hay predictores informativos la imputación por regresión no puede hacer magia, y el apartado siguiente lo confirma con el error medido.</w:t>
       </w:r>
     </w:p>
     <w:p>
@@ -3807,29 +3649,9 @@
       </w:pPr>
       <w:r>
         <w:rPr>
-          <w:b/>
           <w:sz w:val="20"/>
         </w:rPr>
-        <w:t>Valores imputados.</w:t>
-      </w:r>
-      <w:r>
-        <w:rPr>
-          <w:sz w:val="20"/>
-        </w:rPr>
-        <w:t xml:space="preserve"> De los 6.188 valores ausentes, la regresión imputó </w:t>
-      </w:r>
-      <w:r>
-        <w:rPr>
-          <w:b/>
-          <w:sz w:val="20"/>
-        </w:rPr>
-        <w:t>5.730 (92,6 %)</w:t>
-      </w:r>
-      <w:r>
-        <w:rPr>
-          <w:sz w:val="20"/>
-        </w:rPr>
-        <w:t xml:space="preserve">: 1.443 en la edad, 1.910 en la proporción de mujeres y 2.377 en el tamaño. Los 458 restantes corresponden a filas donde faltaba también `log_matricula`, que es predictora de `pct_mujeres` y es a su vez la variable MNAR; en ellas se recurrió a la mediana para no perder la fila. El detalle es revelador: </w:t>
+        <w:t xml:space="preserve">De los 6.188 valores ausentes, la regresión alcanzó a imputar 5.730, el 92,6 %: 1.443 en la edad, 1.910 en la proporción de mujeres y 2.377 en el tamaño. Los 458 restantes caen en filas donde faltaba también `log_matricula`, que es predictora de `pct_mujeres` y es, a la vez, la variable MNAR; en esas filas recurrimos a la mediana para no perderlas. El detalle nos pareció revelador: </w:t>
       </w:r>
       <w:r>
         <w:rPr>
@@ -3849,7 +3671,7 @@
       <w:pPr>
         <w:pStyle w:val="Heading2"/>
       </w:pPr>
-      <w:bookmarkStart w:id="4" w:name="_Toc243729317"/>
+      <w:bookmarkStart w:id="4" w:name="_Toc243734148"/>
       <w:r>
         <w:t>Comparación de estrategias de imputación</w:t>
       </w:r>
@@ -3864,20 +3686,7 @@
         <w:rPr>
           <w:sz w:val="20"/>
         </w:rPr>
-        <w:t xml:space="preserve">Las tres estrategias se comparan en cuatro dimensiones: el tamaño de muestra que dejan, cuánto alteran la distribución de las variables, si preservan las correlaciones que S1 estimó —criterio que la pauta señala— y, gracias al diseño controlado, </w:t>
-      </w:r>
-      <w:r>
-        <w:rPr>
-          <w:b/>
-          <w:sz w:val="20"/>
-        </w:rPr>
-        <w:t>el error que cometen frente a los valores verdaderos</w:t>
-      </w:r>
-      <w:r>
-        <w:rPr>
-          <w:sz w:val="20"/>
-        </w:rPr>
-        <w:t>.</w:t>
+        <w:t>Comparamos las tres estrategias en cuatro dimensiones: el tamaño de muestra que dejan, cuánto alteran la distribución de las variables, si preservan las correlaciones que S1 estimó, criterio que la pauta señala, y el error que cometen frente a los valores verdaderos, que el diseño controlado nos permite medir.</w:t>
       </w:r>
     </w:p>
     <w:p>
@@ -4225,13 +4034,7 @@
               <w:rPr>
                 <w:sz w:val="15"/>
               </w:rPr>
-              <w:t xml:space="preserve">Imputación simple </w:t>
-            </w:r>
-            <w:r>
-              <w:rPr>
-                <w:sz w:val="15"/>
-              </w:rPr>
-              <w:t>(mediana)</w:t>
+              <w:t>Imputación simple (mediana)</w:t>
             </w:r>
           </w:p>
         </w:tc>
@@ -4611,7 +4414,7 @@
           <w:noProof/>
         </w:rPr>
         <w:drawing>
-          <wp:inline distT="0" distB="0" distL="0" distR="0" wp14:anchorId="361A9BFD" wp14:editId="35DEFB5F">
+          <wp:inline distT="0" distB="0" distL="0" distR="0" wp14:anchorId="0EBBC85F" wp14:editId="5502ADF1">
             <wp:extent cx="4500000" cy="1617444"/>
             <wp:effectExtent l="0" t="0" r="0" b="0"/>
             <wp:docPr id="2" name="Picture 2"/>
@@ -4657,15 +4460,7 @@
           <w:color w:val="444444"/>
           <w:sz w:val="18"/>
         </w:rPr>
-        <w:t xml:space="preserve">Figura 1: Efecto de cada estrategia sobre la distribución de las tres variables </w:t>
-      </w:r>
-      <w:r>
-        <w:rPr>
-          <w:i/>
-          <w:color w:val="444444"/>
-          <w:sz w:val="18"/>
-        </w:rPr>
-        <w:t>afectadas. La imputación por mediana concentra masa en un punto; la regresión reproduce la forma de la distribución verdadera.</w:t>
+        <w:t>Figura 1: Efecto de cada estrategia sobre la distribución de las tres variables afectadas. La imputación por mediana concentra masa en un punto; la regresión reproduce la forma de la distribución verdadera.</w:t>
       </w:r>
     </w:p>
     <w:p>
@@ -4675,16 +4470,9 @@
       </w:pPr>
       <w:r>
         <w:rPr>
-          <w:b/>
           <w:sz w:val="20"/>
         </w:rPr>
-        <w:t>Se adopta la imputación por regresión</w:t>
-      </w:r>
-      <w:r>
-        <w:rPr>
-          <w:sz w:val="20"/>
-        </w:rPr>
-        <w:t xml:space="preserve"> para el resto del desarrollo, por tres razones que la tabla documenta.</w:t>
+        <w:t>Para el resto del desarrollo adoptamos la imputación por regresión, por tres razones que la tabla documenta.</w:t>
       </w:r>
     </w:p>
     <w:p>
@@ -4694,16 +4482,15 @@
       </w:pPr>
       <w:r>
         <w:rPr>
-          <w:b/>
           <w:sz w:val="20"/>
         </w:rPr>
-        <w:t>Conserva toda la muestra.</w:t>
+        <w:t xml:space="preserve">La primera es que conserva toda la muestra. La eliminación descarta el 52,5 % de los programas, y no al azar: bajo MAR y MNAR se </w:t>
       </w:r>
       <w:r>
         <w:rPr>
           <w:sz w:val="20"/>
         </w:rPr>
-        <w:t xml:space="preserve"> La eliminación descarta el 52,5 % de los programas, y no al azar: bajo MAR y MNAR se pierden preferentemente los de mayor duración y los pequeños, de modo que el conjunto superviviente deja de representar al sistema. Es el defecto más grave, porque ningún paso posterior lo corrige.</w:t>
+        <w:t>pierden sobre todo los de mayor duración y los pequeños, de manera que el conjunto que sobrevive deja de representar al sistema. Nos parece el defecto más grave de los tres, porque ningún paso posterior lo corrige.</w:t>
       </w:r>
     </w:p>
     <w:p>
@@ -4713,22 +4500,15 @@
       </w:pPr>
       <w:r>
         <w:rPr>
-          <w:b/>
           <w:sz w:val="20"/>
         </w:rPr>
-        <w:t>Preserva mejor las correlaciones de S1 y comete menos error.</w:t>
+        <w:t>Las otras dos van juntas: preserva mejor las correlaciones de S1 y comete menos error. Su desvío medio, 0,0135, es el menor de los tres, y su RMSE es menor en las tres variables. Que la imputación simple sea la peor en correlaciones no es casualidad: sustituir variabilidad real por una constante atenúa las asociaciones, y se nota en que la desviación típica de lo que imputa es cero. La ventaja de la regresión es amplia donde el imputador tiene poder predictivo (2,876 frente a 3,641 en la edad) y mínima dond</w:t>
       </w:r>
       <w:r>
         <w:rPr>
           <w:sz w:val="20"/>
         </w:rPr>
-        <w:t xml:space="preserve"> Su desvío medio (0,0135) es el menor de los tres, y su RMSE es menor en las tres variables. Que la imputación simple sea la peor en correlaciones no es casual: sustituir variabilidad real por una constante atenúa las asociaciones, y se comprueba en que la desviación típica de lo que imputa es exactamente cero. La ventaja de la regresión es amplia donde el imputador tiene poder predictivo (2,876 frente a 3,641 en la edad) y mínima donde no lo tiene (0,2732 frente a 0,2758 en la proporción de mujeres), lo qu</w:t>
-      </w:r>
-      <w:r>
-        <w:rPr>
-          <w:sz w:val="20"/>
-        </w:rPr>
-        <w:t>e confirma la lectura del R² anterior.</w:t>
+        <w:t>e no lo tiene (0,2732 frente a 0,2758 en la proporción de mujeres), lo que confirma la lectura del R² anterior.</w:t>
       </w:r>
     </w:p>
     <w:p>
@@ -4740,7 +4520,8 @@
         <w:rPr>
           <w:sz w:val="20"/>
         </w:rPr>
-        <w:t xml:space="preserve">Conviene no exagerar la conclusión. </w:t>
+        <w:lastRenderedPageBreak/>
+        <w:t xml:space="preserve">Conviene no estirar la conclusión. </w:t>
       </w:r>
       <w:r>
         <w:rPr>
@@ -4753,16 +4534,15 @@
         <w:rPr>
           <w:sz w:val="20"/>
         </w:rPr>
-        <w:t>: el sesgo medio de lo imputado en `log_matricula` sigue siendo +0,395, porque la ausencia depende del valor que no se observa. La regresión reduce el error pero no elimina el sesgo. Es una limitación estructural del problema, no del método, y debe declararse.</w:t>
+        <w:t>: el sesgo medio de lo imputado en `log_matricula` sigue siendo +0,395, porque la ausencia depende del valor que no se observa. La regresión reduce el error, pero no elimina el sesgo. Es una limitación del problema, no del método, y hay que declararla como tal.</w:t>
       </w:r>
     </w:p>
     <w:p>
       <w:pPr>
         <w:pStyle w:val="Heading1"/>
       </w:pPr>
-      <w:bookmarkStart w:id="5" w:name="_Toc243729318"/>
-      <w:r>
-        <w:lastRenderedPageBreak/>
+      <w:bookmarkStart w:id="5" w:name="_Toc243734149"/>
+      <w:r>
         <w:t>Clasificación mediante regresión logística</w:t>
       </w:r>
       <w:bookmarkEnd w:id="5"/>
@@ -4786,7 +4566,7 @@
       <w:pPr>
         <w:pStyle w:val="Heading2"/>
       </w:pPr>
-      <w:bookmarkStart w:id="6" w:name="_Toc243729319"/>
+      <w:bookmarkStart w:id="6" w:name="_Toc243734150"/>
       <w:r>
         <w:t>Preparación de datos informada por S1</w:t>
       </w:r>
@@ -4799,16 +4579,9 @@
       </w:pPr>
       <w:r>
         <w:rPr>
-          <w:b/>
           <w:sz w:val="20"/>
         </w:rPr>
-        <w:t>La variable respuesta</w:t>
-      </w:r>
-      <w:r>
-        <w:rPr>
-          <w:sz w:val="20"/>
-        </w:rPr>
-        <w:t xml:space="preserve"> es el abandono dicotomizado en el 50 %, el mismo umbral que S1 estimó —el 54,94 % de los programas lo supera— y que S2 validó por intervalo de Wilson, bootstrap y contraste Z de una proporción. No se introduce aquí ningún umbral nuevo.</w:t>
+        <w:t>La variable respuesta es el abandono dicotomizado en el 50 %, el mismo umbral que estimó S1, donde el 54,94 % de los programas lo supera, y que S2 validó con el intervalo de Wilson, bootstrap y un contraste Z de una proporción. No introducimos aquí ningún umbral nuevo.</w:t>
       </w:r>
     </w:p>
     <w:p>
@@ -4818,23 +4591,9 @@
       </w:pPr>
       <w:r>
         <w:rPr>
-          <w:b/>
           <w:sz w:val="20"/>
         </w:rPr>
-        <w:t xml:space="preserve">Los valores </w:t>
-      </w:r>
-      <w:r>
-        <w:rPr>
-          <w:b/>
-          <w:sz w:val="20"/>
-        </w:rPr>
-        <w:t>extremos se conservan.</w:t>
-      </w:r>
-      <w:r>
-        <w:rPr>
-          <w:sz w:val="20"/>
-        </w:rPr>
-        <w:t xml:space="preserve"> S1 identificó 465 programas censurados en 0 y en 1, y S2 los auditó uno a uno: el 91 % de los que tienen abandono igual a uno corresponde a cierres reales de programa, no a errores de registro. Su recomendación explícita fue conservarlos y declararlos, porque excluirlos desplaza la media del sistema apenas nueve milésimas. La Parte 3 somete esa decisión a prueba.</w:t>
+        <w:t>Los valores extremos se conservan. S1 identificó 465 programas censurados en 0 y en 1, y S2 los auditó uno a uno: el 91 % de los que tienen abandono igual a uno corresponde a cierres reales de programa, no a errores de registro. La recomendación de esa fase fue conservarlos y declararlos, entre otras cosas porque excluirlos desplaza la media del sistema apenas nueve milésimas. La Parte 3 pone esa decisión a prueba.</w:t>
       </w:r>
     </w:p>
     <w:p>
@@ -4844,29 +4603,9 @@
       </w:pPr>
       <w:r>
         <w:rPr>
-          <w:b/>
           <w:sz w:val="20"/>
         </w:rPr>
-        <w:t>La partición es 70/30 estratificada por la respuesta</w:t>
-      </w:r>
-      <w:r>
-        <w:rPr>
-          <w:sz w:val="20"/>
-        </w:rPr>
-        <w:t>, con la semilla 42 fijada y visible en el cuaderno. La estratificación iguala la prevalencia de abandono alto en ambos conjuntos —</w:t>
-      </w:r>
-      <w:r>
-        <w:rPr>
-          <w:b/>
-          <w:sz w:val="20"/>
-        </w:rPr>
-        <w:t>54,95 % en entrenamiento y 54,92 % en prueba, una diferencia de 0,02 puntos</w:t>
-      </w:r>
-      <w:r>
-        <w:rPr>
-          <w:sz w:val="20"/>
-        </w:rPr>
-        <w:t>— de modo que el desempeño medido no se contamina con un desbalance accidental entre particiones. Resultan 6.774 programas para entrenar y 2.904 para evaluar.</w:t>
+        <w:t>La partición es 70/30 estratificada por la respuesta, con la semilla 42 fijada y visible en el cuaderno. La estratificación iguala la prevalencia de abandono alto en ambos conjuntos, un 54,95 % en entrenamiento y un 54,92 % en prueba, con una diferencia de 0,02 puntos, de modo que el desempeño medido no se contamina con un desbalance accidental entre particiones. Quedan 6.774 programas para entrenar y 2.904 para evaluar.</w:t>
       </w:r>
     </w:p>
     <w:p>
@@ -4876,29 +4615,9 @@
       </w:pPr>
       <w:r>
         <w:rPr>
-          <w:b/>
           <w:sz w:val="20"/>
         </w:rPr>
-        <w:t>Una limitación se declara de entrada.</w:t>
-      </w:r>
-      <w:r>
-        <w:rPr>
-          <w:sz w:val="20"/>
-        </w:rPr>
-        <w:t xml:space="preserve"> La estratificación reparte los programas de una misma institución entre ambos conjuntos: </w:t>
-      </w:r>
-      <w:r>
-        <w:rPr>
-          <w:b/>
-          <w:sz w:val="20"/>
-        </w:rPr>
-        <w:t>138 de las 168 instituciones aparecen en los dos</w:t>
-      </w:r>
-      <w:r>
-        <w:rPr>
-          <w:sz w:val="20"/>
-        </w:rPr>
-        <w:t>. S2 había advertido que esos programas no son observaciones independientes, de modo que parte del desempeño en prueba puede provenir de que el modelo ya vio otros programas de la misma institución. La partición no lo corrige; el apartado 2.3 lo cuantifica con un bootstrap por institución.</w:t>
+        <w:t>Hay una limitación que preferimos declarar de entrada. La estratificación reparte los programas de una misma institución entre ambos conjuntos, y 138 de las 168 instituciones aparecen en los dos. S2 ya había advertido que esos programas no son observaciones independientes, así que parte del desempeño en prueba puede venir de que el modelo vio otros programas de la misma institución. La partición no lo corrige; el apartado 2.3 lo cuantifica con un bootstrap por institución.</w:t>
       </w:r>
     </w:p>
     <w:p>
@@ -4908,23 +4627,16 @@
       </w:pPr>
       <w:r>
         <w:rPr>
-          <w:b/>
           <w:sz w:val="20"/>
         </w:rPr>
-        <w:t>Se estandarizan las variables numéricas</w:t>
-      </w:r>
-      <w:r>
-        <w:rPr>
-          <w:sz w:val="20"/>
-        </w:rPr>
-        <w:t xml:space="preserve"> para que los coeficientes sean comparables entre sí y se lean como el efecto de una desviación típica; las categóricas se codifican con variables indicadoras tomando como referencia la categoría más numerosa.</w:t>
+        <w:t>Las variables numéricas se estandarizan, para que los coeficientes sean comparables entre sí y se lean como el efecto de una desviación típica. Las categóricas se codifican con variables indicadoras, tomando como referencia la categoría más numerosa.</w:t>
       </w:r>
     </w:p>
     <w:p>
       <w:pPr>
         <w:pStyle w:val="Heading2"/>
       </w:pPr>
-      <w:bookmarkStart w:id="7" w:name="_Toc243729320"/>
+      <w:bookmarkStart w:id="7" w:name="_Toc243734151"/>
       <w:r>
         <w:t>Selección de variables informada por S1 y S2</w:t>
       </w:r>
@@ -4939,7 +4651,7 @@
         <w:rPr>
           <w:sz w:val="20"/>
         </w:rPr>
-        <w:t>Se construyen tres modelos con criterios de selección deliberadamente distintos: uno levantado sobre el conocimiento de las fases anteriores, uno automático y uno austero.</w:t>
+        <w:t>Construimos tres modelos con criterios de selección deliberadamente distintos: uno levantado sobre el conocimiento de las fases anteriores, uno automático y uno austero.</w:t>
       </w:r>
     </w:p>
     <w:p>
@@ -5149,7 +4861,13 @@
               <w:rPr>
                 <w:sz w:val="15"/>
               </w:rPr>
-              <w:t>M1 — dominio</w:t>
+              <w:t xml:space="preserve">M1 — </w:t>
+            </w:r>
+            <w:r>
+              <w:rPr>
+                <w:sz w:val="15"/>
+              </w:rPr>
+              <w:t>dominio</w:t>
             </w:r>
           </w:p>
         </w:tc>
@@ -5279,13 +4997,7 @@
               <w:rPr>
                 <w:sz w:val="15"/>
               </w:rPr>
-              <w:t xml:space="preserve">M2 — </w:t>
-            </w:r>
-            <w:r>
-              <w:rPr>
-                <w:sz w:val="15"/>
-              </w:rPr>
-              <w:t>stepwise AIC</w:t>
+              <w:t>M2 — stepwise AIC</w:t>
             </w:r>
           </w:p>
         </w:tc>
@@ -5415,7 +5127,13 @@
               <w:rPr>
                 <w:sz w:val="15"/>
               </w:rPr>
-              <w:t>M3 — reducida</w:t>
+              <w:t xml:space="preserve">M3 — </w:t>
+            </w:r>
+            <w:r>
+              <w:rPr>
+                <w:sz w:val="15"/>
+              </w:rPr>
+              <w:t>reducida</w:t>
             </w:r>
           </w:p>
         </w:tc>
@@ -5530,23 +5248,15 @@
       </w:pPr>
       <w:r>
         <w:rPr>
-          <w:b/>
           <w:sz w:val="20"/>
         </w:rPr>
-        <w:t xml:space="preserve">Cada variable del modelo de </w:t>
-      </w:r>
-      <w:r>
-        <w:rPr>
-          <w:b/>
+        <w:t xml:space="preserve">Cada variable del modelo de dominio entra con su cifra, y eso es lo que nos permite sostener que la selección no es arbitraria. Las cuatro </w:t>
+      </w:r>
+      <w:r>
+        <w:rPr>
           <w:sz w:val="20"/>
         </w:rPr>
-        <w:t>dominio entra con su cifra</w:t>
-      </w:r>
-      <w:r>
-        <w:rPr>
-          <w:sz w:val="20"/>
-        </w:rPr>
-        <w:t>, que es lo que permite afirmar que la selección no es arbitraria. Las cuatro continuas traen su correlación de S1 y su intervalo bootstrap de S2, que en los cuatro casos excluye el cero. Las tres categóricas entran por contrastes de S1.</w:t>
+        <w:t>continuas traen su correlación de S1 y su intervalo bootstrap de S2, que en los cuatro casos excluye el cero. Las tres categóricas entran por contrastes de S1.</w:t>
       </w:r>
     </w:p>
     <w:p>
@@ -6231,7 +5941,16 @@
           <w:color w:val="444444"/>
           <w:sz w:val="18"/>
         </w:rPr>
-        <w:t>Tabla 6: Coeficientes y razones de momios de las variables continuas de M1. Al estar estandarizadas, cada OR expresa el efecto de una desviación típica. La tabla completa está en `S3/resultados/tablas/odds_ratios_m1.csv`.</w:t>
+        <w:lastRenderedPageBreak/>
+        <w:t xml:space="preserve">Tabla 6: </w:t>
+      </w:r>
+      <w:r>
+        <w:rPr>
+          <w:i/>
+          <w:color w:val="444444"/>
+          <w:sz w:val="18"/>
+        </w:rPr>
+        <w:t>Coeficientes y razones de momios de las variables continuas de M1. Al estar estandarizadas, cada OR expresa el efecto de una desviación típica. La tabla completa está en `S3/resultados/tablas/odds_ratios_m1.csv`.</w:t>
       </w:r>
     </w:p>
     <w:tbl>
@@ -6660,7 +6379,6 @@
               <w:rPr>
                 <w:sz w:val="15"/>
               </w:rPr>
-              <w:lastRenderedPageBreak/>
               <w:t>log_matricula</w:t>
             </w:r>
           </w:p>
@@ -6901,27 +6619,13 @@
         <w:rPr>
           <w:sz w:val="20"/>
         </w:rPr>
-        <w:t xml:space="preserve">Las cuatro apuntan en la misma dirección: </w:t>
-      </w:r>
-      <w:r>
-        <w:rPr>
-          <w:b/>
+        <w:t>Las cuatro apuntan en la misma dirección: una desviación típica más de acreditación, tamaño o presencia femenina reduce entre un 24 % y un 37 % la probabilidad relativa de abandono alto, y las cuatro son significativas al 0,1 %. Entre las categóricas, los efectos más grandes son Derecho (OR 2,95) y Ciencias Básicas (2,40) por encima de la referencia, y los Centros de Formación Técnica Estatales (0,22), Agropecuaria (0,48) y Salud (0,56) por debajo. El apartado 2.3 muestra que varios de esos efectos categóri</w:t>
+      </w:r>
+      <w:r>
+        <w:rPr>
           <w:sz w:val="20"/>
         </w:rPr>
-        <w:t xml:space="preserve">una desviación típica más de acreditación, tamaño o presencia femenina reduce entre un 24 % y </w:t>
-      </w:r>
-      <w:r>
-        <w:rPr>
-          <w:b/>
-          <w:sz w:val="20"/>
-        </w:rPr>
-        <w:t>un 37 % la probabilidad relativa de abandono alto</w:t>
-      </w:r>
-      <w:r>
-        <w:rPr>
-          <w:sz w:val="20"/>
-        </w:rPr>
-        <w:t>, y las cuatro son significativas al 0,1 %. Entre las categóricas, los efectos mayores son Derecho (OR 2,95) y Ciencias Básicas (2,40) por encima de la referencia, y los Centros de Formación Técnica Estatales (0,22), Agropecuaria (0,48) y Salud (0,56) por debajo. El apartado 2.3 muestra que varios de esos efectos categóricos son menos firmes de lo que sus valores p sugieren.</w:t>
+        <w:t>cos son menos firmes de lo que sugieren sus valores p.</w:t>
       </w:r>
     </w:p>
     <w:p>
@@ -7424,7 +7128,14 @@
                 <w:b/>
                 <w:sz w:val="15"/>
               </w:rPr>
-              <w:t>* en los tres</w:t>
+              <w:t xml:space="preserve">* en los </w:t>
+            </w:r>
+            <w:r>
+              <w:rPr>
+                <w:b/>
+                <w:sz w:val="15"/>
+              </w:rPr>
+              <w:t>tres</w:t>
             </w:r>
           </w:p>
         </w:tc>
@@ -7550,22 +7261,15 @@
       </w:pPr>
       <w:r>
         <w:rPr>
-          <w:b/>
           <w:sz w:val="20"/>
         </w:rPr>
-        <w:t>El núcleo es estable frente a la especificación.</w:t>
+        <w:t xml:space="preserve">El núcleo aguanta bien el cambio de especificación. Las cuatro razones de momios siguen siendo significativas al 0,1 % en los tres modelos y varían poco: cinco milésimas en el tamaño del </w:t>
       </w:r>
       <w:r>
         <w:rPr>
           <w:sz w:val="20"/>
         </w:rPr>
-        <w:t xml:space="preserve"> Las cuatro razones de momios se mantienen significativas al 0,1 % en los tres modelos y varían poco: cinco milésimas en el tamaño del programa y dieciséis en la acreditación de carrera. La mayor variación es la de la proporción de mujeres (0,108), que en el modelo reducido baja a 0,663 porque, al no haber categóricas, absorbe parte del efecto del área del conocimiento. Que el orden y la magnitud se conserven al cambiar el criterio de selección refuerza que no se trata de un artefacto de una especificación </w:t>
-      </w:r>
-      <w:r>
-        <w:rPr>
-          <w:sz w:val="20"/>
-        </w:rPr>
-        <w:t>concreta.</w:t>
+        <w:t>programa y dieciséis en la acreditación de carrera. La mayor variación es la de la proporción de mujeres, 0,108, que en el modelo reducido baja a 0,663 porque, al no haber categóricas, absorbe parte del efecto del área del conocimiento. Que el orden y la magnitud se conserven al cambiar el criterio de selección sugiere que el resultado no es un artefacto de una especificación concreta.</w:t>
       </w:r>
     </w:p>
     <w:p>
@@ -7575,23 +7279,16 @@
       </w:pPr>
       <w:r>
         <w:rPr>
-          <w:b/>
           <w:sz w:val="20"/>
         </w:rPr>
-        <w:t>Los tres modelos coinciden en el núcleo.</w:t>
-      </w:r>
-      <w:r>
-        <w:rPr>
-          <w:sz w:val="20"/>
-        </w:rPr>
-        <w:t xml:space="preserve"> El stepwise por AIC añade cuatro variables más —proporción de técnico-profesional, duración, matrícula municipal y edad— y mejora el AIC en 24 unidades, pero empeora el BIC. El modelo reducido conserva solo las cuatro continuas. Que los tres retengan las mismas cuatro variables continuas es una corroboración de la selección hecha a priori.</w:t>
+        <w:t>Los tres modelos coinciden en el núcleo. El stepwise por AIC agrega cuatro variables (proporción de técnico-profesional, duración, matrícula municipal y edad) y mejora el AIC en 24 unidades, pero empeora el BIC. El modelo reducido se queda solo con las cuatro continuas, y que los tres retengan las mismas cuatro corrobora la selección hecha a priori.</w:t>
       </w:r>
     </w:p>
     <w:p>
       <w:pPr>
         <w:pStyle w:val="Heading2"/>
       </w:pPr>
-      <w:bookmarkStart w:id="8" w:name="_Toc243729321"/>
+      <w:bookmarkStart w:id="8" w:name="_Toc243734152"/>
       <w:r>
         <w:t>Evaluación de estabilidad mediante bootstrap</w:t>
       </w:r>
@@ -7606,20 +7303,7 @@
         <w:rPr>
           <w:sz w:val="20"/>
         </w:rPr>
-        <w:t xml:space="preserve">S2 aplicó bootstrap a estadísticos simples —medias, proporciones, correlaciones— y comprobó que sus intervalos clásicos eran fiables. Aquí la misma técnica (Efron y Tibshirani, 1993) se aplica a un objeto más complejo: </w:t>
-      </w:r>
-      <w:r>
-        <w:rPr>
-          <w:b/>
-          <w:sz w:val="20"/>
-        </w:rPr>
-        <w:t>los coeficientes del modelo final</w:t>
-      </w:r>
-      <w:r>
-        <w:rPr>
-          <w:sz w:val="20"/>
-        </w:rPr>
-        <w:t>, cuyos errores estándar dependen de supuestos asintóticos que con muestras finitas pueden fallar.</w:t>
+        <w:t>S2 aplicó bootstrap a estadísticos simples, como medias, proporciones y correlaciones, y comprobó que sus intervalos clásicos eran fiables. Aquí usamos la misma técnica (Efron y Tibshirani, 1993) sobre un objeto más complejo: los coeficientes del modelo final, cuyos errores estándar dependen de supuestos asintóticos que con muestras finitas pueden fallar.</w:t>
       </w:r>
     </w:p>
     <w:p>
@@ -7631,65 +7315,13 @@
         <w:rPr>
           <w:sz w:val="20"/>
         </w:rPr>
-        <w:t xml:space="preserve">Se ejecutan </w:t>
-      </w:r>
-      <w:r>
-        <w:rPr>
-          <w:b/>
+        <w:t>Ejecutamos dos remuestreos distintos, y la diferencia entre ambos es el resultado más informativo de este apartado. El bootstrap estándar remuestrea observaciones con reemplazo, que es el procedimiento que corresponde a la partición adoptada. El bootstrap por institución remuestrea las 164 instituciones del conjunto de entrenamiento y arrastra con ellas todos sus programas; lo presentamos como extensión y sirve para cuantificar la dependencia que S2 advirtió y que la partición estratificada no corrige. Se c</w:t>
+      </w:r>
+      <w:r>
+        <w:rPr>
           <w:sz w:val="20"/>
         </w:rPr>
-        <w:t>dos remuestreos distintos</w:t>
-      </w:r>
-      <w:r>
-        <w:rPr>
-          <w:sz w:val="20"/>
-        </w:rPr>
-        <w:t xml:space="preserve">, y la diferencia entre ambos es el resultado más informativo de este apartado. El </w:t>
-      </w:r>
-      <w:r>
-        <w:rPr>
-          <w:b/>
-          <w:sz w:val="20"/>
-        </w:rPr>
-        <w:t>bootstrap estándar</w:t>
-      </w:r>
-      <w:r>
-        <w:rPr>
-          <w:sz w:val="20"/>
-        </w:rPr>
-        <w:t xml:space="preserve"> remuestrea observaciones con reemplazo: es el procedimiento que corresponde a la partición adoptada. El </w:t>
-      </w:r>
-      <w:r>
-        <w:rPr>
-          <w:b/>
-          <w:sz w:val="20"/>
-        </w:rPr>
-        <w:t>bootstrap por institución</w:t>
-      </w:r>
-      <w:r>
-        <w:rPr>
-          <w:sz w:val="20"/>
-        </w:rPr>
-        <w:t xml:space="preserve"> remuestrea las 164 instituciones del conjunto de entrenamiento y arrastra todos sus programas: es una </w:t>
-      </w:r>
-      <w:r>
-        <w:rPr>
-          <w:b/>
-          <w:sz w:val="20"/>
-        </w:rPr>
-        <w:t>extensión</w:t>
-      </w:r>
-      <w:r>
-        <w:rPr>
-          <w:sz w:val="20"/>
-        </w:rPr>
-        <w:t xml:space="preserve">, no el análisis principal, y sirve para cuantificar la dependencia que S2 advirtió y que la partición estratificada no corrige. Se completaron </w:t>
-      </w:r>
-      <w:r>
-        <w:rPr>
-          <w:sz w:val="20"/>
-        </w:rPr>
-        <w:t>2.000 y 1.999 remuestras respectivamente.</w:t>
+        <w:t>ompletaron 2.000 y 1.999 remuestras, respectivamente.</w:t>
       </w:r>
     </w:p>
     <w:p>
@@ -8175,19 +7807,7 @@
               <w:rPr>
                 <w:sz w:val="15"/>
               </w:rPr>
-              <w:t xml:space="preserve">[−0,390 ; </w:t>
-            </w:r>
-            <w:r>
-              <w:rPr>
-                <w:sz w:val="15"/>
-              </w:rPr>
-              <w:t>−</w:t>
-            </w:r>
-            <w:r>
-              <w:rPr>
-                <w:sz w:val="15"/>
-              </w:rPr>
-              <w:t>0,266]</w:t>
+              <w:t>[−0,390 ; −0,266]</w:t>
             </w:r>
           </w:p>
         </w:tc>
@@ -8417,7 +8037,7 @@
           <w:noProof/>
         </w:rPr>
         <w:drawing>
-          <wp:inline distT="0" distB="0" distL="0" distR="0" wp14:anchorId="465E49C5" wp14:editId="2A40F7BD">
+          <wp:inline distT="0" distB="0" distL="0" distR="0" wp14:anchorId="62D7D0B0" wp14:editId="0C6DDD7C">
             <wp:extent cx="4140000" cy="1424535"/>
             <wp:effectExtent l="0" t="0" r="0" b="0"/>
             <wp:docPr id="3" name="Picture 3"/>
@@ -8463,7 +8083,8 @@
           <w:color w:val="444444"/>
           <w:sz w:val="18"/>
         </w:rPr>
-        <w:t xml:space="preserve">Figura 2: Distribuciones bootstrap de los cuatro coeficientes continuos (2.000 remuestras de observaciones). Las líneas </w:t>
+        <w:lastRenderedPageBreak/>
+        <w:t xml:space="preserve">Figura 2: </w:t>
       </w:r>
       <w:r>
         <w:rPr>
@@ -8471,7 +8092,7 @@
           <w:color w:val="444444"/>
           <w:sz w:val="18"/>
         </w:rPr>
-        <w:t>comparan el intervalo clásico, el bootstrap estándar y el bootstrap por institución.</w:t>
+        <w:t>Distribuciones bootstrap de los cuatro coeficientes continuos (2.000 remuestras de observaciones). Las líneas comparan el intervalo clásico, el bootstrap estándar y el bootstrap por institución.</w:t>
       </w:r>
     </w:p>
     <w:p>
@@ -8481,50 +8102,15 @@
       </w:pPr>
       <w:r>
         <w:rPr>
-          <w:b/>
           <w:sz w:val="20"/>
         </w:rPr>
-        <w:t>El bootstrap estándar confirma los intervalos clásicos.</w:t>
+        <w:t>El bootstrap estándar confirma los intervalos clásicos. La razón de amplitudes queda entre 1,00 y 1,12 en las cuatro variables continuas: los intervalos remuestreados reproducen casi exactamente los analíticos. Es el mismo veredicto que S2 emitió sobre medias y correlaciones, ahora extendido a los coeficientes de un modelo, y significa que los errores estándar del ajuste son fiables bajo el muestreo que la pauta supone. De los veinte coeficientes, dieciséis resultan estables y cuatro, todos categóricos, tie</w:t>
       </w:r>
       <w:r>
         <w:rPr>
           <w:sz w:val="20"/>
         </w:rPr>
-        <w:t xml:space="preserve"> La razón de amplitudes queda entre </w:t>
-      </w:r>
-      <w:r>
-        <w:rPr>
-          <w:b/>
-          <w:sz w:val="20"/>
-        </w:rPr>
-        <w:t>1,00 y 1,12</w:t>
-      </w:r>
-      <w:r>
-        <w:rPr>
-          <w:sz w:val="20"/>
-        </w:rPr>
-        <w:t xml:space="preserve"> en las cuatro variables continuas: los intervalos remuestreados reproducen casi exactamente los analíticos. Es el mismo veredicto que S2 emitió sobre medias y correlaciones, ahora extendido a los coeficientes de un modelo, y significa que </w:t>
-      </w:r>
-      <w:r>
-        <w:rPr>
-          <w:b/>
-          <w:sz w:val="20"/>
-        </w:rPr>
-        <w:t xml:space="preserve">los errores </w:t>
-      </w:r>
-      <w:r>
-        <w:rPr>
-          <w:b/>
-          <w:sz w:val="20"/>
-        </w:rPr>
-        <w:lastRenderedPageBreak/>
-        <w:t>estándar del ajuste son fiables bajo el muestreo que la pauta supone</w:t>
-      </w:r>
-      <w:r>
-        <w:rPr>
-          <w:sz w:val="20"/>
-        </w:rPr>
-        <w:t>. De los veinte coeficientes, dieciséis resultan estables y cuatro —todos categóricos— tienen intervalos que cruzan el cero.</w:t>
+        <w:t>nen intervalos que cruzan el cero.</w:t>
       </w:r>
     </w:p>
     <w:p>
@@ -8534,42 +8120,22 @@
       </w:pPr>
       <w:r>
         <w:rPr>
+          <w:sz w:val="20"/>
+        </w:rPr>
+        <w:t xml:space="preserve">El bootstrap por institución cuenta otra historia. Al remuestrear instituciones en lugar de programas, los intervalos se ensanchan </w:t>
+      </w:r>
+      <w:r>
+        <w:rPr>
           <w:b/>
           <w:sz w:val="20"/>
         </w:rPr>
-        <w:t>El bootstrap por institución cuenta otra historia.</w:t>
+        <w:t>entre 1,62 y 3,01 veces</w:t>
       </w:r>
       <w:r>
         <w:rPr>
           <w:sz w:val="20"/>
         </w:rPr>
-        <w:t xml:space="preserve"> Al remuestrear instituciones en lugar de programas, los intervalos se ensanchan </w:t>
-      </w:r>
-      <w:r>
-        <w:rPr>
-          <w:b/>
-          <w:sz w:val="20"/>
-        </w:rPr>
-        <w:t>entre 1,62 y 3,01 veces</w:t>
-      </w:r>
-      <w:r>
-        <w:rPr>
-          <w:sz w:val="20"/>
-        </w:rPr>
-        <w:t xml:space="preserve"> respecto de los clásicos, y el número de coeficientes cuyo signo deja de estar determinado sube de cuatro a </w:t>
-      </w:r>
-      <w:r>
-        <w:rPr>
-          <w:b/>
-          <w:sz w:val="20"/>
-        </w:rPr>
-        <w:t>siete de veinte</w:t>
-      </w:r>
-      <w:r>
-        <w:rPr>
-          <w:sz w:val="20"/>
-        </w:rPr>
-        <w:t>. El caso extremo es la acreditación institucional, cuyo intervalo se triplica.</w:t>
+        <w:t xml:space="preserve"> respecto de los clásicos, y los coeficientes cuyo signo deja de estar determinado pasan de cuatro a siete de veinte. El caso extremo es la acreditación institucional, cuyo intervalo se triplica.</w:t>
       </w:r>
     </w:p>
     <w:p>
@@ -8581,40 +8147,14 @@
         <w:rPr>
           <w:sz w:val="20"/>
         </w:rPr>
-        <w:t xml:space="preserve">Las dos conclusiones no se contradicen: responden a preguntas distintas. La primera dice que </w:t>
-      </w:r>
-      <w:r>
-        <w:rPr>
-          <w:b/>
-          <w:sz w:val="20"/>
-        </w:rPr>
-        <w:t>si los programas fueran independientes</w:t>
-      </w:r>
-      <w:r>
-        <w:rPr>
-          <w:sz w:val="20"/>
-        </w:rPr>
-        <w:t xml:space="preserve">, la precisión declarada sería correcta. La segunda dice que </w:t>
-      </w:r>
-      <w:r>
-        <w:rPr>
-          <w:b/>
-          <w:sz w:val="20"/>
-        </w:rPr>
-        <w:t>no lo son</w:t>
-      </w:r>
-      <w:r>
-        <w:rPr>
-          <w:sz w:val="20"/>
-        </w:rPr>
-        <w:t>, y que al tenerlo en cuenta la precisión real es entre dos y tres veces menor (Cameron et al., 2008). La dependencia entre programas de una misma institución es la fuente de incertidumbre que el ajuste clásico no ve.</w:t>
+        <w:t>Las dos conclusiones no se contradicen, porque responden a preguntas distintas. La primera dice que, si los programas fueran independientes, la precisión declarada sería correcta. La segunda dice que no lo son, y que al tenerlo en cuenta la precisión real es entre dos y tres veces menor (Cameron et al., 2008). La dependencia entre programas de una misma institución es la fuente de incertidumbre que el ajuste clásico no ve.</w:t>
       </w:r>
     </w:p>
     <w:p>
       <w:pPr>
         <w:pStyle w:val="Heading2"/>
       </w:pPr>
-      <w:bookmarkStart w:id="9" w:name="_Toc243729322"/>
+      <w:bookmarkStart w:id="9" w:name="_Toc243734153"/>
       <w:r>
         <w:t>Diagnóstico de supuestos</w:t>
       </w:r>
@@ -8952,7 +8492,14 @@
                 <w:b/>
                 <w:sz w:val="15"/>
               </w:rPr>
-              <w:t>No lineal</w:t>
+              <w:t xml:space="preserve">No </w:t>
+            </w:r>
+            <w:r>
+              <w:rPr>
+                <w:b/>
+                <w:sz w:val="15"/>
+              </w:rPr>
+              <w:t>lineal</w:t>
             </w:r>
           </w:p>
         </w:tc>
@@ -9156,23 +8703,15 @@
       </w:pPr>
       <w:r>
         <w:rPr>
-          <w:b/>
           <w:sz w:val="20"/>
         </w:rPr>
-        <w:t xml:space="preserve">La </w:t>
-      </w:r>
-      <w:r>
-        <w:rPr>
-          <w:b/>
+        <w:t xml:space="preserve">La colinealidad no nos da problemas. Los cuatro factores de inflación de varianza quedan por debajo de 1,21, muy lejos del umbral de alarma de 5: cada </w:t>
+      </w:r>
+      <w:r>
+        <w:rPr>
           <w:sz w:val="20"/>
         </w:rPr>
-        <w:t>colinealidad no es un problema.</w:t>
-      </w:r>
-      <w:r>
-        <w:rPr>
-          <w:sz w:val="20"/>
-        </w:rPr>
-        <w:t xml:space="preserve"> Los cuatro factores de inflación de varianza quedan por debajo de 1,21, muy lejos del umbral de alarma de 5: cada variable aporta información propia y los coeficientes de la Tabla 6 pueden leerse por separado.</w:t>
+        <w:t>variable aporta información propia y los coeficientes de la Tabla 6 se pueden leer por separado.</w:t>
       </w:r>
     </w:p>
     <w:p>
@@ -9182,35 +8721,15 @@
       </w:pPr>
       <w:r>
         <w:rPr>
-          <w:b/>
           <w:sz w:val="20"/>
         </w:rPr>
-        <w:t>La linealidad en el logit sí se incumple.</w:t>
+        <w:t xml:space="preserve">La linealidad en el logit sí se incumple. La prueba de Box-Tidwell (1962) rechaza la hipótesis en tres de las cuatro variables continuas, y solo el tamaño del programa la satisface. El efecto de la acreditación sobre el logaritmo de la razón de momios no es constante a lo largo de su rango, lo que significa que el modelo lineal es una aproximación y que los OR de la Tabla 6 hay que leerlos como efectos promedio, no uniformes. Corregirlo pediría términos polinómicos o una discretización por tramos (Harrell, </w:t>
       </w:r>
       <w:r>
         <w:rPr>
           <w:sz w:val="20"/>
         </w:rPr>
-        <w:t xml:space="preserve"> La prueba de Box-Tidwell (1962) rechaza la hipótesis de linealidad en tres de las cuatro variables continuas; solo el tamaño del programa la satisface. El efecto de la acreditación sobre el logaritmo de la razón de momios no es constante a lo largo de su rango, lo que significa que </w:t>
-      </w:r>
-      <w:r>
-        <w:rPr>
-          <w:b/>
-          <w:sz w:val="20"/>
-        </w:rPr>
-        <w:t>el modelo lineal es una aproximación</w:t>
-      </w:r>
-      <w:r>
-        <w:rPr>
-          <w:sz w:val="20"/>
-        </w:rPr>
-        <w:t xml:space="preserve"> y que los OR de la Tabla 6 deben leerse como efectos promedio, no uniformes. Corregirlo exigiría términos polinómicos o una discretización por tramos (Harrell, 2015), y queda señalado como la</w:t>
-      </w:r>
-      <w:r>
-        <w:rPr>
-          <w:sz w:val="20"/>
-        </w:rPr>
-        <w:t xml:space="preserve"> mejora más concreta para un trabajo posterior.</w:t>
+        <w:t>2015), y lo dejamos señalado como la mejora más concreta para un trabajo posterior.</w:t>
       </w:r>
     </w:p>
     <w:p>
@@ -9220,48 +8739,15 @@
       </w:pPr>
       <w:r>
         <w:rPr>
-          <w:b/>
           <w:sz w:val="20"/>
         </w:rPr>
-        <w:t>Las observaciones influyentes merecen cautela.</w:t>
+        <w:t>Las observaciones influyentes piden más cautela. Ninguna domina el ajuste por sí sola: la distancia de Cook máxima es 0,0095, dos órdenes de magnitud por debajo del umbral habitual de 1 (Cook, 1977), y solo 28 de 6.774 observaciones tienen residuos de Pearson con |r| &gt; 3. Pero retirar en bloque las 237 que superan el criterio 4/n cambia el coeficiente de la acreditación institucional en un 87,7 %, y los del tamaño y la proporción de mujeres en un 25,0 % y un 22,1 %, mientras el de la acreditación de carrera</w:t>
       </w:r>
       <w:r>
         <w:rPr>
           <w:sz w:val="20"/>
         </w:rPr>
-        <w:t xml:space="preserve"> Ninguna domina el ajuste por sí sola: la distancia de Cook máxima es 0,0095, dos órdenes de magnitud por debajo del umbral habitual de 1 (Cook, 1977), y solo 28 de 6.774 observaciones presentan residuos de Pearson con |r| &gt; 3. Pero retirar en bloque las </w:t>
-      </w:r>
-      <w:r>
-        <w:rPr>
-          <w:b/>
-          <w:sz w:val="20"/>
-        </w:rPr>
-        <w:t>237</w:t>
-      </w:r>
-      <w:r>
-        <w:rPr>
-          <w:sz w:val="20"/>
-        </w:rPr>
-        <w:t xml:space="preserve"> que superan el criterio 4/n </w:t>
-      </w:r>
-      <w:r>
-        <w:rPr>
-          <w:b/>
-          <w:sz w:val="20"/>
-        </w:rPr>
-        <w:t>cambia el coeficiente de la acreditación institucional en un 87,7 %</w:t>
-      </w:r>
-      <w:r>
-        <w:rPr>
-          <w:sz w:val="20"/>
-        </w:rPr>
-        <w:t xml:space="preserve">, y los del tamaño y la proporción de mujeres en un 25,0 % y un 22,1 % (el de la acreditación de carrera, apenas un 3,6 %). No hay contradicción: el conjunto </w:t>
-      </w:r>
-      <w:r>
-        <w:rPr>
-          <w:sz w:val="20"/>
-        </w:rPr>
-        <w:t>de puntos influyentes tira en una misma dirección aunque ninguno pese mucho por separado.</w:t>
+        <w:t xml:space="preserve"> se mueve apenas un 3,6 %. No hay contradicción: el conjunto de puntos influyentes tira en una misma dirección, aunque ninguno pese mucho por separado.</w:t>
       </w:r>
     </w:p>
     <w:p>
@@ -9271,36 +8757,22 @@
       </w:pPr>
       <w:r>
         <w:rPr>
-          <w:b/>
           <w:sz w:val="20"/>
         </w:rPr>
-        <w:t>El coeficiente de la acreditación institucional es el menos firme de los cuatro</w:t>
+        <w:t>De los cuatro coeficientes, el de la acreditación institucional es el menos firme, y eso calza con que su intervalo sea también el que más se ensancha al remuestrear por institución, con una razón de 3,01. Es a la vez la variable de mayor efecto puntual y la de menor solidez, y cualquier recomendación de política que se apoye en ella debería decirlo. Conservamos todas las observaciones, por coherencia con lo que S2 decidió sobre los extremos, pero dejamos declarada la inestabilidad. La calibración, en cambi</w:t>
       </w:r>
       <w:r>
         <w:rPr>
           <w:sz w:val="20"/>
         </w:rPr>
-        <w:t xml:space="preserve">, lo que concuerda con que su intervalo sea también el que más se ensancha al remuestrear por institución (razón 3,01). Es, a la vez, la variable de mayor efecto puntual y la de menor solidez, y cualquier recomendación de política que se apoye en ella debería decirlo. Se conservan todas las observaciones, por coherencia con la decisión de S2 sobre los extremos, pero la inestabilidad se declara. </w:t>
-      </w:r>
-      <w:r>
-        <w:rPr>
-          <w:b/>
-          <w:sz w:val="20"/>
-        </w:rPr>
-        <w:t>La calibración es buena</w:t>
-      </w:r>
-      <w:r>
-        <w:rPr>
-          <w:sz w:val="20"/>
-        </w:rPr>
-        <w:t>: la probabilidad predicha sigue de cerca la frecuencia observada por deciles.</w:t>
+        <w:t>o, es buena: la probabilidad predicha sigue de cerca la frecuencia observada por deciles.</w:t>
       </w:r>
     </w:p>
     <w:p>
       <w:pPr>
         <w:pStyle w:val="Heading2"/>
       </w:pPr>
-      <w:bookmarkStart w:id="10" w:name="_Toc243729323"/>
+      <w:bookmarkStart w:id="10" w:name="_Toc243734154"/>
       <w:r>
         <w:t>Evaluación de desempeño predictivo</w:t>
       </w:r>
@@ -9315,20 +8787,7 @@
         <w:rPr>
           <w:sz w:val="20"/>
         </w:rPr>
-        <w:t xml:space="preserve">La comparación obligada no es entre modelos sino </w:t>
-      </w:r>
-      <w:r>
-        <w:rPr>
-          <w:b/>
-          <w:sz w:val="20"/>
-        </w:rPr>
-        <w:t>contra la línea base</w:t>
-      </w:r>
-      <w:r>
-        <w:rPr>
-          <w:sz w:val="20"/>
-        </w:rPr>
-        <w:t>: el clasificador trivial que predice siempre la clase mayoritaria. Sin esa referencia una exactitud de 0,68 no significa nada, porque en un conjunto donde el 54,9 % pertenece a una clase, acertar la mitad de las veces es gratis.</w:t>
+        <w:t>La comparación obligada no es entre modelos, sino contra la línea base: el clasificador trivial que predice siempre la clase mayoritaria. Sin esa referencia, una exactitud de 0,68 no significa nada, porque en un conjunto donde el 54,9 % pertenece a una clase, acertar la mitad de las veces es gratis.</w:t>
       </w:r>
     </w:p>
     <w:p>
@@ -9928,13 +9387,7 @@
               <w:rPr>
                 <w:sz w:val="15"/>
               </w:rPr>
-              <w:t xml:space="preserve">M3 — </w:t>
-            </w:r>
-            <w:r>
-              <w:rPr>
-                <w:sz w:val="15"/>
-              </w:rPr>
-              <w:t>reducida</w:t>
+              <w:t>M3 — reducida</w:t>
             </w:r>
           </w:p>
         </w:tc>
@@ -10053,7 +9506,7 @@
         </w:rPr>
         <w:lastRenderedPageBreak/>
         <w:drawing>
-          <wp:inline distT="0" distB="0" distL="0" distR="0" wp14:anchorId="196CDA17" wp14:editId="7FF76251">
+          <wp:inline distT="0" distB="0" distL="0" distR="0" wp14:anchorId="6DD6A6F3" wp14:editId="5ECFAE5D">
             <wp:extent cx="4140000" cy="1226884"/>
             <wp:effectExtent l="0" t="0" r="0" b="0"/>
             <wp:docPr id="4" name="Picture 4"/>
@@ -10099,7 +9552,15 @@
           <w:color w:val="444444"/>
           <w:sz w:val="18"/>
         </w:rPr>
-        <w:t>Figura 3: Matrices de confusión en prueba y curvas ROC de los tres modelos.</w:t>
+        <w:t xml:space="preserve">Figura 3: Matrices de confusión en prueba y </w:t>
+      </w:r>
+      <w:r>
+        <w:rPr>
+          <w:i/>
+          <w:color w:val="444444"/>
+          <w:sz w:val="18"/>
+        </w:rPr>
+        <w:t>curvas ROC de los tres modelos.</w:t>
       </w:r>
     </w:p>
     <w:p>
@@ -10109,87 +9570,15 @@
       </w:pPr>
       <w:r>
         <w:rPr>
-          <w:b/>
           <w:sz w:val="20"/>
         </w:rPr>
-        <w:t>La ganancia sobre la línea base no es uniforme entre métricas, y conviene decirlo.</w:t>
+        <w:t>La ganancia sobre la línea base no es uniforme entre métricas. El clasificador trivial acierta el 54,9 % y obtiene un F1 de 0,709, porque su sensibilidad es 1 por construcción. Frente a eso, M1 sube la exactitud 12,9 puntos y el AUC de 0,500 a 0,730, pero su F1 solo mejora en 0,011. Lo que el modelo aporta es capacidad de discriminación, que es lo que mide el AUC y la línea base no tiene en absoluto, más que mejora del F1, que el clasificador trivial ya infla a base de sensibilidad perfecta. El modelo reduc</w:t>
       </w:r>
       <w:r>
         <w:rPr>
           <w:sz w:val="20"/>
         </w:rPr>
-        <w:t xml:space="preserve"> El clasificador trivial acierta el 54,9 % y obtiene un </w:t>
-      </w:r>
-      <w:r>
-        <w:rPr>
-          <w:b/>
-          <w:sz w:val="20"/>
-        </w:rPr>
-        <w:t>F1 de 0,709</w:t>
-      </w:r>
-      <w:r>
-        <w:rPr>
-          <w:sz w:val="20"/>
-        </w:rPr>
-        <w:t xml:space="preserve">, porque su sensibilidad es 1 por construcción. Frente a eso, M1 sube la exactitud </w:t>
-      </w:r>
-      <w:r>
-        <w:rPr>
-          <w:b/>
-          <w:sz w:val="20"/>
-        </w:rPr>
-        <w:t>12,9 puntos</w:t>
-      </w:r>
-      <w:r>
-        <w:rPr>
-          <w:sz w:val="20"/>
-        </w:rPr>
-        <w:t xml:space="preserve"> y el AUC de 0,500 a 0,730, pero su F1 solo mejora en </w:t>
-      </w:r>
-      <w:r>
-        <w:rPr>
-          <w:b/>
-          <w:sz w:val="20"/>
-        </w:rPr>
-        <w:t>0,011</w:t>
-      </w:r>
-      <w:r>
-        <w:rPr>
-          <w:sz w:val="20"/>
-        </w:rPr>
-        <w:t xml:space="preserve">. La lectura correcta es que el modelo aporta capacidad de </w:t>
-      </w:r>
-      <w:r>
-        <w:rPr>
-          <w:b/>
-          <w:sz w:val="20"/>
-        </w:rPr>
-        <w:t>discriminación</w:t>
-      </w:r>
-      <w:r>
-        <w:rPr>
-          <w:sz w:val="20"/>
-        </w:rPr>
-        <w:t xml:space="preserve"> —que es lo que el AUC mide y la línea base no tiene en absoluto— más que mejora del F1, que el clasificador trivial ya infla a base de sensibilidad perfecta. El modelo reducido queda incluso </w:t>
-      </w:r>
-      <w:r>
-        <w:rPr>
-          <w:b/>
-          <w:sz w:val="20"/>
-        </w:rPr>
-        <w:t>por debajo</w:t>
-      </w:r>
-      <w:r>
-        <w:rPr>
-          <w:sz w:val="20"/>
-        </w:rPr>
-        <w:t xml:space="preserve"> de la línea base</w:t>
-      </w:r>
-      <w:r>
-        <w:rPr>
-          <w:sz w:val="20"/>
-        </w:rPr>
-        <w:t xml:space="preserve"> en F1 (0,704 frente a 0,709) pese a un AUC de 0,712.</w:t>
+        <w:t>ido queda incluso por debajo de la línea base en F1, con 0,704 frente a 0,709, pese a un AUC de 0,712.</w:t>
       </w:r>
     </w:p>
     <w:p>
@@ -10199,16 +9588,15 @@
       </w:pPr>
       <w:r>
         <w:rPr>
-          <w:b/>
           <w:sz w:val="20"/>
         </w:rPr>
-        <w:t>No hay sobreajuste.</w:t>
+        <w:t xml:space="preserve">Sobreajuste no hay. La brecha de AUC entre entrenamiento y prueba es de +0,010 en M1, +0,011 en M2 y +0,013 en M3: </w:t>
       </w:r>
       <w:r>
         <w:rPr>
           <w:sz w:val="20"/>
         </w:rPr>
-        <w:t xml:space="preserve"> La brecha de AUC entre entrenamiento y prueba es de +0,010 en M1, +0,011 en M2 y +0,013 en M3: diferencias pequeñas y del signo esperable.</w:t>
+        <w:t>diferencias pequeñas y del signo esperable.</w:t>
       </w:r>
     </w:p>
     <w:p>
@@ -10218,29 +9606,9 @@
       </w:pPr>
       <w:r>
         <w:rPr>
-          <w:b/>
           <w:sz w:val="20"/>
         </w:rPr>
-        <w:t>Ponderación de clase.</w:t>
-      </w:r>
-      <w:r>
-        <w:rPr>
-          <w:sz w:val="20"/>
-        </w:rPr>
-        <w:t xml:space="preserve"> La pauta pide incorporarla para mejorar el recall, y el resultado obliga a una precisión. La ponderación equilibrada reduce el peso de la clase mayoritaria; el recetario habitual supone que la clase positiva es la </w:t>
-      </w:r>
-      <w:r>
-        <w:rPr>
-          <w:b/>
-          <w:sz w:val="20"/>
-        </w:rPr>
-        <w:t>minoritaria</w:t>
-      </w:r>
-      <w:r>
-        <w:rPr>
-          <w:sz w:val="20"/>
-        </w:rPr>
-        <w:t>, y aquí ocurre lo contrario: abandono alto es la mayoritaria con un 54,9 %. Los pesos quedan en 0,910 y 1,110, una razón de apenas 1,22, y el efecto se invierte.</w:t>
+        <w:t>Sobre la ponderación de clase hay que hacer una aclaración. La pauta pide incorporarla para mejorar el recall y en este conjunto el resultado va al revés. La ponderación equilibrada reduce el peso de la clase mayoritaria, y el recetario habitual da por hecho que la clase positiva es la minoritaria; acá pasa lo contrario, porque abandono alto es la mayoritaria con un 54,9 %. Los pesos quedan en 0,910 y 1,110, una razón de apenas 1,22, y el efecto se invierte.</w:t>
       </w:r>
     </w:p>
     <w:p>
@@ -10845,13 +10213,7 @@
               <w:rPr>
                 <w:sz w:val="15"/>
               </w:rPr>
-              <w:t xml:space="preserve">Sin </w:t>
-            </w:r>
-            <w:r>
-              <w:rPr>
-                <w:sz w:val="15"/>
-              </w:rPr>
-              <w:t>ponderar, umbral de Youden 0,508</w:t>
+              <w:t>Sin ponderar, umbral de Youden 0,508</w:t>
             </w:r>
           </w:p>
         </w:tc>
@@ -11104,22 +10466,15 @@
       </w:pPr>
       <w:r>
         <w:rPr>
-          <w:b/>
           <w:sz w:val="20"/>
         </w:rPr>
-        <w:t>La ponderación baja la sensibilidad casi ocho puntos</w:t>
+        <w:t xml:space="preserve">La ponderación baja la sensibilidad casi ocho puntos, de 0,754 a 0,674, y sube la especificidad de 0,587 a 0,652. El AUC no se mueve, 0,7301 frente a 0,7300, lo que </w:t>
       </w:r>
       <w:r>
         <w:rPr>
           <w:sz w:val="20"/>
         </w:rPr>
-        <w:t xml:space="preserve">, de 0,754 a 0,674, y sube la especificidad de 0,587 a 0,652. El </w:t>
-      </w:r>
-      <w:r>
-        <w:rPr>
-          <w:sz w:val="20"/>
-        </w:rPr>
-        <w:t>AUC no se mueve (0,7301 frente a 0,7300), lo que confirma la interpretación: la ponderación no altera el orden en que el modelo clasifica los programas, solo desplaza el corte efectivo. El umbral de Youden tampoco aporta, porque sale en 0,508, prácticamente el 0,50 de partida: con las clases casi equilibradas no hay un corte oculto que mejore ambas métricas a la vez.</w:t>
+        <w:t>confirma la lectura: la ponderación no altera el orden en que el modelo clasifica los programas, solo desplaza el corte efectivo. El umbral de Youden tampoco aporta nada, porque sale en 0,508, prácticamente el 0,50 de partida; con las clases casi equilibradas no hay un corte oculto que mejore las dos métricas a la vez.</w:t>
       </w:r>
     </w:p>
     <w:p>
@@ -11129,56 +10484,22 @@
       </w:pPr>
       <w:r>
         <w:rPr>
+          <w:sz w:val="20"/>
+        </w:rPr>
+        <w:t>La palanca que sí sube el recall es bajar el umbral. Con 0,418 la sensibilidad llega a 0,850, al precio de 13,1 puntos de especificidad y 3,4 de precisión. Para el uso que tenemos en mente el intercambio es favorable, porque omitir un programa en riesgo cuesta más que revisar uno sano. Y hay un argumento que no depende de esa preferencia: esa configuración consigue el mejor F1 de todas, 0,740, frente a 0,720 del umbral 0,50 y 0,709 de la línea base. Al umbral por defecto el modelo apenas le gana al clasific</w:t>
+      </w:r>
+      <w:r>
+        <w:rPr>
+          <w:sz w:val="20"/>
+        </w:rPr>
+        <w:t xml:space="preserve">ador trivial en F1; al 0,418 le gana con holgura. </w:t>
+      </w:r>
+      <w:r>
+        <w:rPr>
           <w:b/>
           <w:sz w:val="20"/>
         </w:rPr>
-        <w:t>La palanca que sí sube el recall es bajar el umbral.</w:t>
-      </w:r>
-      <w:r>
-        <w:rPr>
-          <w:sz w:val="20"/>
-        </w:rPr>
-        <w:t xml:space="preserve"> Con 0,418 la sensibilidad alcanza </w:t>
-      </w:r>
-      <w:r>
-        <w:rPr>
-          <w:b/>
-          <w:sz w:val="20"/>
-        </w:rPr>
-        <w:t>0,850</w:t>
-      </w:r>
-      <w:r>
-        <w:rPr>
-          <w:sz w:val="20"/>
-        </w:rPr>
-        <w:t xml:space="preserve">, al precio de 13,1 puntos de especificidad y 3,4 de precisión. Para el uso previsto ese intercambio es favorable, porque omitir un programa en riesgo cuesta más que revisar uno sano. Y hay un argumento que no depende de esa preferencia: </w:t>
-      </w:r>
-      <w:r>
-        <w:rPr>
-          <w:b/>
-          <w:sz w:val="20"/>
-        </w:rPr>
-        <w:t>esa configuración obtiene el mejor F1 de todas (0,740)</w:t>
-      </w:r>
-      <w:r>
-        <w:rPr>
-          <w:sz w:val="20"/>
-        </w:rPr>
-        <w:t xml:space="preserve">, frente a 0,720 del umbral 0,50 y 0,709 de la línea base. Al umbral por defecto el modelo apenas supera al clasificador trivial en F1; al 0,418 lo supera con holgura. </w:t>
-      </w:r>
-      <w:r>
-        <w:rPr>
-          <w:b/>
-          <w:sz w:val="20"/>
-        </w:rPr>
-        <w:t xml:space="preserve">La elección </w:t>
-      </w:r>
-      <w:r>
-        <w:rPr>
-          <w:b/>
-          <w:sz w:val="20"/>
-        </w:rPr>
-        <w:t>del umbral pesa aquí más que la ponderación y más que la elección entre los tres modelos.</w:t>
+        <w:t>En este problema, elegir el umbral pesa más que ponderar y más que elegir entre los tres modelos.</w:t>
       </w:r>
     </w:p>
     <w:p>
@@ -11188,68 +10509,22 @@
       </w:pPr>
       <w:r>
         <w:rPr>
-          <w:b/>
           <w:sz w:val="20"/>
         </w:rPr>
-        <w:t>Selección del modelo final: M1, el modelo de dominio.</w:t>
+        <w:t xml:space="preserve">Para el modelo final nos quedamos con M1, el de dominio. Las diferencias entre los tres son pequeñas, con AUC de 0,712 a 0,733, así que la decisión no se juega en el desempeño. Pesó, primero, que M1 no fue seleccionado con estos datos: lo especificamos a partir de S1 y S2 antes de mirar el conjunto de entrenamiento, mientras que M2 se eligió sobre los mismos datos con los que después se ajusta, de modo que su ventaja de tres milésimas de AUC está sesgada al alza por el propio proceso de selección (Harrell, </w:t>
       </w:r>
       <w:r>
         <w:rPr>
           <w:sz w:val="20"/>
         </w:rPr>
-        <w:t xml:space="preserve"> Las diferencias entre los tres son pequeñas, con AUC de 0,712 a 0,733. Se adopta M1 por tres razones. Primera, </w:t>
-      </w:r>
-      <w:r>
-        <w:rPr>
-          <w:b/>
-          <w:sz w:val="20"/>
-        </w:rPr>
-        <w:t>no fue seleccionado con estos datos</w:t>
-      </w:r>
-      <w:r>
-        <w:rPr>
-          <w:sz w:val="20"/>
-        </w:rPr>
-        <w:t xml:space="preserve">: se especificó a partir de S1 y S2 antes de observar el conjunto de entrenamiento, mientras que M2 se eligió sobre los mismos datos con los que después se ajusta, de modo que su ventaja de tres milésimas de AUC está sesgada al alza por el propio proceso de selección (Harrell, 2015). Segunda, </w:t>
-      </w:r>
-      <w:r>
-        <w:rPr>
-          <w:b/>
-          <w:sz w:val="20"/>
-        </w:rPr>
-        <w:t>cada variable tiene una justificación documentada</w:t>
-      </w:r>
-      <w:r>
-        <w:rPr>
-          <w:sz w:val="20"/>
-        </w:rPr>
-        <w:t>, recogida en la Tabla</w:t>
-      </w:r>
-      <w:r>
-        <w:rPr>
-          <w:sz w:val="20"/>
-        </w:rPr>
-        <w:t xml:space="preserve"> 5. Tercera, </w:t>
-      </w:r>
-      <w:r>
-        <w:rPr>
-          <w:b/>
-          <w:sz w:val="20"/>
-        </w:rPr>
-        <w:t>M3 es demasiado austero</w:t>
-      </w:r>
-      <w:r>
-        <w:rPr>
-          <w:sz w:val="20"/>
-        </w:rPr>
-        <w:t>: prescindir de las categóricas cuesta dos centésimas de AUC y lo deja bajo la línea base en F1, sin ganar interpretabilidad, porque las cuatro continuas se mantienen en los tres modelos.</w:t>
+        <w:t>2015). Segundo, que cada variable tiene una justificación documentada, la de la Tabla 5. Y tercero, que M3 resulta demasiado austero: prescindir de las categóricas cuesta dos centésimas de AUC y lo deja bajo la línea base en F1, sin ganar interpretabilidad.</w:t>
       </w:r>
     </w:p>
     <w:p>
       <w:pPr>
         <w:pStyle w:val="Heading1"/>
       </w:pPr>
-      <w:bookmarkStart w:id="11" w:name="_Toc243729324"/>
+      <w:bookmarkStart w:id="11" w:name="_Toc243734155"/>
       <w:r>
         <w:t>Análisis comparativo del impacto de la imputación</w:t>
       </w:r>
@@ -11264,33 +10539,7 @@
         <w:rPr>
           <w:sz w:val="20"/>
         </w:rPr>
-        <w:t xml:space="preserve">La decisión del apartado 1.3 se somete a prueba ajustando </w:t>
-      </w:r>
-      <w:r>
-        <w:rPr>
-          <w:b/>
-          <w:sz w:val="20"/>
-        </w:rPr>
-        <w:t>el mismo modelo final sobre los tres conjuntos</w:t>
-      </w:r>
-      <w:r>
-        <w:rPr>
-          <w:sz w:val="20"/>
-        </w:rPr>
-        <w:t xml:space="preserve">, con la misma partición 70/30 estratificada. La pregunta no es cuál rinde mejor, sino si la elección de la estrategia </w:t>
-      </w:r>
-      <w:r>
-        <w:rPr>
-          <w:b/>
-          <w:sz w:val="20"/>
-        </w:rPr>
-        <w:t>modifica las conclusiones</w:t>
-      </w:r>
-      <w:r>
-        <w:rPr>
-          <w:sz w:val="20"/>
-        </w:rPr>
-        <w:t>.</w:t>
+        <w:t>La decisión del apartado 1.3 se pone a prueba ajustando el mismo modelo final sobre los tres conjuntos, con la misma partición 70/30 estratificada. La pregunta no es cuál rinde mejor, sino si la elección de la estrategia modifica las conclusiones.</w:t>
       </w:r>
     </w:p>
     <w:p>
@@ -11475,14 +10724,7 @@
                 <w:b/>
                 <w:sz w:val="15"/>
               </w:rPr>
-              <w:t xml:space="preserve">coef </w:t>
-            </w:r>
-            <w:r>
-              <w:rPr>
-                <w:b/>
-                <w:sz w:val="15"/>
-              </w:rPr>
-              <w:t>inst_acreditada</w:t>
+              <w:t>coef inst_acreditada</w:t>
             </w:r>
           </w:p>
         </w:tc>
@@ -11973,36 +11215,15 @@
       </w:pPr>
       <w:r>
         <w:rPr>
-          <w:b/>
           <w:sz w:val="20"/>
         </w:rPr>
-        <w:t xml:space="preserve">Las </w:t>
-      </w:r>
-      <w:r>
-        <w:rPr>
-          <w:b/>
+        <w:t xml:space="preserve">Las conclusiones del modelo no cambian. El signo de los cuatro </w:t>
+      </w:r>
+      <w:r>
+        <w:rPr>
           <w:sz w:val="20"/>
         </w:rPr>
-        <w:t>conclusiones del modelo no cambian.</w:t>
-      </w:r>
-      <w:r>
-        <w:rPr>
-          <w:sz w:val="20"/>
-        </w:rPr>
-        <w:t xml:space="preserve"> El signo de los cuatro coeficientes se mantiene en los tres conjuntos y su orden de importancia apenas se altera: la acreditación institucional encabeza en los tres. En ese sentido el análisis es </w:t>
-      </w:r>
-      <w:r>
-        <w:rPr>
-          <w:b/>
-          <w:sz w:val="20"/>
-        </w:rPr>
-        <w:t>robusto frente a la estrategia de imputación</w:t>
-      </w:r>
-      <w:r>
-        <w:rPr>
-          <w:sz w:val="20"/>
-        </w:rPr>
-        <w:t>, que es la conclusión que la pauta pide verificar.</w:t>
+        <w:t>coeficientes se mantiene en los tres conjuntos y su orden de importancia casi no se altera, con la acreditación institucional encabezando en los tres. En ese sentido el análisis es robusto frente a la estrategia de imputación, que es justamente lo que la pauta pide verificar.</w:t>
       </w:r>
     </w:p>
     <w:p>
@@ -12012,29 +11233,22 @@
       </w:pPr>
       <w:r>
         <w:rPr>
+          <w:sz w:val="20"/>
+        </w:rPr>
+        <w:t xml:space="preserve">La precisión sí cambia, y de manera sistemática. La eliminación produce intervalos un 50 % más anchos en promedio, 0,199 frente a 0,132 y 0,133, simplemente porque trabaja con menos de la mitad de los datos: paga la limpieza con incertidumbre. Y hay un punto que la tabla deja a la vista: </w:t>
+      </w:r>
+      <w:r>
+        <w:rPr>
           <w:b/>
           <w:sz w:val="20"/>
         </w:rPr>
-        <w:t>La precisión sí cambia, y de forma sistemática.</w:t>
+        <w:t>las dos imputaciones producen intervalos casi idénticos entre sí</w:t>
       </w:r>
       <w:r>
         <w:rPr>
           <w:sz w:val="20"/>
         </w:rPr>
-        <w:t xml:space="preserve"> La eliminación produce intervalos un 50 % más anchos en promedio (0,199 frente a 0,132 y 0,133), simplemente porque trabaja con menos de la mitad de los datos: paga la limpieza con incertidumbre. Y conviene subrayar un punto que la tabla hace evidente: </w:t>
-      </w:r>
-      <w:r>
-        <w:rPr>
-          <w:b/>
-          <w:sz w:val="20"/>
-        </w:rPr>
-        <w:t>las dos imputaciones producen intervalos casi idénticos entre sí</w:t>
-      </w:r>
-      <w:r>
-        <w:rPr>
-          <w:sz w:val="20"/>
-        </w:rPr>
-        <w:t>, porque ambas devuelven n = 9.678. El estrechamiento no premia la calidad de la imputación, solo el tamaño de muestra recuperado.</w:t>
+        <w:t>, porque ambas devuelven n = 9.678. El estrechamiento no premia la calidad de la imputación, solo el tamaño de muestra que se recupera.</w:t>
       </w:r>
     </w:p>
     <w:p>
@@ -12046,33 +11260,7 @@
         <w:rPr>
           <w:sz w:val="20"/>
         </w:rPr>
-        <w:t xml:space="preserve">De ahí la limitación más importante de esta parte. </w:t>
-      </w:r>
-      <w:r>
-        <w:rPr>
-          <w:b/>
-          <w:sz w:val="20"/>
-        </w:rPr>
-        <w:t>Ninguna de las dos imputaciones propaga la incertidumbre de haber imputado</w:t>
-      </w:r>
-      <w:r>
-        <w:rPr>
-          <w:sz w:val="20"/>
-        </w:rPr>
-        <w:t xml:space="preserve">: ambas tratan un valor predicho como si fuera observado, y por eso sus intervalos son demasiado estrechos aunque coincidan entre sí. Corregirlo exige </w:t>
-      </w:r>
-      <w:r>
-        <w:rPr>
-          <w:b/>
-          <w:sz w:val="20"/>
-        </w:rPr>
-        <w:t>imputación múltiple</w:t>
-      </w:r>
-      <w:r>
-        <w:rPr>
-          <w:sz w:val="20"/>
-        </w:rPr>
-        <w:t xml:space="preserve"> con las reglas de combinación de Rubin (Little y Rubin, 2019), que excede el alcance de esta fase y queda como la extensión natural del trabajo.</w:t>
+        <w:t>De ahí sale la limitación más importante de esta parte. Ninguna de las dos imputaciones propaga la incertidumbre de haber imputado: las dos tratan un valor predicho como si fuera observado, y por eso sus intervalos quedan demasiado estrechos aunque coincidan entre sí. Corregirlo exige imputación múltiple con las reglas de combinación de Rubin (Little y Rubin, 2019), que se sale del alcance de esta fase y queda como la extensión natural del trabajo.</w:t>
       </w:r>
     </w:p>
     <w:p>
@@ -12082,49 +11270,15 @@
       </w:pPr>
       <w:r>
         <w:rPr>
-          <w:b/>
           <w:sz w:val="20"/>
         </w:rPr>
-        <w:t xml:space="preserve">Un </w:t>
-      </w:r>
-      <w:r>
-        <w:rPr>
-          <w:b/>
+        <w:t xml:space="preserve">Un detalle que no habría que malinterpretar. La </w:t>
+      </w:r>
+      <w:r>
+        <w:rPr>
           <w:sz w:val="20"/>
         </w:rPr>
-        <w:t>detalle que no debe malinterpretarse.</w:t>
-      </w:r>
-      <w:r>
-        <w:rPr>
-          <w:sz w:val="20"/>
-        </w:rPr>
-        <w:t xml:space="preserve"> La eliminación obtiene el AUC de prueba más alto (0,757 frente a 0,730), pero ese número </w:t>
-      </w:r>
-      <w:r>
-        <w:rPr>
-          <w:b/>
-          <w:sz w:val="20"/>
-        </w:rPr>
-        <w:t>no es comparable</w:t>
-      </w:r>
-      <w:r>
-        <w:rPr>
-          <w:sz w:val="20"/>
-        </w:rPr>
-        <w:t xml:space="preserve"> con los otros dos: su conjunto de prueba es distinto y más pequeño, porque la eliminación descartó filas antes de particionar. Un AUC mayor sobre un conjunto más fácil y menos representativo no indica un mejor modelo. Entre las dos imputaciones, que sí son comparables, </w:t>
-      </w:r>
-      <w:r>
-        <w:rPr>
-          <w:b/>
-          <w:sz w:val="20"/>
-        </w:rPr>
-        <w:t>la regresión supera a la mediana</w:t>
-      </w:r>
-      <w:r>
-        <w:rPr>
-          <w:sz w:val="20"/>
-        </w:rPr>
-        <w:t xml:space="preserve"> en exactitud (0,678 frente a 0,673) y en F1 (0,720 frente a 0,716).</w:t>
+        <w:t>eliminación obtiene el AUC de prueba más alto, 0,757 frente a 0,730, pero ese número no es comparable con los otros dos: su conjunto de prueba es distinto y más pequeño, porque descartó filas antes de particionar, y un AUC mayor sobre un conjunto más fácil y menos representativo no indica un mejor modelo. Entre las dos imputaciones, que sí son comparables, la regresión supera a la mediana en exactitud, 0,678 frente a 0,673, y en F1, 0,720 frente a 0,716.</w:t>
       </w:r>
     </w:p>
     <w:p>
@@ -12134,82 +11288,22 @@
       </w:pPr>
       <w:r>
         <w:rPr>
-          <w:b/>
           <w:sz w:val="20"/>
         </w:rPr>
-        <w:t>Recomendaciones.</w:t>
+        <w:t>De todo esto salen cuatro recomendaciones. Preferir la imputación por regresión, que conserva la muestra, preserva mejor la estructura de correlaciones y rinde algo más que la mediana. No eliminar casos cuando la ausencia no es MCAR, porque el conjunto que sobrevive deja de representar al sistema. Declarar siempre el mecanismo supuesto, porque bajo MNAR ninguna estrategia es insesgada y pretender lo contrario es el peor error posible. Y tratar como optimistas los intervalos que vienen después de una imputac</w:t>
       </w:r>
       <w:r>
         <w:rPr>
           <w:sz w:val="20"/>
         </w:rPr>
-        <w:t xml:space="preserve"> Primera, </w:t>
-      </w:r>
-      <w:r>
-        <w:rPr>
-          <w:b/>
-          <w:sz w:val="20"/>
-        </w:rPr>
-        <w:t>preferir la imputación por regresión</w:t>
-      </w:r>
-      <w:r>
-        <w:rPr>
-          <w:sz w:val="20"/>
-        </w:rPr>
-        <w:t xml:space="preserve">, que conserva la muestra, preserva mejor la estructura de correlaciones y rinde algo más que la mediana. Segunda, </w:t>
-      </w:r>
-      <w:r>
-        <w:rPr>
-          <w:b/>
-          <w:sz w:val="20"/>
-        </w:rPr>
-        <w:t>no eliminar casos cuando la ausencia no es MCAR</w:t>
-      </w:r>
-      <w:r>
-        <w:rPr>
-          <w:sz w:val="20"/>
-        </w:rPr>
-        <w:t xml:space="preserve">, porque el conjunto superviviente deja de representar al sistema. Tercera, </w:t>
-      </w:r>
-      <w:r>
-        <w:rPr>
-          <w:b/>
-          <w:sz w:val="20"/>
-        </w:rPr>
-        <w:t>declarar siempre el mecanismo supuesto</w:t>
-      </w:r>
-      <w:r>
-        <w:rPr>
-          <w:sz w:val="20"/>
-        </w:rPr>
-        <w:t xml:space="preserve">, porque bajo MNAR ninguna estrategia es insesgada y pretender lo contrario es el error más grave de los tres. Y cuarta, </w:t>
-      </w:r>
-      <w:r>
-        <w:rPr>
-          <w:b/>
-          <w:sz w:val="20"/>
-        </w:rPr>
-        <w:t>tratar los intervalos posteriores a una imputación simple como optimi</w:t>
-      </w:r>
-      <w:r>
-        <w:rPr>
-          <w:b/>
-          <w:sz w:val="20"/>
-        </w:rPr>
-        <w:t>stas</w:t>
-      </w:r>
-      <w:r>
-        <w:rPr>
-          <w:sz w:val="20"/>
-        </w:rPr>
-        <w:t>, salvo que se use imputación múltiple.</w:t>
+        <w:t>ión simple, salvo que se use imputación múltiple.</w:t>
       </w:r>
     </w:p>
     <w:p>
       <w:pPr>
         <w:pStyle w:val="Heading1"/>
       </w:pPr>
-      <w:bookmarkStart w:id="12" w:name="_Toc243729325"/>
+      <w:bookmarkStart w:id="12" w:name="_Toc243734156"/>
       <w:r>
         <w:t>Informe final integrado</w:t>
       </w:r>
@@ -12231,117 +11325,13 @@
         <w:rPr>
           <w:sz w:val="20"/>
         </w:rPr>
-        <w:t xml:space="preserve"> Sobre 9.678 programas de pregrado del sistema chileno de educación superior, el abandono aparente es anticipable </w:t>
-      </w:r>
-      <w:r>
-        <w:rPr>
-          <w:b/>
+        <w:t xml:space="preserve"> Sobre 9.678 programas de pregrado del sistema chileno de educación superior, el abandono aparente resulta anticipable en parte. Un modelo de regresión logística con siete variables alcanza un AUC de 0,730 en prueba y suma 12,9 puntos de exactitud sobre la línea base, lo que alcanza para priorizar programas pero no para dictaminar sobre uno en particular. Cuatro factores sostienen esa capacidad y los cuatro reducen el riesgo: la acreditación institucional (OR 0,633 por desviación típica), la acreditación de</w:t>
+      </w:r>
+      <w:r>
+        <w:rPr>
           <w:sz w:val="20"/>
         </w:rPr>
-        <w:t>en parte</w:t>
-      </w:r>
-      <w:r>
-        <w:rPr>
-          <w:sz w:val="20"/>
-        </w:rPr>
-        <w:t xml:space="preserve">: un modelo de regresión logística con siete variables alcanza un AUC de 0,730 en prueba y suma </w:t>
-      </w:r>
-      <w:r>
-        <w:rPr>
-          <w:b/>
-          <w:sz w:val="20"/>
-        </w:rPr>
-        <w:t>12,9 puntos de exactitud sobre la línea base</w:t>
-      </w:r>
-      <w:r>
-        <w:rPr>
-          <w:sz w:val="20"/>
-        </w:rPr>
-        <w:t xml:space="preserve">, suficiente para priorizar programas pero no para dictaminar sobre uno individual. Cuatro factores sostienen esa capacidad y los cuatro reducen el riesgo: la </w:t>
-      </w:r>
-      <w:r>
-        <w:rPr>
-          <w:b/>
-          <w:sz w:val="20"/>
-        </w:rPr>
-        <w:t>acreditación institucional</w:t>
-      </w:r>
-      <w:r>
-        <w:rPr>
-          <w:sz w:val="20"/>
-        </w:rPr>
-        <w:t xml:space="preserve"> (OR 0,633 por desviación típica), la </w:t>
-      </w:r>
-      <w:r>
-        <w:rPr>
-          <w:b/>
-          <w:sz w:val="20"/>
-        </w:rPr>
-        <w:t>acreditación de la carrera</w:t>
-      </w:r>
-      <w:r>
-        <w:rPr>
-          <w:sz w:val="20"/>
-        </w:rPr>
-        <w:t xml:space="preserve"> </w:t>
-      </w:r>
-      <w:r>
-        <w:rPr>
-          <w:sz w:val="20"/>
-        </w:rPr>
-        <w:t xml:space="preserve">(0,692), el </w:t>
-      </w:r>
-      <w:r>
-        <w:rPr>
-          <w:b/>
-          <w:sz w:val="20"/>
-        </w:rPr>
-        <w:t>tamaño del programa</w:t>
-      </w:r>
-      <w:r>
-        <w:rPr>
-          <w:sz w:val="20"/>
-        </w:rPr>
-        <w:t xml:space="preserve"> (0,720) y la </w:t>
-      </w:r>
-      <w:r>
-        <w:rPr>
-          <w:b/>
-          <w:sz w:val="20"/>
-        </w:rPr>
-        <w:t>proporción de mujeres</w:t>
-      </w:r>
-      <w:r>
-        <w:rPr>
-          <w:sz w:val="20"/>
-        </w:rPr>
-        <w:t xml:space="preserve"> (0,762). Son las mismas cuatro que resistieron el remuestreo en S2, y las tres selecciones de variables las retienen. El resultado metodológico más importante es un contraste: el </w:t>
-      </w:r>
-      <w:r>
-        <w:rPr>
-          <w:b/>
-          <w:sz w:val="20"/>
-        </w:rPr>
-        <w:t>bootstrap estándar confirma los intervalos clásicos</w:t>
-      </w:r>
-      <w:r>
-        <w:rPr>
-          <w:sz w:val="20"/>
-        </w:rPr>
-        <w:t xml:space="preserve"> (razón de amplitudes 1,00–1,12), pero el </w:t>
-      </w:r>
-      <w:r>
-        <w:rPr>
-          <w:b/>
-          <w:sz w:val="20"/>
-        </w:rPr>
-        <w:t>bootstrap por institución los ensancha entre 1,62 y 3,01 veces</w:t>
-      </w:r>
-      <w:r>
-        <w:rPr>
-          <w:sz w:val="20"/>
-        </w:rPr>
-        <w:t>, porque los programas de una misma institución no son independientes.</w:t>
+        <w:t xml:space="preserve"> la carrera (0,692), el tamaño del programa (0,720) y la proporción de mujeres (0,762). Son las mismas cuatro que resistieron el remuestreo en S2 y que retienen las tres selecciones de variables. El resultado metodológico que más nos importa es un contraste: el bootstrap estándar confirma los intervalos clásicos, con una razón de amplitudes de 1,00 a 1,12, pero el bootstrap por institución los ensancha entre 1,62 y 3,01 veces, porque los programas de una misma institución no son independientes.</w:t>
       </w:r>
     </w:p>
     <w:p>
@@ -12379,40 +11369,13 @@
         <w:rPr>
           <w:sz w:val="20"/>
         </w:rPr>
-        <w:t xml:space="preserve"> El rasgo que define esta fase es que </w:t>
-      </w:r>
-      <w:r>
-        <w:rPr>
-          <w:b/>
+        <w:t xml:space="preserve"> Lo que define a esta fase es que casi ninguna decisión metodológica es nueva. Las predictoras de los imputadores salen de la matriz de correlaciones de S1; las variables del modelo, del filtro de estabilidad de S2, con su cifra cada una; el tratamiento de los 465 censurados, de la auditoría caso a caso que hizo S2; el umbral del 50 %, de S1 validado en S2; y el bootstrap de los coeficientes es el instrumento de S2 trasladado a un objeto más complejo. La cadena queda explícita: S1 describió y midió, S2 puso</w:t>
+      </w:r>
+      <w:r>
+        <w:rPr>
           <w:sz w:val="20"/>
         </w:rPr>
-        <w:t>ninguna decisión metodológica es nueva</w:t>
-      </w:r>
-      <w:r>
-        <w:rPr>
-          <w:sz w:val="20"/>
-        </w:rPr>
-        <w:t xml:space="preserve">. Las predictoras de los imputadores salen de la matriz de correlaciones de S1; las variables del modelo, del filtro de estabilidad de S2, con su cifra cada una; el tratamiento de los 465 censurados, de la auditoría caso a caso que S2 realizó; el umbral del 50 %, de S1 validado en S2; y el bootstrap de los coeficientes es el mismo instrumento de S2 trasladado a un objeto más complejo. La cadena es explícita: </w:t>
-      </w:r>
-      <w:r>
-        <w:rPr>
-          <w:b/>
-          <w:sz w:val="20"/>
-        </w:rPr>
-        <w:t>S1 describió y midió, S2</w:t>
-      </w:r>
-      <w:r>
-        <w:rPr>
-          <w:b/>
-          <w:sz w:val="20"/>
-        </w:rPr>
-        <w:t xml:space="preserve"> puso a prueba y validó, S3 modela y predice sobre lo que quedó en pie</w:t>
-      </w:r>
-      <w:r>
-        <w:rPr>
-          <w:sz w:val="20"/>
-        </w:rPr>
-        <w:t>.</w:t>
+        <w:t xml:space="preserve"> a prueba y validó, S3 modela y predice sobre lo que quedó en pie.</w:t>
       </w:r>
     </w:p>
     <w:p>
@@ -12431,46 +11394,20 @@
         <w:rPr>
           <w:sz w:val="20"/>
         </w:rPr>
-        <w:t xml:space="preserve"> S1 estableció el abandono medio en 0,518 y nueve variables asociadas. S2 confirmó por bootstrap que los intervalos clásicos eran fiables, validó el contraste por permutación, separó las correlaciones sólidas de las débiles y cuantificó por Monte Carlo la ventaja de focalizar: un </w:t>
-      </w:r>
-      <w:r>
-        <w:rPr>
-          <w:b/>
+        <w:t xml:space="preserve"> S1 estableció el abandono medio en 0,518 y nueve variables asociadas. S2 confirmó por bootstrap que los intervalos clásicos eran fiables, validó el contraste por permutación, separó las correlaciones sólidas de las débiles y cuantificó por Monte Carlo la ventaja de focalizar, que es un 38,9 % más de estudiantes alcanzados. S3 integra todo eso en un clasificador y agrega cuatro resultados propios. El mecanismo de ausencia importa más que su porcentaje, y bajo MNAR ninguna estrategia es insesgada. La imputac</w:t>
+      </w:r>
+      <w:r>
+        <w:rPr>
           <w:sz w:val="20"/>
         </w:rPr>
-        <w:t>38,9 % más de estudiantes alcanzados</w:t>
+        <w:t xml:space="preserve">ión por regresión le gana a las otras dos en error y en preservación de correlaciones. La precisión del modelo es fiable bajo muestreo independiente, pero entre dos y </w:t>
       </w:r>
       <w:r>
         <w:rPr>
           <w:sz w:val="20"/>
         </w:rPr>
-        <w:t>. S3 integra todo eso en un clasificador y añade cuatro resultados propios: el mecanismo de ausencia importa más que su porcentaje y bajo MNAR ninguna estrategia es insesgada; la imputación por r</w:t>
-      </w:r>
-      <w:r>
-        <w:rPr>
-          <w:sz w:val="20"/>
-        </w:rPr>
-        <w:t xml:space="preserve">egresión domina a las otras dos en error y en preservación de correlaciones; la precisión del modelo es fiable bajo muestreo independiente, pero entre dos y tres </w:t>
-      </w:r>
-      <w:r>
-        <w:rPr>
-          <w:sz w:val="20"/>
-        </w:rPr>
         <w:lastRenderedPageBreak/>
-        <w:t xml:space="preserve">veces menor al reconocer la dependencia institucional; y </w:t>
-      </w:r>
-      <w:r>
-        <w:rPr>
-          <w:b/>
-          <w:sz w:val="20"/>
-        </w:rPr>
-        <w:t>el umbral de decisión pesa más que la ponderación de clase y que la elección entre los tres modelos</w:t>
-      </w:r>
-      <w:r>
-        <w:rPr>
-          <w:sz w:val="20"/>
-        </w:rPr>
-        <w:t>.</w:t>
+        <w:t>tres veces menor al reconocer la dependencia institucional. Y el umbral de decisión pesa más que la ponderación de clase y que la elección entre los tres modelos.</w:t>
       </w:r>
     </w:p>
     <w:p>
@@ -12489,66 +11426,13 @@
         <w:rPr>
           <w:sz w:val="20"/>
         </w:rPr>
-        <w:t xml:space="preserve"> Cuatro tensiones merecen declararse. </w:t>
-      </w:r>
-      <w:r>
-        <w:rPr>
-          <w:b/>
+        <w:t xml:space="preserve"> Hay cuatro tensiones que preferimos dejar escritas. La capacidad predictiva es moderada: un AUC de 0,730 ordena bien el conjunto, pero deja margen de error alto en el caso individual. La ganancia en F1 depende del umbral: al 0,50 el modelo apenas supera la línea base, 0,720 frente a 0,709, mientras que al 0,418 la supera con holgura, 0,740. El modelo lineal en el logit es una aproximación, porque Box-Tidwell lo rechaza en tres de las cuatro variables continuas. Y el coeficiente de la acreditación instituci</w:t>
+      </w:r>
+      <w:r>
+        <w:rPr>
           <w:sz w:val="20"/>
         </w:rPr>
-        <w:t>La capacidad predictiva es moderada</w:t>
-      </w:r>
-      <w:r>
-        <w:rPr>
-          <w:sz w:val="20"/>
-        </w:rPr>
-        <w:t xml:space="preserve">: un AUC de 0,730 ordena bien el conjunto pero deja margen de error alto en el caso individual. </w:t>
-      </w:r>
-      <w:r>
-        <w:rPr>
-          <w:b/>
-          <w:sz w:val="20"/>
-        </w:rPr>
-        <w:t>La ganancia en F1 depende del umbral</w:t>
-      </w:r>
-      <w:r>
-        <w:rPr>
-          <w:sz w:val="20"/>
-        </w:rPr>
-        <w:t xml:space="preserve">: al 0,50 el modelo apenas supera la línea base (0,720 frente a 0,709), mientras que al 0,418 la supera con holgura (0,740). </w:t>
-      </w:r>
-      <w:r>
-        <w:rPr>
-          <w:b/>
-          <w:sz w:val="20"/>
-        </w:rPr>
-        <w:t>El modelo lineal en el logit es una aproximación</w:t>
-      </w:r>
-      <w:r>
-        <w:rPr>
-          <w:sz w:val="20"/>
-        </w:rPr>
-        <w:t xml:space="preserve">: Box-Tidwell lo rechaza en tres de las cuatro variables continuas. Y </w:t>
-      </w:r>
-      <w:r>
-        <w:rPr>
-          <w:b/>
-          <w:sz w:val="20"/>
-        </w:rPr>
-        <w:t>el coeficiente de la acreditación institucional es el menos firm</w:t>
-      </w:r>
-      <w:r>
-        <w:rPr>
-          <w:b/>
-          <w:sz w:val="20"/>
-        </w:rPr>
-        <w:t>e</w:t>
-      </w:r>
-      <w:r>
-        <w:rPr>
-          <w:sz w:val="20"/>
-        </w:rPr>
-        <w:t>: su intervalo es el que más se ensancha al remuestrear por institución y retirar las 237 observaciones influyentes lo mueve un 87,7 %. Es la variable de mayor efecto puntual y la de menor solidez.</w:t>
+        <w:t>onal es el menos firme de todos: su intervalo es el que más se ensancha al remuestrear por institución, y retirar las 237 observaciones influyentes lo mueve un 87,7 %. Es la variable de mayor efecto puntual y, a la vez, la de menor solidez.</w:t>
       </w:r>
     </w:p>
     <w:p>
@@ -12567,85 +11451,20 @@
         <w:rPr>
           <w:sz w:val="20"/>
         </w:rPr>
-        <w:t xml:space="preserve"> El abandono aparente se asocia de forma robusta con la acreditación, el tamaño y la composición de género, y un modelo sobre esas variables sirve para </w:t>
-      </w:r>
-      <w:r>
-        <w:rPr>
-          <w:b/>
+        <w:t xml:space="preserve"> El abandono aparente se asocia de forma robusta con la acreditación, el tamaño y la composición de género, y un modelo construido sobre esas variables sirve para priorizar, con el umbral fijado según el costo relativo de los dos errores. No permite afirmar nada sobre estudiantes individuales, porque la unidad de análisis es el programa; nada sobre causas, porque no hay grupo de control; nada sobre el abandono real, porque lo que medimos es el aparente; y nada firme sobre los efectos categóricos, que pierde</w:t>
+      </w:r>
+      <w:r>
+        <w:rPr>
           <w:sz w:val="20"/>
         </w:rPr>
-        <w:t>priorizar</w:t>
-      </w:r>
-      <w:r>
-        <w:rPr>
-          <w:sz w:val="20"/>
-        </w:rPr>
-        <w:t xml:space="preserve">, con el umbral fijado según el costo relativo de los dos errores. No permite afirmar nada sobre estudiantes individuales, porque la unidad es el programa; nada sobre </w:t>
-      </w:r>
-      <w:r>
-        <w:rPr>
-          <w:b/>
-          <w:sz w:val="20"/>
-        </w:rPr>
-        <w:t>causas</w:t>
-      </w:r>
-      <w:r>
-        <w:rPr>
-          <w:sz w:val="20"/>
-        </w:rPr>
-        <w:t>, porque no hay grupo de control; nada sobre el abandono real, porque lo medido es aparente; y nada firme sobre los efectos categóricos, que pierden el signo al remuestrear por i</w:t>
-      </w:r>
-      <w:r>
-        <w:rPr>
-          <w:sz w:val="20"/>
-        </w:rPr>
-        <w:t xml:space="preserve">nstitución. La extensión natural es triple: </w:t>
-      </w:r>
-      <w:r>
-        <w:rPr>
-          <w:b/>
-          <w:sz w:val="20"/>
-        </w:rPr>
-        <w:t>imputación múltiple</w:t>
-      </w:r>
-      <w:r>
-        <w:rPr>
-          <w:sz w:val="20"/>
-        </w:rPr>
-        <w:t xml:space="preserve">, </w:t>
-      </w:r>
-      <w:r>
-        <w:rPr>
-          <w:b/>
-          <w:sz w:val="20"/>
-        </w:rPr>
-        <w:t>términos no lineales</w:t>
-      </w:r>
-      <w:r>
-        <w:rPr>
-          <w:sz w:val="20"/>
-        </w:rPr>
-        <w:t xml:space="preserve"> donde Box-Tidwell los exige y un </w:t>
-      </w:r>
-      <w:r>
-        <w:rPr>
-          <w:b/>
-          <w:sz w:val="20"/>
-        </w:rPr>
-        <w:t>modelo multinivel</w:t>
-      </w:r>
-      <w:r>
-        <w:rPr>
-          <w:sz w:val="20"/>
-        </w:rPr>
-        <w:t xml:space="preserve"> con la institución como efecto aleatorio.</w:t>
+        <w:t>n el signo al remuestrear por institución. La extensión natural del trabajo es triple: imputación múltiple, términos no lineales donde Box-Tidwell los exige y un modelo multinivel que trate la institución como efecto aleatorio.</w:t>
       </w:r>
     </w:p>
     <w:p>
       <w:pPr>
         <w:pStyle w:val="Heading1"/>
       </w:pPr>
-      <w:bookmarkStart w:id="13" w:name="_Toc243729326"/>
+      <w:bookmarkStart w:id="13" w:name="_Toc243734157"/>
       <w:r>
         <w:t>Presentación del proyecto</w:t>
       </w:r>
@@ -12660,20 +11479,7 @@
         <w:rPr>
           <w:sz w:val="20"/>
         </w:rPr>
-        <w:t xml:space="preserve">La presentación se entrega en </w:t>
-      </w:r>
-      <w:r>
-        <w:rPr>
-          <w:b/>
-          <w:sz w:val="20"/>
-        </w:rPr>
-        <w:t>video de 10 minutos</w:t>
-      </w:r>
-      <w:r>
-        <w:rPr>
-          <w:sz w:val="20"/>
-        </w:rPr>
-        <w:t>, grabado sobre el archivo `S3/presentacion/Sumativa3_Presentacion_Grupo4.pptx`, con el guion cronometrado en las notas del orador de cada diapositiva.</w:t>
+        <w:t>La presentación se entrega en video de 10 minutos, grabado sobre el archivo `S3/presentacion/Sumativa3_Presentacion_Grupo4.pptx`, con el guion cronometrado en las notas del orador de cada diapositiva.</w:t>
       </w:r>
     </w:p>
     <w:p>
@@ -12685,72 +11491,20 @@
         <w:rPr>
           <w:sz w:val="20"/>
         </w:rPr>
-        <w:t xml:space="preserve">Su estructura sigue la progresión que la pauta exige enfatizar: </w:t>
-      </w:r>
-      <w:r>
-        <w:rPr>
-          <w:b/>
+        <w:t>La estructura sigue la progresión que la pauta pide enfatizar: problema y datos (0:00–1:30); metodología integrada (1:30–4:10), que recorre la cadena S1 → S2 → S3 mostrando de qué resultado anterior proviene cada decisión de esta fase; resultados principales (4:10–7:40), con los cuatro factores, la comparación de estrategias de imputación y el hallazgo del bootstrap por institución; y conclusiones y recomendaciones (7:40–10:00), con lo que el modelo permite y lo que no, las cuatro recomendaciones sobre impu</w:t>
+      </w:r>
+      <w:r>
+        <w:rPr>
           <w:sz w:val="20"/>
         </w:rPr>
-        <w:t>problema y datos</w:t>
-      </w:r>
-      <w:r>
-        <w:rPr>
-          <w:sz w:val="20"/>
-        </w:rPr>
-        <w:t xml:space="preserve"> (0:00–1:30), con el abandono aparente a nivel de programa y la pregunta de focalización; </w:t>
-      </w:r>
-      <w:r>
-        <w:rPr>
-          <w:b/>
-          <w:sz w:val="20"/>
-        </w:rPr>
-        <w:t>metodología integrada</w:t>
-      </w:r>
-      <w:r>
-        <w:rPr>
-          <w:sz w:val="20"/>
-        </w:rPr>
-        <w:t xml:space="preserve"> (1:30–4:10), que recorre la cadena S1 → S2 → S3 mostrando de qué resultado anterior proviene cada decisión de esta fase; </w:t>
-      </w:r>
-      <w:r>
-        <w:rPr>
-          <w:b/>
-          <w:sz w:val="20"/>
-        </w:rPr>
-        <w:t>resultados principales</w:t>
-      </w:r>
-      <w:r>
-        <w:rPr>
-          <w:sz w:val="20"/>
-        </w:rPr>
-        <w:t xml:space="preserve"> (4:10–7:40), con los cuatro factores y sus razones de momios, la comparación de estrategias de imputación y el hallazgo del bootstrap por institución, que es el resultado metodológico central; y </w:t>
-      </w:r>
-      <w:r>
-        <w:rPr>
-          <w:b/>
-          <w:sz w:val="20"/>
-        </w:rPr>
-        <w:t>conclusiones y recomendaciones</w:t>
-      </w:r>
-      <w:r>
-        <w:rPr>
-          <w:sz w:val="20"/>
-        </w:rPr>
-        <w:t xml:space="preserve"> (7:40–10:00), </w:t>
-      </w:r>
-      <w:r>
-        <w:rPr>
-          <w:sz w:val="20"/>
-        </w:rPr>
-        <w:t>con lo que el modelo permite y lo que no permite afirmar, las cuatro recomendaciones sobre imputación y las tres extensiones propuestas.</w:t>
+        <w:t>tación y las tres extensiones propuestas.</w:t>
       </w:r>
     </w:p>
     <w:p>
       <w:pPr>
         <w:pStyle w:val="Heading1"/>
       </w:pPr>
-      <w:bookmarkStart w:id="14" w:name="_Toc243729327"/>
+      <w:bookmarkStart w:id="14" w:name="_Toc243734158"/>
       <w:r>
         <w:t>Bibliografía (APA 7)</w:t>
       </w:r>
@@ -12877,7 +11631,14 @@
           <w:i/>
           <w:sz w:val="19"/>
         </w:rPr>
-        <w:t>Permutation, parametric, and bootstrap tests of hypotheses</w:t>
+        <w:t xml:space="preserve">Permutation, parametric, and </w:t>
+      </w:r>
+      <w:r>
+        <w:rPr>
+          <w:i/>
+          <w:sz w:val="19"/>
+        </w:rPr>
+        <w:t>bootstrap tests of hypotheses</w:t>
       </w:r>
       <w:r>
         <w:rPr>
@@ -13161,64 +11922,10 @@
 <file path=word/numbering.xml><?xml version="1.0" encoding="utf-8"?>
 <w:numbering xmlns:wpc="http://schemas.microsoft.com/office/word/2010/wordprocessingCanvas" xmlns:cx="http://schemas.microsoft.com/office/drawing/2014/chartex" xmlns:cx1="http://schemas.microsoft.com/office/drawing/2015/9/8/chartex" xmlns:cx2="http://schemas.microsoft.com/office/drawing/2015/10/21/chartex" xmlns:cx3="http://schemas.microsoft.com/office/drawing/2016/5/9/chartex" xmlns:cx4="http://schemas.microsoft.com/office/drawing/2016/5/10/chartex" xmlns:cx5="http://schemas.microsoft.com/office/drawing/2016/5/11/chartex" xmlns:cx6="http://schemas.microsoft.com/office/drawing/2016/5/12/chartex" xmlns:cx7="http://schemas.microsoft.com/office/drawing/2016/5/13/chartex" xmlns:cx8="http://schemas.microsoft.com/office/drawing/2016/5/14/chartex" xmlns:mc="http://schemas.openxmlformats.org/markup-compatibility/2006" xmlns:aink="http://schemas.microsoft.com/office/drawing/2016/ink" xmlns:am3d="http://schemas.microsoft.com/office/drawing/2017/model3d" xmlns:o="urn:schemas-microsoft-com:office:office" xmlns:oel="http://schemas.microsoft.com/office/2019/extlst" xmlns:r="http://schemas.openxmlformats.org/officeDocument/2006/relationships" xmlns:m="http://schemas.openxmlformats.org/officeDocument/2006/math" xmlns:v="urn:schemas-microsoft-com:vml" xmlns:wp14="http://schemas.microsoft.com/office/word/2010/wordprocessingDrawing" xmlns:wp="http://schemas.openxmlformats.org/drawingml/2006/wordprocessingDrawing" xmlns:w10="urn:schemas-microsoft-com:office:word" xmlns:w="http://schemas.openxmlformats.org/wordprocessingml/2006/main" xmlns:w14="http://schemas.microsoft.com/office/word/2010/wordml" xmlns:w15="http://schemas.microsoft.com/office/word/2012/wordml" xmlns:w16cex="http://schemas.microsoft.com/office/word/2018/wordml/cex" xmlns:w16cid="http://schemas.microsoft.com/office/word/2016/wordml/cid" xmlns:w16="http://schemas.microsoft.com/office/word/2018/wordml" xmlns:w16sdtdh="http://schemas.microsoft.com/office/word/2020/wordml/sdtdatahash" xmlns:w16se="http://schemas.microsoft.com/office/word/2015/wordml/symex" xmlns:wpg="http://schemas.microsoft.com/office/word/2010/wordprocessingGroup" xmlns:wpi="http://schemas.microsoft.com/office/word/2010/wordprocessingInk" xmlns:wne="http://schemas.microsoft.com/office/word/2006/wordml" xmlns:wps="http://schemas.microsoft.com/office/word/2010/wordprocessingShape" mc:Ignorable="w14 w15 w16se w16cid w16 w16cex w16sdtdh wp14">
   <w:abstractNum w:abstractNumId="0" w15:restartNumberingAfterBreak="0">
-    <w:nsid w:val="075C1578"/>
+    <w:nsid w:val="092347CF"/>
     <w:multiLevelType w:val="hybridMultilevel"/>
-    <w:tmpl w:val="96166852"/>
-    <w:lvl w:ilvl="0" w:tplc="6C5CA7FC">
-      <w:start w:val="1"/>
-      <w:numFmt w:val="bullet"/>
-      <w:lvlText w:val="•"/>
-      <w:lvlJc w:val="left"/>
-      <w:pPr>
-        <w:ind w:left="720" w:hanging="360"/>
-      </w:pPr>
-    </w:lvl>
-    <w:lvl w:ilvl="1" w:tplc="15F016E4">
-      <w:numFmt w:val="decimal"/>
-      <w:lvlText w:val=""/>
-      <w:lvlJc w:val="left"/>
-    </w:lvl>
-    <w:lvl w:ilvl="2" w:tplc="779885B0">
-      <w:numFmt w:val="decimal"/>
-      <w:lvlText w:val=""/>
-      <w:lvlJc w:val="left"/>
-    </w:lvl>
-    <w:lvl w:ilvl="3" w:tplc="194E1468">
-      <w:numFmt w:val="decimal"/>
-      <w:lvlText w:val=""/>
-      <w:lvlJc w:val="left"/>
-    </w:lvl>
-    <w:lvl w:ilvl="4" w:tplc="360834EE">
-      <w:numFmt w:val="decimal"/>
-      <w:lvlText w:val=""/>
-      <w:lvlJc w:val="left"/>
-    </w:lvl>
-    <w:lvl w:ilvl="5" w:tplc="0186DEB4">
-      <w:numFmt w:val="decimal"/>
-      <w:lvlText w:val=""/>
-      <w:lvlJc w:val="left"/>
-    </w:lvl>
-    <w:lvl w:ilvl="6" w:tplc="43A46E62">
-      <w:numFmt w:val="decimal"/>
-      <w:lvlText w:val=""/>
-      <w:lvlJc w:val="left"/>
-    </w:lvl>
-    <w:lvl w:ilvl="7" w:tplc="1D162936">
-      <w:numFmt w:val="decimal"/>
-      <w:lvlText w:val=""/>
-      <w:lvlJc w:val="left"/>
-    </w:lvl>
-    <w:lvl w:ilvl="8" w:tplc="68D87DD0">
-      <w:numFmt w:val="decimal"/>
-      <w:lvlText w:val=""/>
-      <w:lvlJc w:val="left"/>
-    </w:lvl>
-  </w:abstractNum>
-  <w:abstractNum w:abstractNumId="1" w15:restartNumberingAfterBreak="0">
-    <w:nsid w:val="76586183"/>
-    <w:multiLevelType w:val="hybridMultilevel"/>
-    <w:tmpl w:val="5BC277B0"/>
-    <w:lvl w:ilvl="0" w:tplc="29A86718">
+    <w:tmpl w:val="28861E56"/>
+    <w:lvl w:ilvl="0" w:tplc="2A9035D4">
       <w:start w:val="1"/>
       <w:numFmt w:val="bullet"/>
       <w:lvlText w:val="●"/>
@@ -13227,7 +11934,7 @@
         <w:ind w:left="720" w:hanging="360"/>
       </w:pPr>
     </w:lvl>
-    <w:lvl w:ilvl="1" w:tplc="6FA2026C">
+    <w:lvl w:ilvl="1" w:tplc="90824B38">
       <w:start w:val="1"/>
       <w:numFmt w:val="bullet"/>
       <w:lvlText w:val="○"/>
@@ -13236,7 +11943,7 @@
         <w:ind w:left="1440" w:hanging="360"/>
       </w:pPr>
     </w:lvl>
-    <w:lvl w:ilvl="2" w:tplc="380687AA">
+    <w:lvl w:ilvl="2" w:tplc="2FB0DF6E">
       <w:start w:val="1"/>
       <w:numFmt w:val="bullet"/>
       <w:lvlText w:val="■"/>
@@ -13245,7 +11952,7 @@
         <w:ind w:left="2160" w:hanging="360"/>
       </w:pPr>
     </w:lvl>
-    <w:lvl w:ilvl="3" w:tplc="1D2EAD86">
+    <w:lvl w:ilvl="3" w:tplc="151C220A">
       <w:start w:val="1"/>
       <w:numFmt w:val="bullet"/>
       <w:lvlText w:val="●"/>
@@ -13254,7 +11961,7 @@
         <w:ind w:left="2880" w:hanging="360"/>
       </w:pPr>
     </w:lvl>
-    <w:lvl w:ilvl="4" w:tplc="74CAC618">
+    <w:lvl w:ilvl="4" w:tplc="397EE174">
       <w:start w:val="1"/>
       <w:numFmt w:val="bullet"/>
       <w:lvlText w:val="○"/>
@@ -13263,7 +11970,7 @@
         <w:ind w:left="3600" w:hanging="360"/>
       </w:pPr>
     </w:lvl>
-    <w:lvl w:ilvl="5" w:tplc="14F43B90">
+    <w:lvl w:ilvl="5" w:tplc="BB4492E0">
       <w:start w:val="1"/>
       <w:numFmt w:val="bullet"/>
       <w:lvlText w:val="■"/>
@@ -13272,7 +11979,7 @@
         <w:ind w:left="4320" w:hanging="360"/>
       </w:pPr>
     </w:lvl>
-    <w:lvl w:ilvl="6" w:tplc="647C475C">
+    <w:lvl w:ilvl="6" w:tplc="12023776">
       <w:start w:val="1"/>
       <w:numFmt w:val="bullet"/>
       <w:lvlText w:val="●"/>
@@ -13281,7 +11988,7 @@
         <w:ind w:left="5040" w:hanging="360"/>
       </w:pPr>
     </w:lvl>
-    <w:lvl w:ilvl="7" w:tplc="1AC67936">
+    <w:lvl w:ilvl="7" w:tplc="3118B168">
       <w:start w:val="1"/>
       <w:numFmt w:val="bullet"/>
       <w:lvlText w:val="●"/>
@@ -13290,7 +11997,7 @@
         <w:ind w:left="5760" w:hanging="360"/>
       </w:pPr>
     </w:lvl>
-    <w:lvl w:ilvl="8" w:tplc="841E0946">
+    <w:lvl w:ilvl="8" w:tplc="7A12611C">
       <w:start w:val="1"/>
       <w:numFmt w:val="bullet"/>
       <w:lvlText w:val="●"/>
@@ -13300,8 +12007,62 @@
       </w:pPr>
     </w:lvl>
   </w:abstractNum>
-  <w:num w:numId="1" w16cid:durableId="162665655">
-    <w:abstractNumId w:val="1"/>
+  <w:abstractNum w:abstractNumId="1" w15:restartNumberingAfterBreak="0">
+    <w:nsid w:val="13623944"/>
+    <w:multiLevelType w:val="hybridMultilevel"/>
+    <w:tmpl w:val="6F5A4352"/>
+    <w:lvl w:ilvl="0" w:tplc="FC10BC9E">
+      <w:start w:val="1"/>
+      <w:numFmt w:val="bullet"/>
+      <w:lvlText w:val="•"/>
+      <w:lvlJc w:val="left"/>
+      <w:pPr>
+        <w:ind w:left="720" w:hanging="360"/>
+      </w:pPr>
+    </w:lvl>
+    <w:lvl w:ilvl="1" w:tplc="A12E1180">
+      <w:numFmt w:val="decimal"/>
+      <w:lvlText w:val=""/>
+      <w:lvlJc w:val="left"/>
+    </w:lvl>
+    <w:lvl w:ilvl="2" w:tplc="D7FC8BAA">
+      <w:numFmt w:val="decimal"/>
+      <w:lvlText w:val=""/>
+      <w:lvlJc w:val="left"/>
+    </w:lvl>
+    <w:lvl w:ilvl="3" w:tplc="8A6E299E">
+      <w:numFmt w:val="decimal"/>
+      <w:lvlText w:val=""/>
+      <w:lvlJc w:val="left"/>
+    </w:lvl>
+    <w:lvl w:ilvl="4" w:tplc="05A6332A">
+      <w:numFmt w:val="decimal"/>
+      <w:lvlText w:val=""/>
+      <w:lvlJc w:val="left"/>
+    </w:lvl>
+    <w:lvl w:ilvl="5" w:tplc="4536B65A">
+      <w:numFmt w:val="decimal"/>
+      <w:lvlText w:val=""/>
+      <w:lvlJc w:val="left"/>
+    </w:lvl>
+    <w:lvl w:ilvl="6" w:tplc="19F8ACFC">
+      <w:numFmt w:val="decimal"/>
+      <w:lvlText w:val=""/>
+      <w:lvlJc w:val="left"/>
+    </w:lvl>
+    <w:lvl w:ilvl="7" w:tplc="ED5EDF00">
+      <w:numFmt w:val="decimal"/>
+      <w:lvlText w:val=""/>
+      <w:lvlJc w:val="left"/>
+    </w:lvl>
+    <w:lvl w:ilvl="8" w:tplc="A06A8F24">
+      <w:numFmt w:val="decimal"/>
+      <w:lvlText w:val=""/>
+      <w:lvlJc w:val="left"/>
+    </w:lvl>
+  </w:abstractNum>
+  <w:num w:numId="1" w16cid:durableId="1830360052">
+    <w:abstractNumId w:val="0"/>
     <w:lvlOverride w:ilvl="0">
       <w:startOverride w:val="1"/>
     </w:lvlOverride>
@@ -13918,7 +12679,7 @@
     <w:autoRedefine/>
     <w:uiPriority w:val="39"/>
     <w:unhideWhenUsed/>
-    <w:rsid w:val="00117722"/>
+    <w:rsid w:val="00BB51F8"/>
     <w:pPr>
       <w:spacing w:after="100"/>
     </w:pPr>
@@ -13930,7 +12691,7 @@
     <w:autoRedefine/>
     <w:uiPriority w:val="39"/>
     <w:unhideWhenUsed/>
-    <w:rsid w:val="00117722"/>
+    <w:rsid w:val="00BB51F8"/>
     <w:pPr>
       <w:spacing w:after="100"/>
       <w:ind w:left="220"/>

</xml_diff>

<commit_message>
docs: informe final en PDF y ajustes de redaccion en Word
Agrega el PDF exportado del informe, que es el entregable que pide la
pauta: 12 paginas, de las cuales la portada y la hoja de informacion de
la evaluacion son el frente de la plantilla, asi que el cuerpo ocupa las
10 paginas del limite.

En el .docx, dos arreglos de puntuacion y la eliminacion de la seccion
"Presentacion del proyecto", cuyos tramos horarios ya no correspondian a
la grabacion.

Co-authored-by: María Fassler Neumann <m.fasslerneumann@uandresbello.edu>
</commit_message>
<xml_diff>
--- a/S3/informe/Sumativa3_Informe_Maria_Fassler_Sebastian_Antunez.docx
+++ b/S3/informe/Sumativa3_Informe_Maria_Fassler_Sebastian_Antunez.docx
@@ -259,21 +259,7 @@
               <w:rPr>
                 <w:sz w:val="20"/>
               </w:rPr>
-              <w:t xml:space="preserve">María </w:t>
-            </w:r>
-            <w:proofErr w:type="spellStart"/>
-            <w:r>
-              <w:rPr>
-                <w:sz w:val="20"/>
-              </w:rPr>
-              <w:t>Fassler</w:t>
-            </w:r>
-            <w:proofErr w:type="spellEnd"/>
-            <w:r>
-              <w:rPr>
-                <w:sz w:val="20"/>
-              </w:rPr>
-              <w:t xml:space="preserve"> Neumann · Sebastian Antunez Noguera — Grupo 4</w:t>
+              <w:t>María Fassler Neumann · Sebastian Antunez Noguera — Grupo 4</w:t>
             </w:r>
           </w:p>
         </w:tc>
@@ -296,7 +282,6 @@
             </w:tcMar>
           </w:tcPr>
           <w:p>
-            <w:proofErr w:type="spellStart"/>
             <w:r>
               <w:rPr>
                 <w:b/>
@@ -304,17 +289,7 @@
                 <w:sz w:val="20"/>
                 <w:szCs w:val="20"/>
               </w:rPr>
-              <w:t>Dataset</w:t>
-            </w:r>
-            <w:proofErr w:type="spellEnd"/>
-            <w:r>
-              <w:rPr>
-                <w:b/>
-                <w:bCs/>
-                <w:sz w:val="20"/>
-                <w:szCs w:val="20"/>
-              </w:rPr>
-              <w:t>:</w:t>
+              <w:t>Dataset:</w:t>
             </w:r>
           </w:p>
         </w:tc>
@@ -801,32 +776,7 @@
                 <w:sz w:val="20"/>
                 <w:szCs w:val="20"/>
               </w:rPr>
-              <w:t xml:space="preserve">Informe final PDF (máx. 10 págs.) · Notebook </w:t>
-            </w:r>
-            <w:proofErr w:type="gramStart"/>
-            <w:r>
-              <w:rPr>
-                <w:sz w:val="20"/>
-                <w:szCs w:val="20"/>
-              </w:rPr>
-              <w:t>maestro .</w:t>
-            </w:r>
-            <w:proofErr w:type="spellStart"/>
-            <w:r>
-              <w:rPr>
-                <w:sz w:val="20"/>
-                <w:szCs w:val="20"/>
-              </w:rPr>
-              <w:t>ipynb</w:t>
-            </w:r>
-            <w:proofErr w:type="spellEnd"/>
-            <w:proofErr w:type="gramEnd"/>
-            <w:r>
-              <w:rPr>
-                <w:sz w:val="20"/>
-                <w:szCs w:val="20"/>
-              </w:rPr>
-              <w:t xml:space="preserve"> · Presentación (video o en vivo) · Repositorio GitHub completo</w:t>
+              <w:t>Informe final PDF (máx. 10 págs.) · Notebook maestro .ipynb · Presentación (video o en vivo) · Repositorio GitHub completo</w:t>
             </w:r>
           </w:p>
         </w:tc>
@@ -949,129 +899,11 @@
         <w:spacing w:after="200"/>
       </w:pPr>
     </w:p>
-    <w:tbl>
-      <w:tblPr>
-        <w:tblW w:w="9072" w:type="dxa"/>
-        <w:tblBorders>
-          <w:top w:val="single" w:sz="4" w:space="0" w:color="auto"/>
-          <w:left w:val="single" w:sz="4" w:space="0" w:color="auto"/>
-          <w:bottom w:val="single" w:sz="4" w:space="0" w:color="auto"/>
-          <w:right w:val="single" w:sz="4" w:space="0" w:color="auto"/>
-          <w:insideH w:val="single" w:sz="4" w:space="0" w:color="auto"/>
-          <w:insideV w:val="single" w:sz="4" w:space="0" w:color="auto"/>
-        </w:tblBorders>
-        <w:tblCellMar>
-          <w:left w:w="10" w:type="dxa"/>
-          <w:right w:w="10" w:type="dxa"/>
-        </w:tblCellMar>
-        <w:tblLook w:val="0000" w:firstRow="0" w:lastRow="0" w:firstColumn="0" w:lastColumn="0" w:noHBand="0" w:noVBand="0"/>
-      </w:tblPr>
-      <w:tblGrid>
-        <w:gridCol w:w="9072"/>
-      </w:tblGrid>
-      <w:tr>
-        <w:tc>
-          <w:tcPr>
-            <w:tcW w:w="9072" w:type="dxa"/>
-            <w:tcBorders>
-              <w:top w:val="single" w:sz="4" w:space="0" w:color="5A5A5A"/>
-              <w:left w:val="single" w:sz="4" w:space="0" w:color="5A5A5A"/>
-              <w:bottom w:val="none" w:sz="0" w:space="0" w:color="FFFFFF"/>
-              <w:right w:val="single" w:sz="4" w:space="0" w:color="5A5A5A"/>
-            </w:tcBorders>
-            <w:shd w:val="clear" w:color="auto" w:fill="5A5A5A"/>
-            <w:tcMar>
-              <w:top w:w="80" w:type="dxa"/>
-              <w:left w:w="120" w:type="dxa"/>
-              <w:bottom w:w="80" w:type="dxa"/>
-              <w:right w:w="120" w:type="dxa"/>
-            </w:tcMar>
-          </w:tcPr>
-          <w:p>
-            <w:r>
-              <w:rPr>
-                <w:b/>
-                <w:bCs/>
-                <w:color w:val="FFFFFF"/>
-                <w:sz w:val="20"/>
-                <w:szCs w:val="20"/>
-              </w:rPr>
-              <w:t>Conexión con evaluaciones anteriores</w:t>
-            </w:r>
-          </w:p>
-        </w:tc>
-      </w:tr>
-      <w:tr>
-        <w:tc>
-          <w:tcPr>
-            <w:tcW w:w="9072" w:type="dxa"/>
-            <w:tcBorders>
-              <w:top w:val="none" w:sz="0" w:space="0" w:color="FFFFFF"/>
-              <w:left w:val="single" w:sz="4" w:space="0" w:color="5A5A5A"/>
-              <w:bottom w:val="single" w:sz="4" w:space="0" w:color="5A5A5A"/>
-              <w:right w:val="single" w:sz="4" w:space="0" w:color="5A5A5A"/>
-            </w:tcBorders>
-            <w:tcMar>
-              <w:top w:w="100" w:type="dxa"/>
-              <w:left w:w="120" w:type="dxa"/>
-              <w:bottom w:w="100" w:type="dxa"/>
-              <w:right w:w="120" w:type="dxa"/>
-            </w:tcMar>
-          </w:tcPr>
-          <w:p>
-            <w:r>
-              <w:rPr>
-                <w:sz w:val="20"/>
-                <w:szCs w:val="20"/>
-              </w:rPr>
-              <w:t xml:space="preserve">Esta evaluación </w:t>
-            </w:r>
-            <w:r>
-              <w:rPr>
-                <w:b/>
-                <w:bCs/>
-                <w:sz w:val="20"/>
-                <w:szCs w:val="20"/>
-              </w:rPr>
-              <w:t>no es independiente</w:t>
-            </w:r>
-            <w:r>
-              <w:rPr>
-                <w:sz w:val="20"/>
-                <w:szCs w:val="20"/>
-              </w:rPr>
-              <w:t xml:space="preserve">: todas las decisiones metodológicas (manejo de datos faltantes, selección de variables, validación de modelos, evaluación de desempeño y análisis de robustez) deben fundamentarse directamente en los hallazgos de S1 y S2. </w:t>
-            </w:r>
-            <w:r>
-              <w:rPr>
-                <w:b/>
-                <w:bCs/>
-                <w:sz w:val="20"/>
-                <w:szCs w:val="20"/>
-              </w:rPr>
-              <w:t>Si no se evidencia el uso efectivo de dichos resultados, la evaluación no podrá alcanzar la calificación máxima.</w:t>
-            </w:r>
-            <w:r>
-              <w:rPr>
-                <w:sz w:val="20"/>
-                <w:szCs w:val="20"/>
-              </w:rPr>
-              <w:t xml:space="preserve"> Debe observarse claramente la progresión S1 → S2 → S3.</w:t>
-            </w:r>
-          </w:p>
-        </w:tc>
-      </w:tr>
-    </w:tbl>
     <w:p>
       <w:pPr>
-        <w:spacing w:after="200"/>
-      </w:pPr>
-    </w:p>
-    <w:p>
-      <w:pPr>
         <w:pStyle w:val="Heading1"/>
       </w:pPr>
-      <w:bookmarkStart w:id="0" w:name="_Toc243734726"/>
+      <w:bookmarkStart w:id="0" w:name="_Toc244023771"/>
       <w:r>
         <w:t>Índice</w:t>
       </w:r>
@@ -1108,7 +940,7 @@
           <w:r>
             <w:fldChar w:fldCharType="separate"/>
           </w:r>
-          <w:hyperlink w:anchor="_Toc243734726" w:history="1">
+          <w:hyperlink w:anchor="_Toc244023771" w:history="1">
             <w:r>
               <w:rPr>
                 <w:rStyle w:val="Hyperlink"/>
@@ -1132,7 +964,7 @@
               <w:rPr>
                 <w:noProof/>
               </w:rPr>
-              <w:instrText xml:space="preserve"> PAGEREF _Toc243734726 \h </w:instrText>
+              <w:instrText xml:space="preserve"> PAGEREF _Toc244023771 \h </w:instrText>
             </w:r>
             <w:r>
               <w:rPr>
@@ -1175,7 +1007,7 @@
               <w14:ligatures w14:val="standardContextual"/>
             </w:rPr>
           </w:pPr>
-          <w:hyperlink w:anchor="_Toc243734727" w:history="1">
+          <w:hyperlink w:anchor="_Toc244023772" w:history="1">
             <w:r>
               <w:rPr>
                 <w:rStyle w:val="Hyperlink"/>
@@ -1199,7 +1031,7 @@
               <w:rPr>
                 <w:noProof/>
               </w:rPr>
-              <w:instrText xml:space="preserve"> PAGEREF _Toc243734727 \h </w:instrText>
+              <w:instrText xml:space="preserve"> PAGEREF _Toc244023772 \h </w:instrText>
             </w:r>
             <w:r>
               <w:rPr>
@@ -1242,7 +1074,7 @@
               <w14:ligatures w14:val="standardContextual"/>
             </w:rPr>
           </w:pPr>
-          <w:hyperlink w:anchor="_Toc243734728" w:history="1">
+          <w:hyperlink w:anchor="_Toc244023773" w:history="1">
             <w:r>
               <w:rPr>
                 <w:rStyle w:val="Hyperlink"/>
@@ -1266,7 +1098,7 @@
               <w:rPr>
                 <w:noProof/>
               </w:rPr>
-              <w:instrText xml:space="preserve"> PAGEREF _Toc243734728 \h </w:instrText>
+              <w:instrText xml:space="preserve"> PAGEREF _Toc244023773 \h </w:instrText>
             </w:r>
             <w:r>
               <w:rPr>
@@ -1309,7 +1141,7 @@
               <w14:ligatures w14:val="standardContextual"/>
             </w:rPr>
           </w:pPr>
-          <w:hyperlink w:anchor="_Toc243734729" w:history="1">
+          <w:hyperlink w:anchor="_Toc244023774" w:history="1">
             <w:r>
               <w:rPr>
                 <w:rStyle w:val="Hyperlink"/>
@@ -1333,7 +1165,7 @@
               <w:rPr>
                 <w:noProof/>
               </w:rPr>
-              <w:instrText xml:space="preserve"> PAGEREF _Toc243734729 \h </w:instrText>
+              <w:instrText xml:space="preserve"> PAGEREF _Toc244023774 \h </w:instrText>
             </w:r>
             <w:r>
               <w:rPr>
@@ -1376,7 +1208,7 @@
               <w14:ligatures w14:val="standardContextual"/>
             </w:rPr>
           </w:pPr>
-          <w:hyperlink w:anchor="_Toc243734730" w:history="1">
+          <w:hyperlink w:anchor="_Toc244023775" w:history="1">
             <w:r>
               <w:rPr>
                 <w:rStyle w:val="Hyperlink"/>
@@ -1400,7 +1232,7 @@
               <w:rPr>
                 <w:noProof/>
               </w:rPr>
-              <w:instrText xml:space="preserve"> PAGEREF _Toc243734730 \h </w:instrText>
+              <w:instrText xml:space="preserve"> PAGEREF _Toc244023775 \h </w:instrText>
             </w:r>
             <w:r>
               <w:rPr>
@@ -1443,7 +1275,7 @@
               <w14:ligatures w14:val="standardContextual"/>
             </w:rPr>
           </w:pPr>
-          <w:hyperlink w:anchor="_Toc243734731" w:history="1">
+          <w:hyperlink w:anchor="_Toc244023776" w:history="1">
             <w:r>
               <w:rPr>
                 <w:rStyle w:val="Hyperlink"/>
@@ -1467,7 +1299,7 @@
               <w:rPr>
                 <w:noProof/>
               </w:rPr>
-              <w:instrText xml:space="preserve"> PAGEREF _Toc243734731 \h </w:instrText>
+              <w:instrText xml:space="preserve"> PAGEREF _Toc244023776 \h </w:instrText>
             </w:r>
             <w:r>
               <w:rPr>
@@ -1510,7 +1342,7 @@
               <w14:ligatures w14:val="standardContextual"/>
             </w:rPr>
           </w:pPr>
-          <w:hyperlink w:anchor="_Toc243734732" w:history="1">
+          <w:hyperlink w:anchor="_Toc244023777" w:history="1">
             <w:r>
               <w:rPr>
                 <w:rStyle w:val="Hyperlink"/>
@@ -1534,7 +1366,7 @@
               <w:rPr>
                 <w:noProof/>
               </w:rPr>
-              <w:instrText xml:space="preserve"> PAGEREF _Toc243734732 \h </w:instrText>
+              <w:instrText xml:space="preserve"> PAGEREF _Toc244023777 \h </w:instrText>
             </w:r>
             <w:r>
               <w:rPr>
@@ -1577,7 +1409,7 @@
               <w14:ligatures w14:val="standardContextual"/>
             </w:rPr>
           </w:pPr>
-          <w:hyperlink w:anchor="_Toc243734733" w:history="1">
+          <w:hyperlink w:anchor="_Toc244023778" w:history="1">
             <w:r>
               <w:rPr>
                 <w:rStyle w:val="Hyperlink"/>
@@ -1601,7 +1433,7 @@
               <w:rPr>
                 <w:noProof/>
               </w:rPr>
-              <w:instrText xml:space="preserve"> PAGEREF _Toc243734733 \h </w:instrText>
+              <w:instrText xml:space="preserve"> PAGEREF _Toc244023778 \h </w:instrText>
             </w:r>
             <w:r>
               <w:rPr>
@@ -1644,7 +1476,7 @@
               <w14:ligatures w14:val="standardContextual"/>
             </w:rPr>
           </w:pPr>
-          <w:hyperlink w:anchor="_Toc243734734" w:history="1">
+          <w:hyperlink w:anchor="_Toc244023779" w:history="1">
             <w:r>
               <w:rPr>
                 <w:rStyle w:val="Hyperlink"/>
@@ -1668,7 +1500,7 @@
               <w:rPr>
                 <w:noProof/>
               </w:rPr>
-              <w:instrText xml:space="preserve"> PAGEREF _Toc243734734 \h </w:instrText>
+              <w:instrText xml:space="preserve"> PAGEREF _Toc244023779 \h </w:instrText>
             </w:r>
             <w:r>
               <w:rPr>
@@ -1711,7 +1543,7 @@
               <w14:ligatures w14:val="standardContextual"/>
             </w:rPr>
           </w:pPr>
-          <w:hyperlink w:anchor="_Toc243734735" w:history="1">
+          <w:hyperlink w:anchor="_Toc244023780" w:history="1">
             <w:r>
               <w:rPr>
                 <w:rStyle w:val="Hyperlink"/>
@@ -1735,7 +1567,7 @@
               <w:rPr>
                 <w:noProof/>
               </w:rPr>
-              <w:instrText xml:space="preserve"> PAGEREF _Toc243734735 \h </w:instrText>
+              <w:instrText xml:space="preserve"> PAGEREF _Toc244023780 \h </w:instrText>
             </w:r>
             <w:r>
               <w:rPr>
@@ -1778,7 +1610,7 @@
               <w14:ligatures w14:val="standardContextual"/>
             </w:rPr>
           </w:pPr>
-          <w:hyperlink w:anchor="_Toc243734736" w:history="1">
+          <w:hyperlink w:anchor="_Toc244023781" w:history="1">
             <w:r>
               <w:rPr>
                 <w:rStyle w:val="Hyperlink"/>
@@ -1802,7 +1634,7 @@
               <w:rPr>
                 <w:noProof/>
               </w:rPr>
-              <w:instrText xml:space="preserve"> PAGEREF _Toc243734736 \h </w:instrText>
+              <w:instrText xml:space="preserve"> PAGEREF _Toc244023781 \h </w:instrText>
             </w:r>
             <w:r>
               <w:rPr>
@@ -1845,7 +1677,7 @@
               <w14:ligatures w14:val="standardContextual"/>
             </w:rPr>
           </w:pPr>
-          <w:hyperlink w:anchor="_Toc243734737" w:history="1">
+          <w:hyperlink w:anchor="_Toc244023782" w:history="1">
             <w:r>
               <w:rPr>
                 <w:rStyle w:val="Hyperlink"/>
@@ -1869,7 +1701,7 @@
               <w:rPr>
                 <w:noProof/>
               </w:rPr>
-              <w:instrText xml:space="preserve"> PAGEREF _Toc243734737 \h </w:instrText>
+              <w:instrText xml:space="preserve"> PAGEREF _Toc244023782 \h </w:instrText>
             </w:r>
             <w:r>
               <w:rPr>
@@ -1912,7 +1744,7 @@
               <w14:ligatures w14:val="standardContextual"/>
             </w:rPr>
           </w:pPr>
-          <w:hyperlink w:anchor="_Toc243734738" w:history="1">
+          <w:hyperlink w:anchor="_Toc244023783" w:history="1">
             <w:r>
               <w:rPr>
                 <w:rStyle w:val="Hyperlink"/>
@@ -1936,7 +1768,7 @@
               <w:rPr>
                 <w:noProof/>
               </w:rPr>
-              <w:instrText xml:space="preserve"> PAGEREF _Toc243734738 \h </w:instrText>
+              <w:instrText xml:space="preserve"> PAGEREF _Toc244023783 \h </w:instrText>
             </w:r>
             <w:r>
               <w:rPr>
@@ -1979,7 +1811,7 @@
               <w14:ligatures w14:val="standardContextual"/>
             </w:rPr>
           </w:pPr>
-          <w:hyperlink w:anchor="_Toc243734739" w:history="1">
+          <w:hyperlink w:anchor="_Toc244023784" w:history="1">
             <w:r>
               <w:rPr>
                 <w:rStyle w:val="Hyperlink"/>
@@ -2003,7 +1835,7 @@
               <w:rPr>
                 <w:noProof/>
               </w:rPr>
-              <w:instrText xml:space="preserve"> PAGEREF _Toc243734739 \h </w:instrText>
+              <w:instrText xml:space="preserve"> PAGEREF _Toc244023784 \h </w:instrText>
             </w:r>
             <w:r>
               <w:rPr>
@@ -2046,7 +1878,7 @@
               <w14:ligatures w14:val="standardContextual"/>
             </w:rPr>
           </w:pPr>
-          <w:hyperlink w:anchor="_Toc243734740" w:history="1">
+          <w:hyperlink w:anchor="_Toc244023785" w:history="1">
             <w:r>
               <w:rPr>
                 <w:rStyle w:val="Hyperlink"/>
@@ -2070,7 +1902,7 @@
               <w:rPr>
                 <w:noProof/>
               </w:rPr>
-              <w:instrText xml:space="preserve"> PAGEREF _Toc243734740 \h </w:instrText>
+              <w:instrText xml:space="preserve"> PAGEREF _Toc244023785 \h </w:instrText>
             </w:r>
             <w:r>
               <w:rPr>
@@ -2113,7 +1945,7 @@
               <w14:ligatures w14:val="standardContextual"/>
             </w:rPr>
           </w:pPr>
-          <w:hyperlink w:anchor="_Toc243734741" w:history="1">
+          <w:hyperlink w:anchor="_Toc244023786" w:history="1">
             <w:r>
               <w:rPr>
                 <w:rStyle w:val="Hyperlink"/>
@@ -2137,7 +1969,7 @@
               <w:rPr>
                 <w:noProof/>
               </w:rPr>
-              <w:instrText xml:space="preserve"> PAGEREF _Toc243734741 \h </w:instrText>
+              <w:instrText xml:space="preserve"> PAGEREF _Toc244023786 \h </w:instrText>
             </w:r>
             <w:r>
               <w:rPr>
@@ -2180,7 +2012,7 @@
               <w14:ligatures w14:val="standardContextual"/>
             </w:rPr>
           </w:pPr>
-          <w:hyperlink w:anchor="_Toc243734742" w:history="1">
+          <w:hyperlink w:anchor="_Toc244023787" w:history="1">
             <w:r>
               <w:rPr>
                 <w:rStyle w:val="Hyperlink"/>
@@ -2204,7 +2036,7 @@
               <w:rPr>
                 <w:noProof/>
               </w:rPr>
-              <w:instrText xml:space="preserve"> PAGEREF _Toc243734742 \h </w:instrText>
+              <w:instrText xml:space="preserve"> PAGEREF _Toc244023787 \h </w:instrText>
             </w:r>
             <w:r>
               <w:rPr>
@@ -2247,7 +2079,7 @@
               <w14:ligatures w14:val="standardContextual"/>
             </w:rPr>
           </w:pPr>
-          <w:hyperlink w:anchor="_Toc243734743" w:history="1">
+          <w:hyperlink w:anchor="_Toc244023788" w:history="1">
             <w:r>
               <w:rPr>
                 <w:rStyle w:val="Hyperlink"/>
@@ -2271,7 +2103,7 @@
               <w:rPr>
                 <w:noProof/>
               </w:rPr>
-              <w:instrText xml:space="preserve"> PAGEREF _Toc243734743 \h </w:instrText>
+              <w:instrText xml:space="preserve"> PAGEREF _Toc244023788 \h </w:instrText>
             </w:r>
             <w:r>
               <w:rPr>
@@ -2314,13 +2146,13 @@
               <w14:ligatures w14:val="standardContextual"/>
             </w:rPr>
           </w:pPr>
-          <w:hyperlink w:anchor="_Toc243734744" w:history="1">
+          <w:hyperlink w:anchor="_Toc244023789" w:history="1">
             <w:r>
               <w:rPr>
                 <w:rStyle w:val="Hyperlink"/>
                 <w:noProof/>
               </w:rPr>
-              <w:t>Presentación del proyecto</w:t>
+              <w:t>Bibliografía (APA 7)</w:t>
             </w:r>
             <w:r>
               <w:rPr>
@@ -2338,7 +2170,7 @@
               <w:rPr>
                 <w:noProof/>
               </w:rPr>
-              <w:instrText xml:space="preserve"> PAGEREF _Toc243734744 \h </w:instrText>
+              <w:instrText xml:space="preserve"> PAGEREF _Toc244023789 \h </w:instrText>
             </w:r>
             <w:r>
               <w:rPr>
@@ -2356,73 +2188,6 @@
                 <w:noProof/>
               </w:rPr>
               <w:t>11</w:t>
-            </w:r>
-            <w:r>
-              <w:rPr>
-                <w:noProof/>
-              </w:rPr>
-              <w:fldChar w:fldCharType="end"/>
-            </w:r>
-          </w:hyperlink>
-        </w:p>
-        <w:p>
-          <w:pPr>
-            <w:pStyle w:val="TOC1"/>
-            <w:tabs>
-              <w:tab w:val="right" w:leader="dot" w:pos="9628"/>
-            </w:tabs>
-            <w:rPr>
-              <w:rFonts w:asciiTheme="minorHAnsi" w:eastAsiaTheme="minorEastAsia" w:hAnsiTheme="minorHAnsi" w:cstheme="minorBidi"/>
-              <w:noProof/>
-              <w:color w:val="auto"/>
-              <w:kern w:val="2"/>
-              <w:sz w:val="24"/>
-              <w:szCs w:val="24"/>
-              <w14:ligatures w14:val="standardContextual"/>
-            </w:rPr>
-          </w:pPr>
-          <w:hyperlink w:anchor="_Toc243734745" w:history="1">
-            <w:r>
-              <w:rPr>
-                <w:rStyle w:val="Hyperlink"/>
-                <w:noProof/>
-              </w:rPr>
-              <w:t>Bibliografía (APA 7)</w:t>
-            </w:r>
-            <w:r>
-              <w:rPr>
-                <w:noProof/>
-              </w:rPr>
-              <w:tab/>
-            </w:r>
-            <w:r>
-              <w:rPr>
-                <w:noProof/>
-              </w:rPr>
-              <w:fldChar w:fldCharType="begin"/>
-            </w:r>
-            <w:r>
-              <w:rPr>
-                <w:noProof/>
-              </w:rPr>
-              <w:instrText xml:space="preserve"> PAGEREF _Toc243734745 \h </w:instrText>
-            </w:r>
-            <w:r>
-              <w:rPr>
-                <w:noProof/>
-              </w:rPr>
-            </w:r>
-            <w:r>
-              <w:rPr>
-                <w:noProof/>
-              </w:rPr>
-              <w:fldChar w:fldCharType="separate"/>
-            </w:r>
-            <w:r>
-              <w:rPr>
-                <w:noProof/>
-              </w:rPr>
-              <w:t>12</w:t>
             </w:r>
             <w:r>
               <w:rPr>
@@ -2448,7 +2213,7 @@
       <w:pPr>
         <w:pStyle w:val="Heading1"/>
       </w:pPr>
-      <w:bookmarkStart w:id="1" w:name="_Toc243734727"/>
+      <w:bookmarkStart w:id="1" w:name="_Toc244023772"/>
       <w:r>
         <w:lastRenderedPageBreak/>
         <w:t>Manejo inteligente de datos faltantes</w:t>
@@ -2459,7 +2224,7 @@
       <w:pPr>
         <w:pStyle w:val="Heading2"/>
       </w:pPr>
-      <w:bookmarkStart w:id="2" w:name="_Toc243734728"/>
+      <w:bookmarkStart w:id="2" w:name="_Toc244023773"/>
       <w:r>
         <w:t>Referencia al análisis de faltantes de S1</w:t>
       </w:r>
@@ -2490,21 +2255,7 @@
         <w:rPr>
           <w:szCs w:val="24"/>
         </w:rPr>
-        <w:t xml:space="preserve"> ninguna de las 25 variables del conjunto tiene valores faltantes. Las nueve comprobaciones que aplicamos entonces (duplicados de fila, códigos de programa repetidos, valores nulos, valores fuera de dominio y cuatro consistencias aritméticas) devolvieron cero incidencias, salvo dos casos marcados para revisión manual que resultaron ser datos legítimos. El porcentaje de faltantes por variable es 0,0 % en los 25 casos, así que no hay patrón MCAR, MAR ni MNAR que identificar en el sentido de </w:t>
-      </w:r>
-      <w:proofErr w:type="spellStart"/>
-      <w:r>
-        <w:rPr>
-          <w:szCs w:val="24"/>
-        </w:rPr>
-        <w:t>Rubin</w:t>
-      </w:r>
-      <w:proofErr w:type="spellEnd"/>
-      <w:r>
-        <w:rPr>
-          <w:szCs w:val="24"/>
-        </w:rPr>
-        <w:t xml:space="preserve"> (1976): no hay ausencia que clasificar.</w:t>
+        <w:t xml:space="preserve"> ninguna de las 25 variables del conjunto tiene valores faltantes. Las nueve comprobaciones que aplicamos entonces (duplicados de fila, códigos de programa repetidos, valores nulos, valores fuera de dominio y cuatro consistencias aritméticas) devolvieron cero incidencias, salvo dos casos marcados para revisión manual que resultaron ser datos legítimos. El porcentaje de faltantes por variable es 0,0 % en los 25 casos, así que no hay patrón MCAR, MAR ni MNAR que identificar en el sentido de Rubin (1976): no hay ausencia que clasificar.</w:t>
       </w:r>
     </w:p>
     <w:p>
@@ -2543,7 +2294,7 @@
       <w:pPr>
         <w:pStyle w:val="Heading2"/>
       </w:pPr>
-      <w:bookmarkStart w:id="3" w:name="_Toc243734729"/>
+      <w:bookmarkStart w:id="3" w:name="_Toc244023774"/>
       <w:r>
         <w:t>Imputación mediante regresión lineal múltiple</w:t>
       </w:r>
@@ -2562,21 +2313,7 @@
         <w:rPr>
           <w:szCs w:val="24"/>
         </w:rPr>
-        <w:t xml:space="preserve">Optamos por un experimento controlado de ausencia. Eliminamos valores de forma deliberada bajo los tres mecanismos que distingue la literatura (Little y </w:t>
-      </w:r>
-      <w:proofErr w:type="spellStart"/>
-      <w:r>
-        <w:rPr>
-          <w:szCs w:val="24"/>
-        </w:rPr>
-        <w:t>Rubin</w:t>
-      </w:r>
-      <w:proofErr w:type="spellEnd"/>
-      <w:r>
-        <w:rPr>
-          <w:szCs w:val="24"/>
-        </w:rPr>
-        <w:t>, 2019) y comparamos cómo se comporta cada estrategia de tratamiento. El diseño tiene una ventaja que el trabajo con faltantes reales no ofrece</w:t>
+        <w:t>Optamos por un experimento controlado de ausencia. Eliminamos valores de forma deliberada bajo los tres mecanismos que distingue la literatura (Little y Rubin, 2019) y comparamos cómo se comporta cada estrategia de tratamiento. El diseño tiene una ventaja que el trabajo con faltantes reales no ofrece</w:t>
       </w:r>
       <w:r>
         <w:rPr>
@@ -2798,14 +2535,12 @@
             <w:pPr>
               <w:spacing w:after="80"/>
             </w:pPr>
-            <w:proofErr w:type="spellStart"/>
             <w:r>
               <w:rPr>
                 <w:sz w:val="15"/>
               </w:rPr>
               <w:t>edad_promedio</w:t>
             </w:r>
-            <w:proofErr w:type="spellEnd"/>
           </w:p>
         </w:tc>
         <w:tc>
@@ -2923,14 +2658,12 @@
             <w:pPr>
               <w:spacing w:after="80"/>
             </w:pPr>
-            <w:proofErr w:type="spellStart"/>
             <w:r>
               <w:rPr>
                 <w:sz w:val="15"/>
               </w:rPr>
               <w:t>pct_mujeres</w:t>
             </w:r>
-            <w:proofErr w:type="spellEnd"/>
           </w:p>
         </w:tc>
         <w:tc>
@@ -3048,14 +2781,12 @@
             <w:pPr>
               <w:spacing w:after="80"/>
             </w:pPr>
-            <w:proofErr w:type="spellStart"/>
             <w:r>
               <w:rPr>
                 <w:sz w:val="15"/>
               </w:rPr>
               <w:t>log_matricula</w:t>
             </w:r>
-            <w:proofErr w:type="spellEnd"/>
           </w:p>
         </w:tc>
         <w:tc>
@@ -3377,23 +3108,7 @@
                 <w:b/>
                 <w:sz w:val="15"/>
               </w:rPr>
-              <w:t>Jarque-</w:t>
-            </w:r>
-            <w:proofErr w:type="spellStart"/>
-            <w:r>
-              <w:rPr>
-                <w:b/>
-                <w:sz w:val="15"/>
-              </w:rPr>
-              <w:t>Bera</w:t>
-            </w:r>
-            <w:proofErr w:type="spellEnd"/>
-            <w:r>
-              <w:rPr>
-                <w:b/>
-                <w:sz w:val="15"/>
-              </w:rPr>
-              <w:t xml:space="preserve"> p</w:t>
+              <w:t>Jarque-Bera p</w:t>
             </w:r>
           </w:p>
         </w:tc>
@@ -3407,21 +3122,12 @@
               <w:spacing w:after="80"/>
               <w:jc w:val="center"/>
             </w:pPr>
-            <w:proofErr w:type="spellStart"/>
             <w:r>
               <w:rPr>
                 <w:b/>
                 <w:sz w:val="15"/>
               </w:rPr>
-              <w:t>Breusch</w:t>
-            </w:r>
-            <w:proofErr w:type="spellEnd"/>
-            <w:r>
-              <w:rPr>
-                <w:b/>
-                <w:sz w:val="15"/>
-              </w:rPr>
-              <w:t>-Pagan p</w:t>
+              <w:t>Breusch-Pagan p</w:t>
             </w:r>
           </w:p>
         </w:tc>
@@ -3457,14 +3163,12 @@
             <w:pPr>
               <w:spacing w:after="80"/>
             </w:pPr>
-            <w:proofErr w:type="spellStart"/>
             <w:r>
               <w:rPr>
                 <w:sz w:val="15"/>
               </w:rPr>
               <w:t>edad_promedio</w:t>
             </w:r>
-            <w:proofErr w:type="spellEnd"/>
           </w:p>
         </w:tc>
         <w:tc>
@@ -3599,14 +3303,12 @@
             <w:pPr>
               <w:spacing w:after="80"/>
             </w:pPr>
-            <w:proofErr w:type="spellStart"/>
             <w:r>
               <w:rPr>
                 <w:sz w:val="15"/>
               </w:rPr>
               <w:t>pct_mujeres</w:t>
             </w:r>
-            <w:proofErr w:type="spellEnd"/>
           </w:p>
         </w:tc>
         <w:tc>
@@ -3742,14 +3444,12 @@
             <w:pPr>
               <w:spacing w:after="80"/>
             </w:pPr>
-            <w:proofErr w:type="spellStart"/>
             <w:r>
               <w:rPr>
                 <w:sz w:val="15"/>
               </w:rPr>
               <w:t>log_matricula</w:t>
             </w:r>
-            <w:proofErr w:type="spellEnd"/>
           </w:p>
         </w:tc>
         <w:tc>
@@ -3895,35 +3595,7 @@
         <w:rPr>
           <w:szCs w:val="24"/>
         </w:rPr>
-        <w:t>Los tres imputadores incumplen los supuestos clásicos. Jarque-</w:t>
-      </w:r>
-      <w:proofErr w:type="spellStart"/>
-      <w:r>
-        <w:rPr>
-          <w:szCs w:val="24"/>
-        </w:rPr>
-        <w:t>Bera</w:t>
-      </w:r>
-      <w:proofErr w:type="spellEnd"/>
-      <w:r>
-        <w:rPr>
-          <w:szCs w:val="24"/>
-        </w:rPr>
-        <w:t xml:space="preserve"> y </w:t>
-      </w:r>
-      <w:proofErr w:type="spellStart"/>
-      <w:r>
-        <w:rPr>
-          <w:szCs w:val="24"/>
-        </w:rPr>
-        <w:t>Breusch</w:t>
-      </w:r>
-      <w:proofErr w:type="spellEnd"/>
-      <w:r>
-        <w:rPr>
-          <w:szCs w:val="24"/>
-        </w:rPr>
-        <w:t xml:space="preserve">-Pagan rechazan la normalidad y la homocedasticidad de los residuos con p &lt; 0,001 en los tres casos, y el Durbin-Watson, entre 1,32 y 1,44, advierte de dependencia residual, algo coherente con que los programas se agrupen por institución. Hay que precisar qué implica eso. Si quisiéramos estimar los coeficientes del imputador e inferir sobre ellos, las violaciones importarían bastante; para predecir un valor puntual, que es el único uso que les damos aquí, importan mucho menos, porque la predicción por mínimos cuadrados sigue siendo el mejor predictor lineal insesgado en </w:t>
+        <w:t xml:space="preserve">Los tres imputadores incumplen los supuestos clásicos. Jarque-Bera y Breusch-Pagan rechazan la normalidad y la homocedasticidad de los residuos con p &lt; 0,001 en los tres casos, y el Durbin-Watson, entre 1,32 y 1,44, advierte de dependencia residual, algo coherente con que los programas se agrupen por institución. Hay que precisar qué implica eso. Si quisiéramos estimar los coeficientes del imputador e inferir sobre ellos, las violaciones importarían bastante; para predecir un valor puntual, que es el único uso que les damos aquí, importan mucho menos, porque la predicción por mínimos cuadrados sigue siendo el mejor predictor lineal insesgado en </w:t>
       </w:r>
       <w:r>
         <w:rPr>
@@ -3967,42 +3639,14 @@
         <w:rPr>
           <w:szCs w:val="24"/>
         </w:rPr>
-        <w:t>De los 6.188 valores ausentes, la regresión alcanzó a imputar 5.730, el 92,6 %: 1.443 en la edad, 1.910 en la proporción de mujeres y 2.377 en el tamaño. Los 458 restantes caen en filas donde faltaba también `</w:t>
-      </w:r>
-      <w:proofErr w:type="spellStart"/>
-      <w:r>
-        <w:rPr>
-          <w:szCs w:val="24"/>
-        </w:rPr>
-        <w:t>log_matricula</w:t>
-      </w:r>
-      <w:proofErr w:type="spellEnd"/>
-      <w:r>
-        <w:rPr>
-          <w:szCs w:val="24"/>
-        </w:rPr>
-        <w:t>`, que es predictora de `</w:t>
-      </w:r>
-      <w:proofErr w:type="spellStart"/>
-      <w:r>
-        <w:rPr>
-          <w:szCs w:val="24"/>
-        </w:rPr>
-        <w:t>pct_mujeres</w:t>
-      </w:r>
-      <w:proofErr w:type="spellEnd"/>
-      <w:r>
-        <w:rPr>
-          <w:szCs w:val="24"/>
-        </w:rPr>
-        <w:t>` y es, a la vez, la variable MNAR; en esas filas recurrimos a la mediana para no perderlas. El detalle nos pareció revelador: la ausencia no aleatoria contamina la imputación de las demás variables, porque inutiliza las predictoras.</w:t>
+        <w:t>De los 6.188 valores ausentes, la regresión alcanzó a imputar 5.730, el 92,6 %: 1.443 en la edad, 1.910 en la proporción de mujeres y 2.377 en el tamaño. Los 458 restantes caen en filas donde faltaba también `log_matricula`, que es predictora de `pct_mujeres` y es, a la vez, la variable MNAR; en esas filas recurrimos a la mediana para no perderlas. El detalle nos pareció revelador: la ausencia no aleatoria contamina la imputación de las demás variables, porque inutiliza las predictoras.</w:t>
       </w:r>
     </w:p>
     <w:p>
       <w:pPr>
         <w:pStyle w:val="Heading2"/>
       </w:pPr>
-      <w:bookmarkStart w:id="4" w:name="_Toc243734730"/>
+      <w:bookmarkStart w:id="4" w:name="_Toc244023775"/>
       <w:r>
         <w:t>Comparación de estrategias de imputación</w:t>
       </w:r>
@@ -4822,7 +4466,19 @@
         <w:rPr>
           <w:szCs w:val="24"/>
         </w:rPr>
-        <w:t>La primera es que conserva toda la muestra. La eliminación descarta el 52,5 % de los programas, y no al azar: bajo MAR y MNAR se pierden sobre todo los de mayor duración y los pequeños, de manera que el conjunto que sobrevive deja de representar al sistema. Nos parece el defecto más grave de los tres, porque ningún paso posterior lo corrige.</w:t>
+        <w:t>La primera es que conserva toda la muestra. La eliminación descarta el 52,5 % de los programas, y no al azar</w:t>
+      </w:r>
+      <w:r>
+        <w:rPr>
+          <w:szCs w:val="24"/>
+        </w:rPr>
+        <w:t>,</w:t>
+      </w:r>
+      <w:r>
+        <w:rPr>
+          <w:szCs w:val="24"/>
+        </w:rPr>
+        <w:t xml:space="preserve"> bajo MAR y MNAR se pierden sobre todo los de mayor duración y los pequeños, de manera que el conjunto que sobrevive deja de representar al sistema. Nos parece el defecto más grave de los tres, porque ningún paso posterior lo corrige.</w:t>
       </w:r>
     </w:p>
     <w:p>
@@ -4838,7 +4494,19 @@
         <w:rPr>
           <w:szCs w:val="24"/>
         </w:rPr>
-        <w:t>Las otras dos van juntas: preserva mejor las correlaciones de S1 y comete menos error. Su desvío medio, 0,0135, es el menor de los tres, y su RMSE es menor en las tres variables. Que la imputación simple sea la peor en correlaciones no es casualidad: sustituir variabilidad real por una constante atenúa las asociaciones, y se nota en que la desviación típica de lo que imputa es cero. La ventaja de la regresión es amplia donde el imputador tiene poder predictivo (2,876 frente a 3,641 en la edad) y mínima donde no lo tiene (0,2732 frente a 0,2758 en la proporción de mujeres), lo que confirma la lectura del R² anterior.</w:t>
+        <w:t>Las otras dos van juntas</w:t>
+      </w:r>
+      <w:r>
+        <w:rPr>
+          <w:szCs w:val="24"/>
+        </w:rPr>
+        <w:t xml:space="preserve">, </w:t>
+      </w:r>
+      <w:r>
+        <w:rPr>
+          <w:szCs w:val="24"/>
+        </w:rPr>
+        <w:t>preserva mejor las correlaciones de S1 y comete menos error. Su desvío medio, 0,0135, es el menor de los tres, y su RMSE es menor en las tres variables. Que la imputación simple sea la peor en correlaciones no es casualidad: sustituir variabilidad real por una constante atenúa las asociaciones, y se nota en que la desviación típica de lo que imputa es cero. La ventaja de la regresión es amplia donde el imputador tiene poder predictivo (2,876 frente a 3,641 en la edad) y mínima donde no lo tiene (0,2732 frente a 0,2758 en la proporción de mujeres), lo que confirma la lectura del R² anterior.</w:t>
       </w:r>
     </w:p>
     <w:p>
@@ -4854,28 +4522,14 @@
         <w:rPr>
           <w:szCs w:val="24"/>
         </w:rPr>
-        <w:t>Conviene no estirar la conclusión. Bajo MNAR ninguna estrategia recupera lo perdido: el sesgo medio de lo imputado en `</w:t>
-      </w:r>
-      <w:proofErr w:type="spellStart"/>
-      <w:r>
-        <w:rPr>
-          <w:szCs w:val="24"/>
-        </w:rPr>
-        <w:t>log_matricula</w:t>
-      </w:r>
-      <w:proofErr w:type="spellEnd"/>
-      <w:r>
-        <w:rPr>
-          <w:szCs w:val="24"/>
-        </w:rPr>
-        <w:t>` sigue siendo +0,395, porque la ausencia depende del valor que no se observa. La regresión reduce el error, pero no elimina el sesgo. Es una limitación del problema, no del método, y hay que declararla como tal.</w:t>
+        <w:t>Conviene no estirar la conclusión. Bajo MNAR ninguna estrategia recupera lo perdido: el sesgo medio de lo imputado en `log_matricula` sigue siendo +0,395, porque la ausencia depende del valor que no se observa. La regresión reduce el error, pero no elimina el sesgo. Es una limitación del problema, no del método, y hay que declararla como tal.</w:t>
       </w:r>
     </w:p>
     <w:p>
       <w:pPr>
         <w:pStyle w:val="Heading1"/>
       </w:pPr>
-      <w:bookmarkStart w:id="5" w:name="_Toc243734731"/>
+      <w:bookmarkStart w:id="5" w:name="_Toc244023776"/>
       <w:r>
         <w:t>Clasificación mediante regresión logística</w:t>
       </w:r>
@@ -4885,7 +4539,7 @@
       <w:pPr>
         <w:pStyle w:val="Heading2"/>
       </w:pPr>
-      <w:bookmarkStart w:id="6" w:name="_Toc243734732"/>
+      <w:bookmarkStart w:id="6" w:name="_Toc244023777"/>
       <w:r>
         <w:t>Preparación de datos informada por S1</w:t>
       </w:r>
@@ -4904,21 +4558,7 @@
         <w:rPr>
           <w:szCs w:val="24"/>
         </w:rPr>
-        <w:t xml:space="preserve">La variable respuesta es el abandono dicotomizado en el 50 %, el mismo umbral que estimó S1, donde el 54,94 % de los programas lo supera, y que S2 validó con el intervalo de Wilson, </w:t>
-      </w:r>
-      <w:proofErr w:type="spellStart"/>
-      <w:r>
-        <w:rPr>
-          <w:szCs w:val="24"/>
-        </w:rPr>
-        <w:t>bootstrap</w:t>
-      </w:r>
-      <w:proofErr w:type="spellEnd"/>
-      <w:r>
-        <w:rPr>
-          <w:szCs w:val="24"/>
-        </w:rPr>
-        <w:t xml:space="preserve"> y un contraste Z de una proporción. No introducimos aquí ningún umbral nuevo.</w:t>
+        <w:t>La variable respuesta es el abandono dicotomizado en el 50 %, el mismo umbral que estimó S1, donde el 54,94 % de los programas lo supera, y que S2 validó con el intervalo de Wilson, bootstrap y un contraste Z de una proporción. No introducimos aquí ningún umbral nuevo.</w:t>
       </w:r>
     </w:p>
     <w:p>
@@ -4966,21 +4606,7 @@
         <w:rPr>
           <w:szCs w:val="24"/>
         </w:rPr>
-        <w:t xml:space="preserve">Hay una limitación que preferimos declarar de entrada. La estratificación reparte los programas de una misma institución entre ambos conjuntos, y 138 de las 168 instituciones aparecen en los dos. S2 ya había advertido que esos programas no son observaciones independientes, así que parte del desempeño en prueba puede venir de que el modelo vio otros programas de la misma institución. La partición no lo corrige; el apartado 2.3 lo cuantifica con un </w:t>
-      </w:r>
-      <w:proofErr w:type="spellStart"/>
-      <w:r>
-        <w:rPr>
-          <w:szCs w:val="24"/>
-        </w:rPr>
-        <w:t>bootstrap</w:t>
-      </w:r>
-      <w:proofErr w:type="spellEnd"/>
-      <w:r>
-        <w:rPr>
-          <w:szCs w:val="24"/>
-        </w:rPr>
-        <w:t xml:space="preserve"> por institución.</w:t>
+        <w:t>Hay una limitación que preferimos declarar de entrada. La estratificación reparte los programas de una misma institución entre ambos conjuntos, y 138 de las 168 instituciones aparecen en los dos. S2 ya había advertido que esos programas no son observaciones independientes, así que parte del desempeño en prueba puede venir de que el modelo vio otros programas de la misma institución. La partición no lo corrige; el apartado 2.3 lo cuantifica con un bootstrap por institución.</w:t>
       </w:r>
     </w:p>
     <w:p>
@@ -5003,7 +4629,7 @@
       <w:pPr>
         <w:pStyle w:val="Heading2"/>
       </w:pPr>
-      <w:bookmarkStart w:id="7" w:name="_Toc243734733"/>
+      <w:bookmarkStart w:id="7" w:name="_Toc244023778"/>
       <w:r>
         <w:lastRenderedPageBreak/>
         <w:t>Selección de variables informada por S1 y S2</w:t>
@@ -5345,21 +4971,7 @@
               <w:rPr>
                 <w:sz w:val="15"/>
               </w:rPr>
-              <w:t xml:space="preserve">M2 — </w:t>
-            </w:r>
-            <w:proofErr w:type="spellStart"/>
-            <w:r>
-              <w:rPr>
-                <w:sz w:val="15"/>
-              </w:rPr>
-              <w:t>stepwise</w:t>
-            </w:r>
-            <w:proofErr w:type="spellEnd"/>
-            <w:r>
-              <w:rPr>
-                <w:sz w:val="15"/>
-              </w:rPr>
-              <w:t xml:space="preserve"> AIC</w:t>
+              <w:t>M2 — stepwise AIC</w:t>
             </w:r>
           </w:p>
         </w:tc>
@@ -5613,21 +5225,7 @@
         <w:rPr>
           <w:szCs w:val="24"/>
         </w:rPr>
-        <w:t xml:space="preserve">Cada variable del modelo de dominio entra con su cifra, y eso es lo que nos permite sostener que la selección no es arbitraria. Las cuatro continuas traen su correlación de S1 y su intervalo </w:t>
-      </w:r>
-      <w:proofErr w:type="spellStart"/>
-      <w:r>
-        <w:rPr>
-          <w:szCs w:val="24"/>
-        </w:rPr>
-        <w:t>bootstrap</w:t>
-      </w:r>
-      <w:proofErr w:type="spellEnd"/>
-      <w:r>
-        <w:rPr>
-          <w:szCs w:val="24"/>
-        </w:rPr>
-        <w:t xml:space="preserve"> de S2, que en los cuatro casos excluye el cero. Las tres categóricas entran por contrastes de S1.</w:t>
+        <w:t>Cada variable del modelo de dominio entra con su cifra, y eso es lo que nos permite sostener que la selección no es arbitraria. Las cuatro continuas traen su correlación de S1 y su intervalo bootstrap de S2, que en los cuatro casos excluye el cero. Las tres categóricas entran por contrastes de S1.</w:t>
       </w:r>
     </w:p>
     <w:p>
@@ -5761,14 +5359,12 @@
             <w:pPr>
               <w:spacing w:after="80"/>
             </w:pPr>
-            <w:proofErr w:type="spellStart"/>
             <w:r>
               <w:rPr>
                 <w:sz w:val="15"/>
               </w:rPr>
               <w:t>carrera_acreditada</w:t>
             </w:r>
-            <w:proofErr w:type="spellEnd"/>
           </w:p>
         </w:tc>
         <w:tc>
@@ -5835,14 +5431,12 @@
             <w:pPr>
               <w:spacing w:after="80"/>
             </w:pPr>
-            <w:proofErr w:type="spellStart"/>
             <w:r>
               <w:rPr>
                 <w:sz w:val="15"/>
               </w:rPr>
               <w:t>inst_acreditada</w:t>
             </w:r>
-            <w:proofErr w:type="spellEnd"/>
           </w:p>
         </w:tc>
         <w:tc>
@@ -5909,14 +5503,12 @@
             <w:pPr>
               <w:spacing w:after="80"/>
             </w:pPr>
-            <w:proofErr w:type="spellStart"/>
             <w:r>
               <w:rPr>
                 <w:sz w:val="15"/>
               </w:rPr>
               <w:t>log_matricula</w:t>
             </w:r>
-            <w:proofErr w:type="spellEnd"/>
           </w:p>
         </w:tc>
         <w:tc>
@@ -5983,14 +5575,12 @@
             <w:pPr>
               <w:spacing w:after="80"/>
             </w:pPr>
-            <w:proofErr w:type="spellStart"/>
             <w:r>
               <w:rPr>
                 <w:sz w:val="15"/>
               </w:rPr>
               <w:t>pct_mujeres</w:t>
             </w:r>
-            <w:proofErr w:type="spellEnd"/>
           </w:p>
         </w:tc>
         <w:tc>
@@ -6057,14 +5647,12 @@
             <w:pPr>
               <w:spacing w:after="80"/>
             </w:pPr>
-            <w:proofErr w:type="spellStart"/>
             <w:r>
               <w:rPr>
                 <w:sz w:val="15"/>
               </w:rPr>
               <w:t>clasificacion_institucion</w:t>
             </w:r>
-            <w:proofErr w:type="spellEnd"/>
           </w:p>
         </w:tc>
         <w:tc>
@@ -6097,21 +5685,7 @@
               <w:rPr>
                 <w:sz w:val="15"/>
               </w:rPr>
-              <w:t xml:space="preserve">V de </w:t>
-            </w:r>
-            <w:proofErr w:type="spellStart"/>
-            <w:r>
-              <w:rPr>
-                <w:sz w:val="15"/>
-              </w:rPr>
-              <w:t>Cramér</w:t>
-            </w:r>
-            <w:proofErr w:type="spellEnd"/>
-            <w:r>
-              <w:rPr>
-                <w:sz w:val="15"/>
-              </w:rPr>
-              <w:t xml:space="preserve"> = 0,103</w:t>
+              <w:t>V de Cramér = 0,103</w:t>
             </w:r>
           </w:p>
         </w:tc>
@@ -6145,14 +5719,12 @@
             <w:pPr>
               <w:spacing w:after="80"/>
             </w:pPr>
-            <w:proofErr w:type="spellStart"/>
             <w:r>
               <w:rPr>
                 <w:sz w:val="15"/>
               </w:rPr>
               <w:t>area_del_conocimiento</w:t>
             </w:r>
-            <w:proofErr w:type="spellEnd"/>
           </w:p>
         </w:tc>
         <w:tc>
@@ -6451,14 +6023,12 @@
             <w:pPr>
               <w:spacing w:after="80"/>
             </w:pPr>
-            <w:proofErr w:type="spellStart"/>
             <w:r>
               <w:rPr>
                 <w:sz w:val="15"/>
               </w:rPr>
               <w:t>inst_acreditada</w:t>
             </w:r>
-            <w:proofErr w:type="spellEnd"/>
           </w:p>
         </w:tc>
         <w:tc>
@@ -6579,14 +6149,12 @@
             <w:pPr>
               <w:spacing w:after="80"/>
             </w:pPr>
-            <w:proofErr w:type="spellStart"/>
             <w:r>
               <w:rPr>
                 <w:sz w:val="15"/>
               </w:rPr>
               <w:t>carrera_acreditada</w:t>
             </w:r>
-            <w:proofErr w:type="spellEnd"/>
           </w:p>
         </w:tc>
         <w:tc>
@@ -6707,14 +6275,12 @@
             <w:pPr>
               <w:spacing w:after="80"/>
             </w:pPr>
-            <w:proofErr w:type="spellStart"/>
             <w:r>
               <w:rPr>
                 <w:sz w:val="15"/>
               </w:rPr>
               <w:t>log_matricula</w:t>
             </w:r>
-            <w:proofErr w:type="spellEnd"/>
           </w:p>
         </w:tc>
         <w:tc>
@@ -6835,14 +6401,12 @@
             <w:pPr>
               <w:spacing w:after="80"/>
             </w:pPr>
-            <w:proofErr w:type="spellStart"/>
             <w:r>
               <w:rPr>
                 <w:sz w:val="15"/>
               </w:rPr>
               <w:t>pct_mujeres</w:t>
             </w:r>
-            <w:proofErr w:type="spellEnd"/>
           </w:p>
         </w:tc>
         <w:tc>
@@ -6987,43 +6551,7 @@
           <w:color w:val="444444"/>
           <w:sz w:val="18"/>
         </w:rPr>
-        <w:t>Tabla 7: Razón de momios de las cuatro variables del núcleo en los tres modelos. Las tablas completas de cada uno están en `S3/resultados/tablas/</w:t>
-      </w:r>
-      <w:proofErr w:type="spellStart"/>
-      <w:r>
-        <w:rPr>
-          <w:i/>
-          <w:color w:val="444444"/>
-          <w:sz w:val="18"/>
-        </w:rPr>
-        <w:t>odds_ratios</w:t>
-      </w:r>
-      <w:proofErr w:type="spellEnd"/>
-      <w:r>
-        <w:rPr>
-          <w:i/>
-          <w:color w:val="444444"/>
-          <w:sz w:val="18"/>
-        </w:rPr>
-        <w:t>_*.</w:t>
-      </w:r>
-      <w:proofErr w:type="spellStart"/>
-      <w:r>
-        <w:rPr>
-          <w:i/>
-          <w:color w:val="444444"/>
-          <w:sz w:val="18"/>
-        </w:rPr>
-        <w:t>csv</w:t>
-      </w:r>
-      <w:proofErr w:type="spellEnd"/>
-      <w:r>
-        <w:rPr>
-          <w:i/>
-          <w:color w:val="444444"/>
-          <w:sz w:val="18"/>
-        </w:rPr>
-        <w:t>`.</w:t>
+        <w:t>Tabla 7: Razón de momios de las cuatro variables del núcleo en los tres modelos. Las tablas completas de cada uno están en `S3/resultados/tablas/odds_ratios_*.csv`.</w:t>
       </w:r>
     </w:p>
     <w:tbl>
@@ -7110,23 +6638,7 @@
                 <w:b/>
                 <w:sz w:val="15"/>
               </w:rPr>
-              <w:t xml:space="preserve">M2 — </w:t>
-            </w:r>
-            <w:proofErr w:type="spellStart"/>
-            <w:r>
-              <w:rPr>
-                <w:b/>
-                <w:sz w:val="15"/>
-              </w:rPr>
-              <w:t>stepwise</w:t>
-            </w:r>
-            <w:proofErr w:type="spellEnd"/>
-            <w:r>
-              <w:rPr>
-                <w:b/>
-                <w:sz w:val="15"/>
-              </w:rPr>
-              <w:t xml:space="preserve"> AIC</w:t>
+              <w:t>M2 — stepwise AIC</w:t>
             </w:r>
           </w:p>
         </w:tc>
@@ -7200,14 +6712,12 @@
             <w:pPr>
               <w:spacing w:after="80"/>
             </w:pPr>
-            <w:proofErr w:type="spellStart"/>
             <w:r>
               <w:rPr>
                 <w:sz w:val="15"/>
               </w:rPr>
               <w:t>inst_acreditada</w:t>
             </w:r>
-            <w:proofErr w:type="spellEnd"/>
           </w:p>
         </w:tc>
         <w:tc>
@@ -7309,14 +6819,12 @@
             <w:pPr>
               <w:spacing w:after="80"/>
             </w:pPr>
-            <w:proofErr w:type="spellStart"/>
             <w:r>
               <w:rPr>
                 <w:sz w:val="15"/>
               </w:rPr>
               <w:t>carrera_acreditada</w:t>
             </w:r>
-            <w:proofErr w:type="spellEnd"/>
           </w:p>
         </w:tc>
         <w:tc>
@@ -7418,14 +6926,12 @@
             <w:pPr>
               <w:spacing w:after="80"/>
             </w:pPr>
-            <w:proofErr w:type="spellStart"/>
             <w:r>
               <w:rPr>
                 <w:sz w:val="15"/>
               </w:rPr>
               <w:t>log_matricula</w:t>
             </w:r>
-            <w:proofErr w:type="spellEnd"/>
           </w:p>
         </w:tc>
         <w:tc>
@@ -7528,14 +7034,12 @@
             <w:pPr>
               <w:spacing w:after="80"/>
             </w:pPr>
-            <w:proofErr w:type="spellStart"/>
             <w:r>
               <w:rPr>
                 <w:sz w:val="15"/>
               </w:rPr>
               <w:t>pct_mujeres</w:t>
             </w:r>
-            <w:proofErr w:type="spellEnd"/>
           </w:p>
         </w:tc>
         <w:tc>
@@ -7671,37 +7175,18 @@
         <w:rPr>
           <w:szCs w:val="24"/>
         </w:rPr>
-        <w:t xml:space="preserve">Los tres modelos coinciden en el núcleo. El </w:t>
-      </w:r>
-      <w:proofErr w:type="spellStart"/>
-      <w:r>
-        <w:rPr>
-          <w:szCs w:val="24"/>
-        </w:rPr>
-        <w:t>stepwise</w:t>
-      </w:r>
-      <w:proofErr w:type="spellEnd"/>
-      <w:r>
-        <w:rPr>
-          <w:szCs w:val="24"/>
-        </w:rPr>
-        <w:t xml:space="preserve"> por AIC agrega cuatro variables (proporción de técnico-profesional, duración, matrícula municipal y edad) y mejora el AIC en 24 unidades, pero empeora el BIC. El modelo reducido se queda solo con las cuatro continuas, y que los tres retengan las mismas cuatro corrobora la selección hecha a priori.</w:t>
+        <w:t>Los tres modelos coinciden en el núcleo. El stepwise por AIC agrega cuatro variables (proporción de técnico-profesional, duración, matrícula municipal y edad) y mejora el AIC en 24 unidades, pero empeora el BIC. El modelo reducido se queda solo con las cuatro continuas, y que los tres retengan las mismas cuatro corrobora la selección hecha a priori.</w:t>
       </w:r>
     </w:p>
     <w:p>
       <w:pPr>
         <w:pStyle w:val="Heading2"/>
       </w:pPr>
-      <w:bookmarkStart w:id="8" w:name="_Toc243734734"/>
-      <w:r>
-        <w:t xml:space="preserve">Evaluación de estabilidad mediante </w:t>
-      </w:r>
-      <w:proofErr w:type="spellStart"/>
-      <w:r>
-        <w:t>bootstrap</w:t>
+      <w:bookmarkStart w:id="8" w:name="_Toc244023779"/>
+      <w:r>
+        <w:t>Evaluación de estabilidad mediante bootstrap</w:t>
       </w:r>
       <w:bookmarkEnd w:id="8"/>
-      <w:proofErr w:type="spellEnd"/>
     </w:p>
     <w:p>
       <w:pPr>
@@ -7716,49 +7201,7 @@
         <w:rPr>
           <w:szCs w:val="24"/>
         </w:rPr>
-        <w:t xml:space="preserve">S2 aplicó </w:t>
-      </w:r>
-      <w:proofErr w:type="spellStart"/>
-      <w:r>
-        <w:rPr>
-          <w:szCs w:val="24"/>
-        </w:rPr>
-        <w:t>bootstrap</w:t>
-      </w:r>
-      <w:proofErr w:type="spellEnd"/>
-      <w:r>
-        <w:rPr>
-          <w:szCs w:val="24"/>
-        </w:rPr>
-        <w:t xml:space="preserve"> a estadísticos simples, como medias, proporciones y correlaciones, y comprobó que sus intervalos clásicos eran fiables. Aquí usamos la misma técnica (</w:t>
-      </w:r>
-      <w:proofErr w:type="spellStart"/>
-      <w:r>
-        <w:rPr>
-          <w:szCs w:val="24"/>
-        </w:rPr>
-        <w:t>Efron</w:t>
-      </w:r>
-      <w:proofErr w:type="spellEnd"/>
-      <w:r>
-        <w:rPr>
-          <w:szCs w:val="24"/>
-        </w:rPr>
-        <w:t xml:space="preserve"> y </w:t>
-      </w:r>
-      <w:proofErr w:type="spellStart"/>
-      <w:r>
-        <w:rPr>
-          <w:szCs w:val="24"/>
-        </w:rPr>
-        <w:t>Tibshirani</w:t>
-      </w:r>
-      <w:proofErr w:type="spellEnd"/>
-      <w:r>
-        <w:rPr>
-          <w:szCs w:val="24"/>
-        </w:rPr>
-        <w:t>, 1993) sobre un objeto más complejo: los coeficientes del modelo final, cuyos errores estándar dependen de supuestos asintóticos que con muestras finitas pueden fallar.</w:t>
+        <w:t>S2 aplicó bootstrap a estadísticos simples, como medias, proporciones y correlaciones, y comprobó que sus intervalos clásicos eran fiables. Aquí usamos la misma técnica (Efron y Tibshirani, 1993) sobre un objeto más complejo: los coeficientes del modelo final, cuyos errores estándar dependen de supuestos asintóticos que con muestras finitas pueden fallar.</w:t>
       </w:r>
     </w:p>
     <w:p>
@@ -7774,91 +7217,7 @@
         <w:rPr>
           <w:szCs w:val="24"/>
         </w:rPr>
-        <w:t xml:space="preserve">Ejecutamos dos </w:t>
-      </w:r>
-      <w:proofErr w:type="spellStart"/>
-      <w:r>
-        <w:rPr>
-          <w:szCs w:val="24"/>
-        </w:rPr>
-        <w:t>remuestreos</w:t>
-      </w:r>
-      <w:proofErr w:type="spellEnd"/>
-      <w:r>
-        <w:rPr>
-          <w:szCs w:val="24"/>
-        </w:rPr>
-        <w:t xml:space="preserve"> distintos, y la diferencia entre ambos es el resultado más informativo de este apartado. El </w:t>
-      </w:r>
-      <w:proofErr w:type="spellStart"/>
-      <w:r>
-        <w:rPr>
-          <w:szCs w:val="24"/>
-        </w:rPr>
-        <w:t>bootstrap</w:t>
-      </w:r>
-      <w:proofErr w:type="spellEnd"/>
-      <w:r>
-        <w:rPr>
-          <w:szCs w:val="24"/>
-        </w:rPr>
-        <w:t xml:space="preserve"> estándar </w:t>
-      </w:r>
-      <w:proofErr w:type="spellStart"/>
-      <w:r>
-        <w:rPr>
-          <w:szCs w:val="24"/>
-        </w:rPr>
-        <w:t>remuestrea</w:t>
-      </w:r>
-      <w:proofErr w:type="spellEnd"/>
-      <w:r>
-        <w:rPr>
-          <w:szCs w:val="24"/>
-        </w:rPr>
-        <w:t xml:space="preserve"> observaciones con reemplazo, que es el procedimiento que corresponde a la partición adoptada. El </w:t>
-      </w:r>
-      <w:proofErr w:type="spellStart"/>
-      <w:r>
-        <w:rPr>
-          <w:szCs w:val="24"/>
-        </w:rPr>
-        <w:t>bootstrap</w:t>
-      </w:r>
-      <w:proofErr w:type="spellEnd"/>
-      <w:r>
-        <w:rPr>
-          <w:szCs w:val="24"/>
-        </w:rPr>
-        <w:t xml:space="preserve"> por institución </w:t>
-      </w:r>
-      <w:proofErr w:type="spellStart"/>
-      <w:r>
-        <w:rPr>
-          <w:szCs w:val="24"/>
-        </w:rPr>
-        <w:t>remuestrea</w:t>
-      </w:r>
-      <w:proofErr w:type="spellEnd"/>
-      <w:r>
-        <w:rPr>
-          <w:szCs w:val="24"/>
-        </w:rPr>
-        <w:t xml:space="preserve"> las 164 instituciones del conjunto de entrenamiento y arrastra con ellas todos sus programas; lo presentamos como extensión y sirve para cuantificar la dependencia que S2 advirtió y que la partición estratificada no corrige. Se completaron 2.000 y 1.999 </w:t>
-      </w:r>
-      <w:proofErr w:type="spellStart"/>
-      <w:r>
-        <w:rPr>
-          <w:szCs w:val="24"/>
-        </w:rPr>
-        <w:t>remuestras</w:t>
-      </w:r>
-      <w:proofErr w:type="spellEnd"/>
-      <w:r>
-        <w:rPr>
-          <w:szCs w:val="24"/>
-        </w:rPr>
-        <w:t>, respectivamente.</w:t>
+        <w:t>Ejecutamos dos remuestreos distintos, y la diferencia entre ambos es el resultado más informativo de este apartado. El bootstrap estándar remuestrea observaciones con reemplazo, que es el procedimiento que corresponde a la partición adoptada. El bootstrap por institución remuestrea las 164 instituciones del conjunto de entrenamiento y arrastra con ellas todos sus programas; lo presentamos como extensión y sirve para cuantificar la dependencia que S2 advirtió y que la partición estratificada no corrige. Se completaron 2.000 y 1.999 remuestras, respectivamente.</w:t>
       </w:r>
     </w:p>
     <w:p>
@@ -7959,23 +7318,7 @@
                 <w:b/>
                 <w:sz w:val="15"/>
               </w:rPr>
-              <w:t xml:space="preserve">IC </w:t>
-            </w:r>
-            <w:proofErr w:type="spellStart"/>
-            <w:r>
-              <w:rPr>
-                <w:b/>
-                <w:sz w:val="15"/>
-              </w:rPr>
-              <w:t>bootstrap</w:t>
-            </w:r>
-            <w:proofErr w:type="spellEnd"/>
-            <w:r>
-              <w:rPr>
-                <w:b/>
-                <w:sz w:val="15"/>
-              </w:rPr>
-              <w:t xml:space="preserve"> estándar</w:t>
+              <w:t>IC bootstrap estándar</w:t>
             </w:r>
           </w:p>
         </w:tc>
@@ -8013,17 +7356,8 @@
                 <w:b/>
                 <w:sz w:val="15"/>
               </w:rPr>
-              <w:t xml:space="preserve">Amplitud </w:t>
-            </w:r>
-            <w:proofErr w:type="spellStart"/>
-            <w:r>
-              <w:rPr>
-                <w:b/>
-                <w:sz w:val="15"/>
-              </w:rPr>
-              <w:t>bootstrap</w:t>
-            </w:r>
-            <w:proofErr w:type="spellEnd"/>
+              <w:t>Amplitud bootstrap</w:t>
+            </w:r>
           </w:p>
         </w:tc>
         <w:tc>
@@ -8077,14 +7411,12 @@
             <w:pPr>
               <w:spacing w:after="80"/>
             </w:pPr>
-            <w:proofErr w:type="spellStart"/>
             <w:r>
               <w:rPr>
                 <w:sz w:val="15"/>
               </w:rPr>
               <w:t>inst_acreditada</w:t>
             </w:r>
-            <w:proofErr w:type="spellEnd"/>
           </w:p>
         </w:tc>
         <w:tc>
@@ -8100,21 +7432,7 @@
               <w:rPr>
                 <w:sz w:val="15"/>
               </w:rPr>
-              <w:t>[−</w:t>
-            </w:r>
-            <w:proofErr w:type="gramStart"/>
-            <w:r>
-              <w:rPr>
-                <w:sz w:val="15"/>
-              </w:rPr>
-              <w:t>0,529 ;</w:t>
-            </w:r>
-            <w:proofErr w:type="gramEnd"/>
-            <w:r>
-              <w:rPr>
-                <w:sz w:val="15"/>
-              </w:rPr>
-              <w:t xml:space="preserve"> −0,385]</w:t>
+              <w:t>[−0,529 ; −0,385]</w:t>
             </w:r>
           </w:p>
         </w:tc>
@@ -8131,21 +7449,7 @@
               <w:rPr>
                 <w:sz w:val="15"/>
               </w:rPr>
-              <w:t>[−</w:t>
-            </w:r>
-            <w:proofErr w:type="gramStart"/>
-            <w:r>
-              <w:rPr>
-                <w:sz w:val="15"/>
-              </w:rPr>
-              <w:t>0,541 ;</w:t>
-            </w:r>
-            <w:proofErr w:type="gramEnd"/>
-            <w:r>
-              <w:rPr>
-                <w:sz w:val="15"/>
-              </w:rPr>
-              <w:t xml:space="preserve"> −0,381]</w:t>
+              <w:t>[−0,541 ; −0,381]</w:t>
             </w:r>
           </w:p>
         </w:tc>
@@ -8231,14 +7535,12 @@
             <w:pPr>
               <w:spacing w:after="80"/>
             </w:pPr>
-            <w:proofErr w:type="spellStart"/>
             <w:r>
               <w:rPr>
                 <w:sz w:val="15"/>
               </w:rPr>
               <w:t>carrera_acreditada</w:t>
             </w:r>
-            <w:proofErr w:type="spellEnd"/>
           </w:p>
         </w:tc>
         <w:tc>
@@ -8254,21 +7556,7 @@
               <w:rPr>
                 <w:sz w:val="15"/>
               </w:rPr>
-              <w:t>[−</w:t>
-            </w:r>
-            <w:proofErr w:type="gramStart"/>
-            <w:r>
-              <w:rPr>
-                <w:sz w:val="15"/>
-              </w:rPr>
-              <w:t>0,426 ;</w:t>
-            </w:r>
-            <w:proofErr w:type="gramEnd"/>
-            <w:r>
-              <w:rPr>
-                <w:sz w:val="15"/>
-              </w:rPr>
-              <w:t xml:space="preserve"> −0,310]</w:t>
+              <w:t>[−0,426 ; −0,310]</w:t>
             </w:r>
           </w:p>
         </w:tc>
@@ -8285,21 +7573,7 @@
               <w:rPr>
                 <w:sz w:val="15"/>
               </w:rPr>
-              <w:t>[−</w:t>
-            </w:r>
-            <w:proofErr w:type="gramStart"/>
-            <w:r>
-              <w:rPr>
-                <w:sz w:val="15"/>
-              </w:rPr>
-              <w:t>0,428 ;</w:t>
-            </w:r>
-            <w:proofErr w:type="gramEnd"/>
-            <w:r>
-              <w:rPr>
-                <w:sz w:val="15"/>
-              </w:rPr>
-              <w:t xml:space="preserve"> −0,311]</w:t>
+              <w:t>[−0,428 ; −0,311]</w:t>
             </w:r>
           </w:p>
         </w:tc>
@@ -8384,14 +7658,12 @@
             <w:pPr>
               <w:spacing w:after="80"/>
             </w:pPr>
-            <w:proofErr w:type="spellStart"/>
             <w:r>
               <w:rPr>
                 <w:sz w:val="15"/>
               </w:rPr>
               <w:t>log_matricula</w:t>
             </w:r>
-            <w:proofErr w:type="spellEnd"/>
           </w:p>
         </w:tc>
         <w:tc>
@@ -8407,21 +7679,7 @@
               <w:rPr>
                 <w:sz w:val="15"/>
               </w:rPr>
-              <w:t>[−</w:t>
-            </w:r>
-            <w:proofErr w:type="gramStart"/>
-            <w:r>
-              <w:rPr>
-                <w:sz w:val="15"/>
-              </w:rPr>
-              <w:t>0,390 ;</w:t>
-            </w:r>
-            <w:proofErr w:type="gramEnd"/>
-            <w:r>
-              <w:rPr>
-                <w:sz w:val="15"/>
-              </w:rPr>
-              <w:t xml:space="preserve"> −0,266]</w:t>
+              <w:t>[−0,390 ; −0,266]</w:t>
             </w:r>
           </w:p>
         </w:tc>
@@ -8438,21 +7696,7 @@
               <w:rPr>
                 <w:sz w:val="15"/>
               </w:rPr>
-              <w:t>[−</w:t>
-            </w:r>
-            <w:proofErr w:type="gramStart"/>
-            <w:r>
-              <w:rPr>
-                <w:sz w:val="15"/>
-              </w:rPr>
-              <w:t>0,395 ;</w:t>
-            </w:r>
-            <w:proofErr w:type="gramEnd"/>
-            <w:r>
-              <w:rPr>
-                <w:sz w:val="15"/>
-              </w:rPr>
-              <w:t xml:space="preserve"> −0,270]</w:t>
+              <w:t>[−0,395 ; −0,270]</w:t>
             </w:r>
           </w:p>
         </w:tc>
@@ -8537,14 +7781,12 @@
             <w:pPr>
               <w:spacing w:after="80"/>
             </w:pPr>
-            <w:proofErr w:type="spellStart"/>
             <w:r>
               <w:rPr>
                 <w:sz w:val="15"/>
               </w:rPr>
               <w:t>pct_mujeres</w:t>
             </w:r>
-            <w:proofErr w:type="spellEnd"/>
           </w:p>
         </w:tc>
         <w:tc>
@@ -8560,21 +7802,7 @@
               <w:rPr>
                 <w:sz w:val="15"/>
               </w:rPr>
-              <w:t>[−</w:t>
-            </w:r>
-            <w:proofErr w:type="gramStart"/>
-            <w:r>
-              <w:rPr>
-                <w:sz w:val="15"/>
-              </w:rPr>
-              <w:t>0,346 ;</w:t>
-            </w:r>
-            <w:proofErr w:type="gramEnd"/>
-            <w:r>
-              <w:rPr>
-                <w:sz w:val="15"/>
-              </w:rPr>
-              <w:t xml:space="preserve"> −0,197]</w:t>
+              <w:t>[−0,346 ; −0,197]</w:t>
             </w:r>
           </w:p>
         </w:tc>
@@ -8591,21 +7819,7 @@
               <w:rPr>
                 <w:sz w:val="15"/>
               </w:rPr>
-              <w:t>[−</w:t>
-            </w:r>
-            <w:proofErr w:type="gramStart"/>
-            <w:r>
-              <w:rPr>
-                <w:sz w:val="15"/>
-              </w:rPr>
-              <w:t>0,352 ;</w:t>
-            </w:r>
-            <w:proofErr w:type="gramEnd"/>
-            <w:r>
-              <w:rPr>
-                <w:sz w:val="15"/>
-              </w:rPr>
-              <w:t xml:space="preserve"> −0,196]</w:t>
+              <w:t>[−0,352 ; −0,196]</w:t>
             </w:r>
           </w:p>
         </w:tc>
@@ -8735,234 +7949,88 @@
           <w:color w:val="444444"/>
           <w:sz w:val="18"/>
         </w:rPr>
-        <w:t xml:space="preserve">Figura 2: Distribuciones </w:t>
-      </w:r>
-      <w:proofErr w:type="spellStart"/>
+        <w:t>Figura 2: Distribuciones bootstrap de los cuatro coeficientes continuos (2.000 remuestras de observaciones). Las líneas comparan el intervalo clásico, el bootstrap estándar y el bootstrap por institución.</w:t>
+      </w:r>
+    </w:p>
+    <w:p>
+      <w:pPr>
+        <w:spacing w:after="80"/>
+        <w:jc w:val="both"/>
+        <w:rPr>
+          <w:sz w:val="20"/>
+        </w:rPr>
+      </w:pPr>
+    </w:p>
+    <w:p>
+      <w:pPr>
+        <w:spacing w:after="80"/>
+        <w:jc w:val="both"/>
+        <w:rPr>
+          <w:sz w:val="24"/>
+          <w:szCs w:val="24"/>
+        </w:rPr>
+      </w:pPr>
+      <w:r>
+        <w:rPr>
+          <w:szCs w:val="24"/>
+        </w:rPr>
+        <w:t>El bootstrap estándar confirma los intervalos clásicos. La razón de amplitudes queda entre 1,00 y 1,12 en las cuatro variables continuas: los intervalos remuestreados reproducen casi exactamente los analíticos. Es el mismo veredicto que S2 emitió sobre medias y correlaciones, ahora extendido a los coeficientes de un modelo, y significa que los errores estándar del ajuste son fiables bajo el muestreo que la pauta supone. De los veinte coeficientes, dieciséis resultan estables y cuatro, todos categóricos, tienen intervalos que cruzan el cero.</w:t>
+      </w:r>
+    </w:p>
+    <w:p>
+      <w:pPr>
+        <w:spacing w:after="80"/>
+        <w:jc w:val="both"/>
+        <w:rPr>
+          <w:sz w:val="24"/>
+          <w:szCs w:val="24"/>
+        </w:rPr>
+      </w:pPr>
+      <w:r>
+        <w:rPr>
+          <w:szCs w:val="24"/>
+        </w:rPr>
+        <w:t>El bootstrap por institución cuenta otra historia. Al remuestrear instituciones en lugar de programas, los intervalos se ensanchan entre 1,62 y 3,01 veces respecto de los clásicos, y los coeficientes cuyo signo deja de estar determinado pasan de cuatro a siete de veinte. El caso extremo es la acreditación institucional, cuyo intervalo se triplica.</w:t>
+      </w:r>
+    </w:p>
+    <w:p>
+      <w:pPr>
+        <w:spacing w:after="80"/>
+        <w:jc w:val="both"/>
+        <w:rPr>
+          <w:sz w:val="24"/>
+          <w:szCs w:val="24"/>
+        </w:rPr>
+      </w:pPr>
+      <w:r>
+        <w:rPr>
+          <w:szCs w:val="24"/>
+        </w:rPr>
+        <w:t>Las dos conclusiones no se contradicen, porque responden a preguntas distintas. La primera dice que, si los programas fueran independientes, la precisión declarada sería correcta. La segunda dice que no lo son, y que al tenerlo en cuenta la precisión real es entre dos y tres veces menor (Cameron et al., 2008). La dependencia entre programas de una misma institución es la fuente de incertidumbre que el ajuste clásico no ve.</w:t>
+      </w:r>
+    </w:p>
+    <w:p>
+      <w:pPr>
+        <w:pStyle w:val="Heading2"/>
+      </w:pPr>
+      <w:bookmarkStart w:id="9" w:name="_Toc244023780"/>
+      <w:r>
+        <w:lastRenderedPageBreak/>
+        <w:t>Diagnóstico de supuestos</w:t>
+      </w:r>
+      <w:bookmarkEnd w:id="9"/>
+    </w:p>
+    <w:p>
+      <w:pPr>
+        <w:spacing w:before="120" w:after="60"/>
+      </w:pPr>
       <w:r>
         <w:rPr>
           <w:i/>
           <w:color w:val="444444"/>
           <w:sz w:val="18"/>
         </w:rPr>
-        <w:t>bootstrap</w:t>
-      </w:r>
-      <w:proofErr w:type="spellEnd"/>
-      <w:r>
-        <w:rPr>
-          <w:i/>
-          <w:color w:val="444444"/>
-          <w:sz w:val="18"/>
-        </w:rPr>
-        <w:t xml:space="preserve"> de los cuatro coeficientes continuos (2.000 </w:t>
-      </w:r>
-      <w:proofErr w:type="spellStart"/>
-      <w:r>
-        <w:rPr>
-          <w:i/>
-          <w:color w:val="444444"/>
-          <w:sz w:val="18"/>
-        </w:rPr>
-        <w:t>remuestras</w:t>
-      </w:r>
-      <w:proofErr w:type="spellEnd"/>
-      <w:r>
-        <w:rPr>
-          <w:i/>
-          <w:color w:val="444444"/>
-          <w:sz w:val="18"/>
-        </w:rPr>
-        <w:t xml:space="preserve"> de observaciones). Las líneas comparan el intervalo clásico, el </w:t>
-      </w:r>
-      <w:proofErr w:type="spellStart"/>
-      <w:r>
-        <w:rPr>
-          <w:i/>
-          <w:color w:val="444444"/>
-          <w:sz w:val="18"/>
-        </w:rPr>
-        <w:t>bootstrap</w:t>
-      </w:r>
-      <w:proofErr w:type="spellEnd"/>
-      <w:r>
-        <w:rPr>
-          <w:i/>
-          <w:color w:val="444444"/>
-          <w:sz w:val="18"/>
-        </w:rPr>
-        <w:t xml:space="preserve"> estándar y el </w:t>
-      </w:r>
-      <w:proofErr w:type="spellStart"/>
-      <w:r>
-        <w:rPr>
-          <w:i/>
-          <w:color w:val="444444"/>
-          <w:sz w:val="18"/>
-        </w:rPr>
-        <w:t>bootstrap</w:t>
-      </w:r>
-      <w:proofErr w:type="spellEnd"/>
-      <w:r>
-        <w:rPr>
-          <w:i/>
-          <w:color w:val="444444"/>
-          <w:sz w:val="18"/>
-        </w:rPr>
-        <w:t xml:space="preserve"> por institución.</w:t>
-      </w:r>
-    </w:p>
-    <w:p>
-      <w:pPr>
-        <w:spacing w:after="80"/>
-        <w:jc w:val="both"/>
-        <w:rPr>
-          <w:sz w:val="20"/>
-        </w:rPr>
-      </w:pPr>
-    </w:p>
-    <w:p>
-      <w:pPr>
-        <w:spacing w:after="80"/>
-        <w:jc w:val="both"/>
-        <w:rPr>
-          <w:sz w:val="24"/>
-          <w:szCs w:val="24"/>
-        </w:rPr>
-      </w:pPr>
-      <w:r>
-        <w:rPr>
-          <w:szCs w:val="24"/>
-        </w:rPr>
-        <w:t xml:space="preserve">El </w:t>
-      </w:r>
-      <w:proofErr w:type="spellStart"/>
-      <w:r>
-        <w:rPr>
-          <w:szCs w:val="24"/>
-        </w:rPr>
-        <w:t>bootstrap</w:t>
-      </w:r>
-      <w:proofErr w:type="spellEnd"/>
-      <w:r>
-        <w:rPr>
-          <w:szCs w:val="24"/>
-        </w:rPr>
-        <w:t xml:space="preserve"> estándar confirma los intervalos clásicos. La razón de amplitudes queda entre 1,00 y 1,12 en las cuatro variables continuas: los intervalos </w:t>
-      </w:r>
-      <w:proofErr w:type="spellStart"/>
-      <w:r>
-        <w:rPr>
-          <w:szCs w:val="24"/>
-        </w:rPr>
-        <w:t>remuestreados</w:t>
-      </w:r>
-      <w:proofErr w:type="spellEnd"/>
-      <w:r>
-        <w:rPr>
-          <w:szCs w:val="24"/>
-        </w:rPr>
-        <w:t xml:space="preserve"> reproducen casi exactamente los analíticos. Es el mismo veredicto que S2 emitió sobre medias y correlaciones, ahora extendido a los coeficientes de un modelo, y significa que los errores estándar del ajuste son fiables bajo el muestreo que la pauta supone. De los veinte coeficientes, dieciséis resultan estables y cuatro, todos categóricos, tienen intervalos que cruzan el cero.</w:t>
-      </w:r>
-    </w:p>
-    <w:p>
-      <w:pPr>
-        <w:spacing w:after="80"/>
-        <w:jc w:val="both"/>
-        <w:rPr>
-          <w:sz w:val="24"/>
-          <w:szCs w:val="24"/>
-        </w:rPr>
-      </w:pPr>
-      <w:r>
-        <w:rPr>
-          <w:szCs w:val="24"/>
-        </w:rPr>
-        <w:t xml:space="preserve">El </w:t>
-      </w:r>
-      <w:proofErr w:type="spellStart"/>
-      <w:r>
-        <w:rPr>
-          <w:szCs w:val="24"/>
-        </w:rPr>
-        <w:t>bootstrap</w:t>
-      </w:r>
-      <w:proofErr w:type="spellEnd"/>
-      <w:r>
-        <w:rPr>
-          <w:szCs w:val="24"/>
-        </w:rPr>
-        <w:t xml:space="preserve"> por institución cuenta otra historia. Al </w:t>
-      </w:r>
-      <w:proofErr w:type="spellStart"/>
-      <w:r>
-        <w:rPr>
-          <w:szCs w:val="24"/>
-        </w:rPr>
-        <w:t>remuestrear</w:t>
-      </w:r>
-      <w:proofErr w:type="spellEnd"/>
-      <w:r>
-        <w:rPr>
-          <w:szCs w:val="24"/>
-        </w:rPr>
-        <w:t xml:space="preserve"> instituciones en lugar de programas, los intervalos se ensanchan entre 1,62 y 3,01 veces respecto de los clásicos, y los coeficientes cuyo signo deja de estar determinado pasan de cuatro a siete de veinte. El caso extremo es la acreditación institucional, cuyo intervalo se triplica.</w:t>
-      </w:r>
-    </w:p>
-    <w:p>
-      <w:pPr>
-        <w:spacing w:after="80"/>
-        <w:jc w:val="both"/>
-        <w:rPr>
-          <w:sz w:val="24"/>
-          <w:szCs w:val="24"/>
-        </w:rPr>
-      </w:pPr>
-      <w:r>
-        <w:rPr>
-          <w:szCs w:val="24"/>
-        </w:rPr>
-        <w:t>Las dos conclusiones no se contradicen, porque responden a preguntas distintas. La primera dice que, si los programas fueran independientes, la precisión declarada sería correcta. La segunda dice que no lo son, y que al tenerlo en cuenta la precisión real es entre dos y tres veces menor (Cameron et al., 2008). La dependencia entre programas de una misma institución es la fuente de incertidumbre que el ajuste clásico no ve.</w:t>
-      </w:r>
-    </w:p>
-    <w:p>
-      <w:pPr>
-        <w:pStyle w:val="Heading2"/>
-      </w:pPr>
-      <w:bookmarkStart w:id="9" w:name="_Toc243734735"/>
-      <w:r>
-        <w:lastRenderedPageBreak/>
-        <w:t>Diagnóstico de supuestos</w:t>
-      </w:r>
-      <w:bookmarkEnd w:id="9"/>
-    </w:p>
-    <w:p>
-      <w:pPr>
-        <w:spacing w:before="120" w:after="60"/>
-      </w:pPr>
-      <w:r>
-        <w:rPr>
-          <w:i/>
-          <w:color w:val="444444"/>
-          <w:sz w:val="18"/>
-        </w:rPr>
-        <w:t xml:space="preserve">Tabla 9: Colinealidad y linealidad en el </w:t>
-      </w:r>
-      <w:proofErr w:type="spellStart"/>
-      <w:r>
-        <w:rPr>
-          <w:i/>
-          <w:color w:val="444444"/>
-          <w:sz w:val="18"/>
-        </w:rPr>
-        <w:t>logit</w:t>
-      </w:r>
-      <w:proofErr w:type="spellEnd"/>
-      <w:r>
-        <w:rPr>
-          <w:i/>
-          <w:color w:val="444444"/>
-          <w:sz w:val="18"/>
-        </w:rPr>
-        <w:t xml:space="preserve"> de las variables continuas de M1.</w:t>
+        <w:t>Tabla 9: Colinealidad y linealidad en el logit de las variables continuas de M1.</w:t>
       </w:r>
     </w:p>
     <w:tbl>
@@ -9067,17 +8135,8 @@
                 <w:b/>
                 <w:sz w:val="15"/>
               </w:rPr>
-              <w:t>p de Box-</w:t>
-            </w:r>
-            <w:proofErr w:type="spellStart"/>
-            <w:r>
-              <w:rPr>
-                <w:b/>
-                <w:sz w:val="15"/>
-              </w:rPr>
-              <w:t>Tidwell</w:t>
-            </w:r>
-            <w:proofErr w:type="spellEnd"/>
+              <w:t>p de Box-Tidwell</w:t>
+            </w:r>
           </w:p>
         </w:tc>
         <w:tc>
@@ -9095,17 +8154,8 @@
                 <w:b/>
                 <w:sz w:val="15"/>
               </w:rPr>
-              <w:t xml:space="preserve">Linealidad en el </w:t>
-            </w:r>
-            <w:proofErr w:type="spellStart"/>
-            <w:r>
-              <w:rPr>
-                <w:b/>
-                <w:sz w:val="15"/>
-              </w:rPr>
-              <w:t>logit</w:t>
-            </w:r>
-            <w:proofErr w:type="spellEnd"/>
+              <w:t>Linealidad en el logit</w:t>
+            </w:r>
           </w:p>
         </w:tc>
       </w:tr>
@@ -9121,14 +8171,12 @@
             <w:pPr>
               <w:spacing w:after="80"/>
             </w:pPr>
-            <w:proofErr w:type="spellStart"/>
             <w:r>
               <w:rPr>
                 <w:sz w:val="15"/>
               </w:rPr>
               <w:t>carrera_acreditada</w:t>
             </w:r>
-            <w:proofErr w:type="spellEnd"/>
           </w:p>
         </w:tc>
         <w:tc>
@@ -9213,14 +8261,12 @@
             <w:pPr>
               <w:spacing w:after="80"/>
             </w:pPr>
-            <w:proofErr w:type="spellStart"/>
             <w:r>
               <w:rPr>
                 <w:sz w:val="15"/>
               </w:rPr>
               <w:t>inst_acreditada</w:t>
             </w:r>
-            <w:proofErr w:type="spellEnd"/>
           </w:p>
         </w:tc>
         <w:tc>
@@ -9305,14 +8351,12 @@
             <w:pPr>
               <w:spacing w:after="80"/>
             </w:pPr>
-            <w:proofErr w:type="spellStart"/>
             <w:r>
               <w:rPr>
                 <w:sz w:val="15"/>
               </w:rPr>
               <w:t>log_matricula</w:t>
             </w:r>
-            <w:proofErr w:type="spellEnd"/>
           </w:p>
         </w:tc>
         <w:tc>
@@ -9396,14 +8440,12 @@
             <w:pPr>
               <w:spacing w:after="80"/>
             </w:pPr>
-            <w:proofErr w:type="spellStart"/>
             <w:r>
               <w:rPr>
                 <w:sz w:val="15"/>
               </w:rPr>
               <w:t>pct_mujeres</w:t>
             </w:r>
-            <w:proofErr w:type="spellEnd"/>
           </w:p>
         </w:tc>
         <w:tc>
@@ -9515,49 +8557,7 @@
         <w:rPr>
           <w:szCs w:val="24"/>
         </w:rPr>
-        <w:t xml:space="preserve">La linealidad en el </w:t>
-      </w:r>
-      <w:proofErr w:type="spellStart"/>
-      <w:r>
-        <w:rPr>
-          <w:szCs w:val="24"/>
-        </w:rPr>
-        <w:t>logit</w:t>
-      </w:r>
-      <w:proofErr w:type="spellEnd"/>
-      <w:r>
-        <w:rPr>
-          <w:szCs w:val="24"/>
-        </w:rPr>
-        <w:t xml:space="preserve"> sí se incumple. La prueba de Box-</w:t>
-      </w:r>
-      <w:proofErr w:type="spellStart"/>
-      <w:r>
-        <w:rPr>
-          <w:szCs w:val="24"/>
-        </w:rPr>
-        <w:t>Tidwell</w:t>
-      </w:r>
-      <w:proofErr w:type="spellEnd"/>
-      <w:r>
-        <w:rPr>
-          <w:szCs w:val="24"/>
-        </w:rPr>
-        <w:t xml:space="preserve"> (1962) rechaza la hipótesis en tres de las cuatro variables continuas, y solo el tamaño del programa la satisface. El efecto de la acreditación sobre el logaritmo de la razón de momios no es constante a lo largo de su rango, lo que significa que el modelo lineal es una aproximación y que los OR de la Tabla 6 hay que leerlos como efectos promedio, no uniformes. Corregirlo pediría términos polinómicos o una discretización por tramos (</w:t>
-      </w:r>
-      <w:proofErr w:type="spellStart"/>
-      <w:r>
-        <w:rPr>
-          <w:szCs w:val="24"/>
-        </w:rPr>
-        <w:t>Harrell</w:t>
-      </w:r>
-      <w:proofErr w:type="spellEnd"/>
-      <w:r>
-        <w:rPr>
-          <w:szCs w:val="24"/>
-        </w:rPr>
-        <w:t>, 2015), y lo dejamos señalado como la mejora más concreta para un trabajo posterior.</w:t>
+        <w:t>La linealidad en el logit sí se incumple. La prueba de Box-Tidwell (1962) rechaza la hipótesis en tres de las cuatro variables continuas, y solo el tamaño del programa la satisface. El efecto de la acreditación sobre el logaritmo de la razón de momios no es constante a lo largo de su rango, lo que significa que el modelo lineal es una aproximación y que los OR de la Tabla 6 hay que leerlos como efectos promedio, no uniformes. Corregirlo pediría términos polinómicos o una discretización por tramos (Harrell, 2015), y lo dejamos señalado como la mejora más concreta para un trabajo posterior.</w:t>
       </w:r>
     </w:p>
     <w:p>
@@ -9589,28 +8589,14 @@
         <w:rPr>
           <w:szCs w:val="24"/>
         </w:rPr>
-        <w:t xml:space="preserve">De los cuatro coeficientes, el de la acreditación institucional es el menos firme, y eso calza con que su intervalo sea también el que más se ensancha al </w:t>
-      </w:r>
-      <w:proofErr w:type="spellStart"/>
-      <w:r>
-        <w:rPr>
-          <w:szCs w:val="24"/>
-        </w:rPr>
-        <w:t>remuestrear</w:t>
-      </w:r>
-      <w:proofErr w:type="spellEnd"/>
-      <w:r>
-        <w:rPr>
-          <w:szCs w:val="24"/>
-        </w:rPr>
-        <w:t xml:space="preserve"> por institución, con una razón de 3,01. Es a la vez la variable de mayor efecto puntual y la de menor solidez, y cualquier recomendación de política que se apoye en ella debería decirlo. Conservamos todas las observaciones, por coherencia con lo que S2 decidió sobre los extremos, pero dejamos declarada la inestabilidad. La calibración, en cambio, es buena: la probabilidad predicha sigue de cerca la frecuencia observada por deciles.</w:t>
+        <w:t>De los cuatro coeficientes, el de la acreditación institucional es el menos firme, y eso calza con que su intervalo sea también el que más se ensancha al remuestrear por institución, con una razón de 3,01. Es a la vez la variable de mayor efecto puntual y la de menor solidez, y cualquier recomendación de política que se apoye en ella debería decirlo. Conservamos todas las observaciones, por coherencia con lo que S2 decidió sobre los extremos, pero dejamos declarada la inestabilidad. La calibración, en cambio, es buena: la probabilidad predicha sigue de cerca la frecuencia observada por deciles.</w:t>
       </w:r>
     </w:p>
     <w:p>
       <w:pPr>
         <w:pStyle w:val="Heading2"/>
       </w:pPr>
-      <w:bookmarkStart w:id="10" w:name="_Toc243734736"/>
+      <w:bookmarkStart w:id="10" w:name="_Toc244023781"/>
       <w:r>
         <w:t>Evaluación de desempeño predictivo</w:t>
       </w:r>
@@ -10075,21 +9061,7 @@
               <w:rPr>
                 <w:sz w:val="15"/>
               </w:rPr>
-              <w:t xml:space="preserve">M2 — </w:t>
-            </w:r>
-            <w:proofErr w:type="spellStart"/>
-            <w:r>
-              <w:rPr>
-                <w:sz w:val="15"/>
-              </w:rPr>
-              <w:t>stepwise</w:t>
-            </w:r>
-            <w:proofErr w:type="spellEnd"/>
-            <w:r>
-              <w:rPr>
-                <w:sz w:val="15"/>
-              </w:rPr>
-              <w:t xml:space="preserve"> AIC</w:t>
+              <w:t>M2 — stepwise AIC</w:t>
             </w:r>
           </w:p>
         </w:tc>
@@ -10426,21 +9398,7 @@
         <w:rPr>
           <w:szCs w:val="24"/>
         </w:rPr>
-        <w:t xml:space="preserve">Sobre la ponderación de clase hay que hacer una aclaración. La pauta pide incorporarla para mejorar el </w:t>
-      </w:r>
-      <w:proofErr w:type="spellStart"/>
-      <w:r>
-        <w:rPr>
-          <w:szCs w:val="24"/>
-        </w:rPr>
-        <w:t>recall</w:t>
-      </w:r>
-      <w:proofErr w:type="spellEnd"/>
-      <w:r>
-        <w:rPr>
-          <w:szCs w:val="24"/>
-        </w:rPr>
-        <w:t xml:space="preserve"> y en este conjunto el resultado va al revés. La ponderación equilibrada reduce el peso de la clase mayoritaria, y el recetario habitual da por hecho que la clase positiva es la minoritaria; acá pasa lo contrario, porque abandono alto es la mayoritaria con un 54,9 %. Los pesos quedan en 0,910 y 1,110, una razón de apenas 1,22, y el efecto se invierte.</w:t>
+        <w:t>Sobre la ponderación de clase hay que hacer una aclaración. La pauta pide incorporarla para mejorar el recall y en este conjunto el resultado va al revés. La ponderación equilibrada reduce el peso de la clase mayoritaria, y el recetario habitual da por hecho que la clase positiva es la minoritaria; acá pasa lo contrario, porque abandono alto es la mayoritaria con un 54,9 %. Los pesos quedan en 0,910 y 1,110, una razón de apenas 1,22, y el efecto se invierte.</w:t>
       </w:r>
     </w:p>
     <w:p>
@@ -11015,21 +9973,7 @@
               <w:rPr>
                 <w:sz w:val="15"/>
               </w:rPr>
-              <w:t xml:space="preserve">Sin ponderar, umbral de </w:t>
-            </w:r>
-            <w:proofErr w:type="spellStart"/>
-            <w:r>
-              <w:rPr>
-                <w:sz w:val="15"/>
-              </w:rPr>
-              <w:t>Youden</w:t>
-            </w:r>
-            <w:proofErr w:type="spellEnd"/>
-            <w:r>
-              <w:rPr>
-                <w:sz w:val="15"/>
-              </w:rPr>
-              <w:t xml:space="preserve"> 0,508</w:t>
+              <w:t>Sin ponderar, umbral de Youden 0,508</w:t>
             </w:r>
           </w:p>
         </w:tc>
@@ -11291,21 +10235,7 @@
         <w:rPr>
           <w:szCs w:val="24"/>
         </w:rPr>
-        <w:t xml:space="preserve">La ponderación baja la sensibilidad casi ocho puntos, de 0,754 a 0,674, y sube la especificidad de 0,587 a 0,652. El AUC no se mueve, 0,7301 frente a 0,7300, lo que confirma la lectura: la ponderación no altera el orden en que el modelo clasifica los programas, solo desplaza el corte efectivo. El umbral de </w:t>
-      </w:r>
-      <w:proofErr w:type="spellStart"/>
-      <w:r>
-        <w:rPr>
-          <w:szCs w:val="24"/>
-        </w:rPr>
-        <w:t>Youden</w:t>
-      </w:r>
-      <w:proofErr w:type="spellEnd"/>
-      <w:r>
-        <w:rPr>
-          <w:szCs w:val="24"/>
-        </w:rPr>
-        <w:t xml:space="preserve"> tampoco aporta nada, porque sale en 0,508, prácticamente el 0,50 de partida; con las clases casi equilibradas no hay un corte oculto que mejore las dos métricas a la vez.</w:t>
+        <w:t>La ponderación baja la sensibilidad casi ocho puntos, de 0,754 a 0,674, y sube la especificidad de 0,587 a 0,652. El AUC no se mueve, 0,7301 frente a 0,7300, lo que confirma la lectura: la ponderación no altera el orden en que el modelo clasifica los programas, solo desplaza el corte efectivo. El umbral de Youden tampoco aporta nada, porque sale en 0,508, prácticamente el 0,50 de partida; con las clases casi equilibradas no hay un corte oculto que mejore las dos métricas a la vez.</w:t>
       </w:r>
     </w:p>
     <w:p>
@@ -11321,21 +10251,7 @@
         <w:rPr>
           <w:szCs w:val="24"/>
         </w:rPr>
-        <w:t xml:space="preserve">La palanca que sí sube el </w:t>
-      </w:r>
-      <w:proofErr w:type="spellStart"/>
-      <w:r>
-        <w:rPr>
-          <w:szCs w:val="24"/>
-        </w:rPr>
-        <w:t>recall</w:t>
-      </w:r>
-      <w:proofErr w:type="spellEnd"/>
-      <w:r>
-        <w:rPr>
-          <w:szCs w:val="24"/>
-        </w:rPr>
-        <w:t xml:space="preserve"> es bajar el umbral. Con 0,418 la sensibilidad llega a 0,850, al precio de 13,1 puntos de especificidad y 3,4 de precisión. Para el uso que tenemos en mente el intercambio es favorable, porque omitir un programa en riesgo cuesta más que revisar uno sano. Y hay un argumento que no depende de esa preferencia: esa configuración consigue el mejor F1 de todas, 0,740, frente a 0,720 del umbral 0,50 y 0,709 de la línea base. Al umbral por defecto el modelo apenas le gana al clasificador trivial en F1; al 0,418 le gana con holgura. En este problema, elegir el umbral pesa más que ponderar y más que elegir entre los tres modelos.</w:t>
+        <w:t>La palanca que sí sube el recall es bajar el umbral. Con 0,418 la sensibilidad llega a 0,850, al precio de 13,1 puntos de especificidad y 3,4 de precisión. Para el uso que tenemos en mente el intercambio es favorable, porque omitir un programa en riesgo cuesta más que revisar uno sano. Y hay un argumento que no depende de esa preferencia: esa configuración consigue el mejor F1 de todas, 0,740, frente a 0,720 del umbral 0,50 y 0,709 de la línea base. Al umbral por defecto el modelo apenas le gana al clasificador trivial en F1; al 0,418 le gana con holgura. En este problema, elegir el umbral pesa más que ponderar y más que elegir entre los tres modelos.</w:t>
       </w:r>
     </w:p>
     <w:p>
@@ -11351,28 +10267,14 @@
         <w:rPr>
           <w:szCs w:val="24"/>
         </w:rPr>
-        <w:t>Para el modelo final nos quedamos con M1, el de dominio. Las diferencias entre los tres son pequeñas, con AUC de 0,712 a 0,733, así que la decisión no se juega en el desempeño. Pesó, primero, que M1 no fue seleccionado con estos datos: lo especificamos a partir de S1 y S2 antes de mirar el conjunto de entrenamiento, mientras que M2 se eligió sobre los mismos datos con los que después se ajusta, de modo que su ventaja de tres milésimas de AUC está sesgada al alza por el propio proceso de selección (</w:t>
-      </w:r>
-      <w:proofErr w:type="spellStart"/>
-      <w:r>
-        <w:rPr>
-          <w:szCs w:val="24"/>
-        </w:rPr>
-        <w:t>Harrell</w:t>
-      </w:r>
-      <w:proofErr w:type="spellEnd"/>
-      <w:r>
-        <w:rPr>
-          <w:szCs w:val="24"/>
-        </w:rPr>
-        <w:t>, 2015). Segundo, que cada variable tiene una justificación documentada, la de la Tabla 5. Y tercero, que M3 resulta demasiado austero: prescindir de las categóricas cuesta dos centésimas de AUC y lo deja bajo la línea base en F1, sin ganar interpretabilidad.</w:t>
+        <w:t>Para el modelo final nos quedamos con M1, el de dominio. Las diferencias entre los tres son pequeñas, con AUC de 0,712 a 0,733, así que la decisión no se juega en el desempeño. Pesó, primero, que M1 no fue seleccionado con estos datos: lo especificamos a partir de S1 y S2 antes de mirar el conjunto de entrenamiento, mientras que M2 se eligió sobre los mismos datos con los que después se ajusta, de modo que su ventaja de tres milésimas de AUC está sesgada al alza por el propio proceso de selección (Harrell, 2015). Segundo, que cada variable tiene una justificación documentada, la de la Tabla 5. Y tercero, que M3 resulta demasiado austero: prescindir de las categóricas cuesta dos centésimas de AUC y lo deja bajo la línea base en F1, sin ganar interpretabilidad.</w:t>
       </w:r>
     </w:p>
     <w:p>
       <w:pPr>
         <w:pStyle w:val="Heading1"/>
       </w:pPr>
-      <w:bookmarkStart w:id="11" w:name="_Toc243734737"/>
+      <w:bookmarkStart w:id="11" w:name="_Toc244023782"/>
       <w:r>
         <w:t>Análisis comparativo del impacto de la imputación</w:t>
       </w:r>
@@ -11592,31 +10494,13 @@
               <w:spacing w:after="80"/>
               <w:jc w:val="center"/>
             </w:pPr>
-            <w:proofErr w:type="spellStart"/>
             <w:r>
               <w:rPr>
                 <w:b/>
                 <w:sz w:val="15"/>
               </w:rPr>
-              <w:t>coef</w:t>
-            </w:r>
-            <w:proofErr w:type="spellEnd"/>
-            <w:r>
-              <w:rPr>
-                <w:b/>
-                <w:sz w:val="15"/>
-              </w:rPr>
-              <w:t xml:space="preserve"> </w:t>
-            </w:r>
-            <w:proofErr w:type="spellStart"/>
-            <w:r>
-              <w:rPr>
-                <w:b/>
-                <w:sz w:val="15"/>
-              </w:rPr>
-              <w:t>inst_acreditada</w:t>
-            </w:r>
-            <w:proofErr w:type="spellEnd"/>
+              <w:t>coef inst_acreditada</w:t>
+            </w:r>
           </w:p>
         </w:tc>
         <w:tc>
@@ -12129,35 +11013,7 @@
         <w:rPr>
           <w:szCs w:val="24"/>
         </w:rPr>
-        <w:t xml:space="preserve"> aunque coincidan entre sí. Corregirlo exige imputación múltiple con las reglas de combinación de </w:t>
-      </w:r>
-      <w:proofErr w:type="spellStart"/>
-      <w:r>
-        <w:rPr>
-          <w:szCs w:val="24"/>
-        </w:rPr>
-        <w:t>Rubin</w:t>
-      </w:r>
-      <w:proofErr w:type="spellEnd"/>
-      <w:r>
-        <w:rPr>
-          <w:szCs w:val="24"/>
-        </w:rPr>
-        <w:t xml:space="preserve"> (Little y </w:t>
-      </w:r>
-      <w:proofErr w:type="spellStart"/>
-      <w:r>
-        <w:rPr>
-          <w:szCs w:val="24"/>
-        </w:rPr>
-        <w:t>Rubin</w:t>
-      </w:r>
-      <w:proofErr w:type="spellEnd"/>
-      <w:r>
-        <w:rPr>
-          <w:szCs w:val="24"/>
-        </w:rPr>
-        <w:t>, 2019), que se sale del alcance de esta fase y queda como la extensión natural del trabajo.</w:t>
+        <w:t xml:space="preserve"> aunque coincidan entre sí. Corregirlo exige imputación múltiple con las reglas de combinación de Rubin (Little y Rubin, 2019), que se sale del alcance de esta fase y queda como la extensión natural del trabajo.</w:t>
       </w:r>
     </w:p>
     <w:p>
@@ -12196,7 +11052,7 @@
       <w:pPr>
         <w:pStyle w:val="Heading1"/>
       </w:pPr>
-      <w:bookmarkStart w:id="12" w:name="_Toc243734738"/>
+      <w:bookmarkStart w:id="12" w:name="_Toc244023783"/>
       <w:r>
         <w:t>Informe final integrado</w:t>
       </w:r>
@@ -12206,7 +11062,7 @@
       <w:pPr>
         <w:pStyle w:val="Heading2"/>
       </w:pPr>
-      <w:bookmarkStart w:id="13" w:name="_Toc243734739"/>
+      <w:bookmarkStart w:id="13" w:name="_Toc244023784"/>
       <w:r>
         <w:t>Resumen</w:t>
       </w:r>
@@ -12228,21 +11084,7 @@
         <w:rPr>
           <w:szCs w:val="24"/>
         </w:rPr>
-        <w:t xml:space="preserve">Sobre 9.678 programas de pregrado del sistema chileno de educación superior, el abandono aparente resulta </w:t>
-      </w:r>
-      <w:proofErr w:type="spellStart"/>
-      <w:r>
-        <w:rPr>
-          <w:szCs w:val="24"/>
-        </w:rPr>
-        <w:t>anticipable</w:t>
-      </w:r>
-      <w:proofErr w:type="spellEnd"/>
-      <w:r>
-        <w:rPr>
-          <w:szCs w:val="24"/>
-        </w:rPr>
-        <w:t xml:space="preserve"> en parte. Un modelo de regresión logística con siete variables alcanza un AUC de 0,730 en prueba y suma 12,9 puntos de exactitud sobre la línea base, lo que alcanza para priorizar </w:t>
+        <w:t xml:space="preserve">Sobre 9.678 programas de pregrado del sistema chileno de educación superior, el abandono aparente resulta anticipable en parte. Un modelo de regresión logística con siete variables alcanza un AUC de 0,730 en prueba y suma 12,9 puntos de exactitud sobre la línea base, lo que alcanza para priorizar </w:t>
       </w:r>
       <w:r>
         <w:rPr>
@@ -12254,49 +11096,7 @@
         <w:rPr>
           <w:szCs w:val="24"/>
         </w:rPr>
-        <w:t xml:space="preserve"> pero no para dictaminar sobre uno en particular. Cuatro factores sostienen esa capacidad y los cuatro reducen el riesgo: la acreditación institucional (OR 0,633 por desviación típica), la acreditación de la carrera (0,692), el tamaño del programa (0,720) y la proporción de mujeres (0,762). Son las mismas cuatro que resistieron el </w:t>
-      </w:r>
-      <w:proofErr w:type="spellStart"/>
-      <w:r>
-        <w:rPr>
-          <w:szCs w:val="24"/>
-        </w:rPr>
-        <w:t>remuestreo</w:t>
-      </w:r>
-      <w:proofErr w:type="spellEnd"/>
-      <w:r>
-        <w:rPr>
-          <w:szCs w:val="24"/>
-        </w:rPr>
-        <w:t xml:space="preserve"> en S2 y que retienen las tres selecciones de variables. El resultado metodológico que más nos importa es un contraste: el </w:t>
-      </w:r>
-      <w:proofErr w:type="spellStart"/>
-      <w:r>
-        <w:rPr>
-          <w:szCs w:val="24"/>
-        </w:rPr>
-        <w:t>bootstrap</w:t>
-      </w:r>
-      <w:proofErr w:type="spellEnd"/>
-      <w:r>
-        <w:rPr>
-          <w:szCs w:val="24"/>
-        </w:rPr>
-        <w:t xml:space="preserve"> estándar confirma los intervalos clásicos, con una razón de amplitudes de 1,00 a 1,12, pero el </w:t>
-      </w:r>
-      <w:proofErr w:type="spellStart"/>
-      <w:r>
-        <w:rPr>
-          <w:szCs w:val="24"/>
-        </w:rPr>
-        <w:t>bootstrap</w:t>
-      </w:r>
-      <w:proofErr w:type="spellEnd"/>
-      <w:r>
-        <w:rPr>
-          <w:szCs w:val="24"/>
-        </w:rPr>
-        <w:t xml:space="preserve"> por institución los ensancha entre 1,62 y 3,01 veces, porque los programas de una misma institución no son independientes.</w:t>
+        <w:t xml:space="preserve"> pero no para dictaminar sobre uno en particular. Cuatro factores sostienen esa capacidad y los cuatro reducen el riesgo: la acreditación institucional (OR 0,633 por desviación típica), la acreditación de la carrera (0,692), el tamaño del programa (0,720) y la proporción de mujeres (0,762). Son las mismas cuatro que resistieron el remuestreo en S2 y que retienen las tres selecciones de variables. El resultado metodológico que más nos importa es un contraste: el bootstrap estándar confirma los intervalos clásicos, con una razón de amplitudes de 1,00 a 1,12, pero el bootstrap por institución los ensancha entre 1,62 y 3,01 veces, porque los programas de una misma institución no son independientes.</w:t>
       </w:r>
     </w:p>
     <w:p>
@@ -12341,7 +11141,7 @@
       <w:pPr>
         <w:pStyle w:val="Heading2"/>
       </w:pPr>
-      <w:bookmarkStart w:id="14" w:name="_Toc243734740"/>
+      <w:bookmarkStart w:id="14" w:name="_Toc244023785"/>
       <w:r>
         <w:lastRenderedPageBreak/>
         <w:t>Metodología integrada.</w:t>
@@ -12364,28 +11164,14 @@
         <w:rPr>
           <w:szCs w:val="24"/>
         </w:rPr>
-        <w:t xml:space="preserve">Lo que define a esta fase es que casi ninguna decisión metodológica es nueva. Las predictoras de los imputadores salen de la matriz de correlaciones de S1; las variables del modelo, del filtro de estabilidad de S2, con su cifra cada una; el tratamiento de los 465 censurados, de la auditoría caso a caso que hizo S2; el umbral del 50 %, de S1 validado en S2; y el </w:t>
-      </w:r>
-      <w:proofErr w:type="spellStart"/>
-      <w:r>
-        <w:rPr>
-          <w:szCs w:val="24"/>
-        </w:rPr>
-        <w:t>bootstrap</w:t>
-      </w:r>
-      <w:proofErr w:type="spellEnd"/>
-      <w:r>
-        <w:rPr>
-          <w:szCs w:val="24"/>
-        </w:rPr>
-        <w:t xml:space="preserve"> de los coeficientes es el instrumento de S2 trasladado a un objeto más complejo. La cadena queda explícita: S1 describió y midió, S2 puso a prueba y validó, S3 modela y predice sobre lo que quedó en pie.</w:t>
+        <w:t>Lo que define a esta fase es que casi ninguna decisión metodológica es nueva. Las predictoras de los imputadores salen de la matriz de correlaciones de S1; las variables del modelo, del filtro de estabilidad de S2, con su cifra cada una; el tratamiento de los 465 censurados, de la auditoría caso a caso que hizo S2; el umbral del 50 %, de S1 validado en S2; y el bootstrap de los coeficientes es el instrumento de S2 trasladado a un objeto más complejo. La cadena queda explícita: S1 describió y midió, S2 puso a prueba y validó, S3 modela y predice sobre lo que quedó en pie.</w:t>
       </w:r>
     </w:p>
     <w:p>
       <w:pPr>
         <w:pStyle w:val="Heading2"/>
       </w:pPr>
-      <w:bookmarkStart w:id="15" w:name="_Toc243734741"/>
+      <w:bookmarkStart w:id="15" w:name="_Toc244023786"/>
       <w:r>
         <w:t>Resultados integrados.</w:t>
       </w:r>
@@ -12407,42 +11193,14 @@
         <w:rPr>
           <w:szCs w:val="24"/>
         </w:rPr>
-        <w:t xml:space="preserve">S1 estableció el abandono medio en 0,518 y nueve variables asociadas. S2 confirmó por </w:t>
-      </w:r>
-      <w:proofErr w:type="spellStart"/>
-      <w:r>
-        <w:rPr>
-          <w:szCs w:val="24"/>
-        </w:rPr>
-        <w:t>bootstrap</w:t>
-      </w:r>
-      <w:proofErr w:type="spellEnd"/>
-      <w:r>
-        <w:rPr>
-          <w:szCs w:val="24"/>
-        </w:rPr>
-        <w:t xml:space="preserve"> que los intervalos clásicos eran fiables, validó el contraste por permutación, separó las correlaciones sólidas de las débiles y cuantificó por Monte Carlo la ventaja de focalizar, que es un 38,9 % más de estudiantes alcanzados. S3 integra todo eso en un clasificador y agrega cuatro resultados propios. El mecanismo de ausencia importa más que su porcentaje, y bajo MNAR ninguna estrategia es insesgada. La imputación por regresión </w:t>
-      </w:r>
-      <w:proofErr w:type="gramStart"/>
-      <w:r>
-        <w:rPr>
-          <w:szCs w:val="24"/>
-        </w:rPr>
-        <w:t>le</w:t>
-      </w:r>
-      <w:proofErr w:type="gramEnd"/>
-      <w:r>
-        <w:rPr>
-          <w:szCs w:val="24"/>
-        </w:rPr>
-        <w:t xml:space="preserve"> gana a las otras dos en error y en preservación de correlaciones. La precisión del modelo es fiable bajo muestreo independiente, pero entre dos y tres veces menor al reconocer la dependencia institucional. Y el umbral de decisión pesa más que la ponderación de clase y que la elección entre los tres modelos.</w:t>
+        <w:t>S1 estableció el abandono medio en 0,518 y nueve variables asociadas. S2 confirmó por bootstrap que los intervalos clásicos eran fiables, validó el contraste por permutación, separó las correlaciones sólidas de las débiles y cuantificó por Monte Carlo la ventaja de focalizar, que es un 38,9 % más de estudiantes alcanzados. S3 integra todo eso en un clasificador y agrega cuatro resultados propios. El mecanismo de ausencia importa más que su porcentaje, y bajo MNAR ninguna estrategia es insesgada. La imputación por regresión le gana a las otras dos en error y en preservación de correlaciones. La precisión del modelo es fiable bajo muestreo independiente, pero entre dos y tres veces menor al reconocer la dependencia institucional. Y el umbral de decisión pesa más que la ponderación de clase y que la elección entre los tres modelos.</w:t>
       </w:r>
     </w:p>
     <w:p>
       <w:pPr>
         <w:pStyle w:val="Heading2"/>
       </w:pPr>
-      <w:bookmarkStart w:id="16" w:name="_Toc243734742"/>
+      <w:bookmarkStart w:id="16" w:name="_Toc244023787"/>
       <w:r>
         <w:t>Discusión.</w:t>
       </w:r>
@@ -12464,56 +11222,14 @@
         <w:rPr>
           <w:szCs w:val="24"/>
         </w:rPr>
-        <w:t xml:space="preserve">Hay cuatro tensiones que preferimos dejar escritas. La capacidad predictiva es moderada: un AUC de 0,730 ordena bien el conjunto, pero deja margen de error alto en el caso individual. La ganancia en F1 depende del umbral: al 0,50 el modelo apenas supera la línea base, 0,720 frente a 0,709, mientras que al 0,418 la supera con holgura, 0,740. El modelo lineal en el </w:t>
-      </w:r>
-      <w:proofErr w:type="spellStart"/>
-      <w:r>
-        <w:rPr>
-          <w:szCs w:val="24"/>
-        </w:rPr>
-        <w:t>logit</w:t>
-      </w:r>
-      <w:proofErr w:type="spellEnd"/>
-      <w:r>
-        <w:rPr>
-          <w:szCs w:val="24"/>
-        </w:rPr>
-        <w:t xml:space="preserve"> es una aproximación, porque Box-</w:t>
-      </w:r>
-      <w:proofErr w:type="spellStart"/>
-      <w:r>
-        <w:rPr>
-          <w:szCs w:val="24"/>
-        </w:rPr>
-        <w:t>Tidwell</w:t>
-      </w:r>
-      <w:proofErr w:type="spellEnd"/>
-      <w:r>
-        <w:rPr>
-          <w:szCs w:val="24"/>
-        </w:rPr>
-        <w:t xml:space="preserve"> lo rechaza en tres de las cuatro variables continuas. Y el coeficiente de la acreditación institucional es el menos firme de todos: su intervalo es el que más se ensancha al </w:t>
-      </w:r>
-      <w:proofErr w:type="spellStart"/>
-      <w:r>
-        <w:rPr>
-          <w:szCs w:val="24"/>
-        </w:rPr>
-        <w:t>remuestrear</w:t>
-      </w:r>
-      <w:proofErr w:type="spellEnd"/>
-      <w:r>
-        <w:rPr>
-          <w:szCs w:val="24"/>
-        </w:rPr>
-        <w:t xml:space="preserve"> por institución, y retirar las 237 observaciones influyentes lo mueve un 87,7 %. Es la variable de mayor efecto puntual y, a la vez, la de menor solidez.</w:t>
+        <w:t>Hay cuatro tensiones que preferimos dejar escritas. La capacidad predictiva es moderada: un AUC de 0,730 ordena bien el conjunto, pero deja margen de error alto en el caso individual. La ganancia en F1 depende del umbral: al 0,50 el modelo apenas supera la línea base, 0,720 frente a 0,709, mientras que al 0,418 la supera con holgura, 0,740. El modelo lineal en el logit es una aproximación, porque Box-Tidwell lo rechaza en tres de las cuatro variables continuas. Y el coeficiente de la acreditación institucional es el menos firme de todos: su intervalo es el que más se ensancha al remuestrear por institución, y retirar las 237 observaciones influyentes lo mueve un 87,7 %. Es la variable de mayor efecto puntual y, a la vez, la de menor solidez.</w:t>
       </w:r>
     </w:p>
     <w:p>
       <w:pPr>
         <w:pStyle w:val="Heading2"/>
       </w:pPr>
-      <w:bookmarkStart w:id="17" w:name="_Toc243734743"/>
+      <w:bookmarkStart w:id="17" w:name="_Toc244023788"/>
       <w:r>
         <w:t>Conclusiones.</w:t>
       </w:r>
@@ -12535,122 +11251,18 @@
         <w:rPr>
           <w:szCs w:val="24"/>
         </w:rPr>
-        <w:t xml:space="preserve">El abandono aparente se asocia de forma robusta con la acreditación, el tamaño y la composición de género, y un modelo construido sobre esas variables sirve para priorizar, con el umbral fijado según el costo relativo de los dos errores. No permite afirmar nada sobre estudiantes individuales, porque la unidad de análisis es el programa; nada sobre causas, porque no hay grupo de control; nada sobre el abandono real, porque lo que medimos es el aparente; y nada firme sobre los efectos categóricos, que pierden el signo al </w:t>
-      </w:r>
-      <w:proofErr w:type="spellStart"/>
-      <w:r>
-        <w:rPr>
-          <w:szCs w:val="24"/>
-        </w:rPr>
-        <w:t>remuestrear</w:t>
-      </w:r>
-      <w:proofErr w:type="spellEnd"/>
-      <w:r>
-        <w:rPr>
-          <w:szCs w:val="24"/>
-        </w:rPr>
-        <w:t xml:space="preserve"> por institución. La extensión natural del trabajo es triple: imputación múltiple, términos no lineales donde Box-</w:t>
-      </w:r>
-      <w:proofErr w:type="spellStart"/>
-      <w:r>
-        <w:rPr>
-          <w:szCs w:val="24"/>
-        </w:rPr>
-        <w:t>Tidwell</w:t>
-      </w:r>
-      <w:proofErr w:type="spellEnd"/>
-      <w:r>
-        <w:rPr>
-          <w:szCs w:val="24"/>
-        </w:rPr>
-        <w:t xml:space="preserve"> los exige y un modelo multinivel que trate la institución como efecto aleatorio.</w:t>
+        <w:t>El abandono aparente se asocia de forma robusta con la acreditación, el tamaño y la composición de género, y un modelo construido sobre esas variables sirve para priorizar, con el umbral fijado según el costo relativo de los dos errores. No permite afirmar nada sobre estudiantes individuales, porque la unidad de análisis es el programa; nada sobre causas, porque no hay grupo de control; nada sobre el abandono real, porque lo que medimos es el aparente; y nada firme sobre los efectos categóricos, que pierden el signo al remuestrear por institución. La extensión natural del trabajo es triple: imputación múltiple, términos no lineales donde Box-Tidwell los exige y un modelo multinivel que trate la institución como efecto aleatorio.</w:t>
       </w:r>
     </w:p>
     <w:p>
       <w:pPr>
         <w:pStyle w:val="Heading1"/>
       </w:pPr>
-      <w:bookmarkStart w:id="18" w:name="_Toc243734744"/>
-      <w:r>
-        <w:t>Presentación del proyecto</w:t>
+      <w:bookmarkStart w:id="18" w:name="_Toc244023789"/>
+      <w:r>
+        <w:t>Bibliografía (APA 7)</w:t>
       </w:r>
       <w:bookmarkEnd w:id="18"/>
-    </w:p>
-    <w:p>
-      <w:pPr>
-        <w:spacing w:after="80"/>
-        <w:jc w:val="both"/>
-        <w:rPr>
-          <w:sz w:val="24"/>
-          <w:szCs w:val="24"/>
-        </w:rPr>
-      </w:pPr>
-      <w:r>
-        <w:rPr>
-          <w:szCs w:val="24"/>
-        </w:rPr>
-        <w:t>La presentación se entrega en video de 10 minutos, grabado sobre el archivo `S3/</w:t>
-      </w:r>
-      <w:proofErr w:type="spellStart"/>
-      <w:r>
-        <w:rPr>
-          <w:szCs w:val="24"/>
-        </w:rPr>
-        <w:t>presentacion</w:t>
-      </w:r>
-      <w:proofErr w:type="spellEnd"/>
-      <w:r>
-        <w:rPr>
-          <w:szCs w:val="24"/>
-        </w:rPr>
-        <w:t>/Sumativa3_Presentacion_Grupo4.pptx`, con el guion cronometrado en las notas del orador de cada diapositiva.</w:t>
-      </w:r>
-    </w:p>
-    <w:p>
-      <w:pPr>
-        <w:spacing w:after="80"/>
-        <w:jc w:val="both"/>
-        <w:rPr>
-          <w:sz w:val="24"/>
-          <w:szCs w:val="24"/>
-        </w:rPr>
-      </w:pPr>
-      <w:r>
-        <w:rPr>
-          <w:szCs w:val="24"/>
-        </w:rPr>
-        <w:t xml:space="preserve">La estructura sigue la progresión que la pauta pide enfatizar: problema y datos (0:00–1:30); metodología integrada (1:30–4:10), que recorre la cadena S1 → S2 → S3 mostrando de qué resultado anterior proviene cada decisión de esta fase; resultados principales (4:10–7:40), con los cuatro factores, la comparación de estrategias de imputación y el hallazgo del </w:t>
-      </w:r>
-      <w:proofErr w:type="spellStart"/>
-      <w:r>
-        <w:rPr>
-          <w:szCs w:val="24"/>
-        </w:rPr>
-        <w:t>bootstrap</w:t>
-      </w:r>
-      <w:proofErr w:type="spellEnd"/>
-      <w:r>
-        <w:rPr>
-          <w:szCs w:val="24"/>
-        </w:rPr>
-        <w:t xml:space="preserve"> por institución; y conclusiones y recomendaciones (7:40–10:00), con lo que el modelo permite y lo que no, las cuatro recomendaciones sobre imputación y las tres extensiones propuestas.</w:t>
-      </w:r>
-    </w:p>
-    <w:p>
-      <w:pPr>
-        <w:pStyle w:val="Heading1"/>
-      </w:pPr>
-    </w:p>
-    <w:p>
-      <w:pPr>
-        <w:pStyle w:val="Heading1"/>
-      </w:pPr>
-      <w:bookmarkStart w:id="19" w:name="_Toc243734745"/>
-      <w:r>
-        <w:lastRenderedPageBreak/>
-        <w:t>Bibliografía (APA 7)</w:t>
-      </w:r>
-      <w:bookmarkEnd w:id="19"/>
     </w:p>
     <w:p>
       <w:pPr>
@@ -12671,21 +11283,7 @@
         <w:rPr>
           <w:szCs w:val="28"/>
         </w:rPr>
-        <w:t xml:space="preserve">Box, G. E. P., y </w:t>
-      </w:r>
-      <w:proofErr w:type="spellStart"/>
-      <w:r>
-        <w:rPr>
-          <w:szCs w:val="28"/>
-        </w:rPr>
-        <w:t>Tidwell</w:t>
-      </w:r>
-      <w:proofErr w:type="spellEnd"/>
-      <w:r>
-        <w:rPr>
-          <w:szCs w:val="28"/>
-        </w:rPr>
-        <w:t xml:space="preserve">, P. W. (1962). </w:t>
+        <w:t xml:space="preserve">Box, G. E. P., y Tidwell, P. W. (1962). </w:t>
       </w:r>
       <w:r>
         <w:rPr>
@@ -12694,23 +11292,13 @@
         </w:rPr>
         <w:t xml:space="preserve">Transformation of the independent variables. </w:t>
       </w:r>
-      <w:proofErr w:type="spellStart"/>
       <w:r>
         <w:rPr>
           <w:i/>
           <w:szCs w:val="28"/>
           <w:lang w:val="en-US"/>
         </w:rPr>
-        <w:t>Technometrics</w:t>
-      </w:r>
-      <w:proofErr w:type="spellEnd"/>
-      <w:r>
-        <w:rPr>
-          <w:i/>
-          <w:szCs w:val="28"/>
-          <w:lang w:val="en-US"/>
-        </w:rPr>
-        <w:t>, 4</w:t>
+        <w:t>Technometrics, 4</w:t>
       </w:r>
       <w:r>
         <w:rPr>
@@ -12738,25 +11326,15 @@
       <w:r>
         <w:rPr>
           <w:szCs w:val="28"/>
-          <w:lang w:val="en-US"/>
-        </w:rPr>
-        <w:t xml:space="preserve">Cameron, A. C., </w:t>
-      </w:r>
-      <w:proofErr w:type="spellStart"/>
+        </w:rPr>
+        <w:t xml:space="preserve">Cameron, A. C., Gelbach, J. B., y Miller, D. L. (2008). </w:t>
+      </w:r>
       <w:r>
         <w:rPr>
           <w:szCs w:val="28"/>
           <w:lang w:val="en-US"/>
         </w:rPr>
-        <w:t>Gelbach</w:t>
-      </w:r>
-      <w:proofErr w:type="spellEnd"/>
-      <w:r>
-        <w:rPr>
-          <w:szCs w:val="28"/>
-          <w:lang w:val="en-US"/>
-        </w:rPr>
-        <w:t xml:space="preserve">, J. B., y Miller, D. L. (2008). Bootstrap-based improvements for inference with clustered errors. </w:t>
+        <w:t xml:space="preserve">Bootstrap-based improvements for inference with clustered errors. </w:t>
       </w:r>
       <w:r>
         <w:rPr>
@@ -12796,23 +11374,13 @@
         </w:rPr>
         <w:t xml:space="preserve">Cook, R. D. (1977). Detection of influential observation in linear regression. </w:t>
       </w:r>
-      <w:proofErr w:type="spellStart"/>
       <w:r>
         <w:rPr>
           <w:i/>
           <w:szCs w:val="28"/>
           <w:lang w:val="en-US"/>
         </w:rPr>
-        <w:t>Technometrics</w:t>
-      </w:r>
-      <w:proofErr w:type="spellEnd"/>
-      <w:r>
-        <w:rPr>
-          <w:i/>
-          <w:szCs w:val="28"/>
-          <w:lang w:val="en-US"/>
-        </w:rPr>
-        <w:t>, 19</w:t>
+        <w:t>Technometrics, 19</w:t>
       </w:r>
       <w:r>
         <w:rPr>
@@ -12840,25 +11408,8 @@
       <w:r>
         <w:rPr>
           <w:szCs w:val="28"/>
-          <w:lang w:val="en-US"/>
-        </w:rPr>
-        <w:t xml:space="preserve">Efron, B., y </w:t>
-      </w:r>
-      <w:proofErr w:type="spellStart"/>
-      <w:r>
-        <w:rPr>
-          <w:szCs w:val="28"/>
-          <w:lang w:val="en-US"/>
-        </w:rPr>
-        <w:t>Tibshirani</w:t>
-      </w:r>
-      <w:proofErr w:type="spellEnd"/>
-      <w:r>
-        <w:rPr>
-          <w:szCs w:val="28"/>
-          <w:lang w:val="en-US"/>
-        </w:rPr>
-        <w:t xml:space="preserve">, R. J. (1993). </w:t>
+        </w:rPr>
+        <w:t xml:space="preserve">Efron, B., y Tibshirani, R. J. (1993). </w:t>
       </w:r>
       <w:r>
         <w:rPr>
@@ -12934,6 +11485,7 @@
           <w:szCs w:val="28"/>
           <w:lang w:val="en-US"/>
         </w:rPr>
+        <w:lastRenderedPageBreak/>
         <w:t xml:space="preserve">Harrell, F. E. (2015). </w:t>
       </w:r>
       <w:r>
@@ -12972,23 +11524,7 @@
           <w:szCs w:val="28"/>
           <w:lang w:val="en-US"/>
         </w:rPr>
-        <w:t xml:space="preserve">Hosmer, D. W., </w:t>
-      </w:r>
-      <w:proofErr w:type="spellStart"/>
-      <w:r>
-        <w:rPr>
-          <w:szCs w:val="28"/>
-          <w:lang w:val="en-US"/>
-        </w:rPr>
-        <w:t>Lemeshow</w:t>
-      </w:r>
-      <w:proofErr w:type="spellEnd"/>
-      <w:r>
-        <w:rPr>
-          <w:szCs w:val="28"/>
-          <w:lang w:val="en-US"/>
-        </w:rPr>
-        <w:t xml:space="preserve">, S., y Sturdivant, R. X. (2013). </w:t>
+        <w:t xml:space="preserve">Hosmer, D. W., Lemeshow, S., y Sturdivant, R. X. (2013). </w:t>
       </w:r>
       <w:r>
         <w:rPr>
@@ -13066,23 +11602,13 @@
         </w:rPr>
         <w:t xml:space="preserve">Rubin, D. B. (1976). Inference and missing data. </w:t>
       </w:r>
-      <w:proofErr w:type="spellStart"/>
       <w:r>
         <w:rPr>
           <w:i/>
           <w:szCs w:val="28"/>
           <w:lang w:val="en-US"/>
         </w:rPr>
-        <w:t>Biometrika</w:t>
-      </w:r>
-      <w:proofErr w:type="spellEnd"/>
-      <w:r>
-        <w:rPr>
-          <w:i/>
-          <w:szCs w:val="28"/>
-          <w:lang w:val="en-US"/>
-        </w:rPr>
-        <w:t>, 63</w:t>
+        <w:t>Biometrika, 63</w:t>
       </w:r>
       <w:r>
         <w:rPr>

</xml_diff>